<commit_message>
Rebuild hazard picture grid and RAM matrix as native Word tables
Co-Authored-By: Claude Sonnet 5.5 <noreply@anthropic.com>
Claude-Session: https://claude.ai/code/session_01A9fxXvMimYxEzQn6mHC9Pb
</commit_message>
<xml_diff>
--- a/JSA_Template.docx
+++ b/JSA_Template.docx
@@ -1850,31 +1850,66 @@
           </w:p>
         </w:tc>
       </w:tr>
+    </w:tbl>
+    <w:p>
+      <w:pPr>
+        <w:spacing w:before="0" w:after="0" w:line="20" w:lineRule="exact"/>
+        <w:rPr>
+          <w:sz w:val="4"/>
+        </w:rPr>
+      </w:pPr>
+    </w:p>
+    <w:tbl>
+      <w:tblPr>
+        <w:tblW w:w="14958" w:type="dxa"/>
+        <w:tblInd w:w="0" w:type="dxa"/>
+        <w:tblLayout w:type="fixed"/>
+        <w:tblCellMar>
+          <w:left w:w="40" w:type="dxa"/>
+          <w:right w:w="40" w:type="dxa"/>
+        </w:tblCellMar>
+        <w:tblLook w:val="0000"/>
+      </w:tblPr>
+      <w:tblGrid>
+        <w:gridCol w:w="700"/>
+        <w:gridCol w:w="1793"/>
+        <w:gridCol w:w="700"/>
+        <w:gridCol w:w="1793"/>
+        <w:gridCol w:w="700"/>
+        <w:gridCol w:w="1793"/>
+        <w:gridCol w:w="700"/>
+        <w:gridCol w:w="1793"/>
+        <w:gridCol w:w="700"/>
+        <w:gridCol w:w="1793"/>
+        <w:gridCol w:w="700"/>
+        <w:gridCol w:w="1793"/>
+      </w:tblGrid>
       <w:tr>
         <w:trPr>
           <w:cantSplit/>
+          <w:trHeight w:val="620" w:hRule="atLeast"/>
         </w:trPr>
         <w:tc>
           <w:tcPr>
-            <w:tcW w:w="14959" w:type="dxa"/>
-            <w:gridSpan w:val="12"/>
-            <w:tcBorders>
-              <w:top w:val="single" w:sz="4" w:space="0" w:color="000000"/>
-              <w:left w:val="single" w:sz="4" w:space="0" w:color="000000"/>
-              <w:bottom w:val="single" w:sz="4" w:space="0" w:color="000000"/>
-              <w:right w:val="single" w:sz="4" w:space="0" w:color="000000"/>
-            </w:tcBorders>
+            <w:tcW w:w="700" w:type="dxa"/>
+            <w:tcBorders>
+              <w:top w:val="single" w:sz="8" w:space="0" w:color="000000"/>
+              <w:left w:val="single" w:sz="8" w:space="0" w:color="000000"/>
+              <w:bottom w:val="single" w:sz="8" w:space="0" w:color="000000"/>
+              <w:right w:val="nil"/>
+            </w:tcBorders>
+            <w:shd w:val="clear" w:color="auto" w:fill="CCFFFF"/>
             <w:tcMar>
               <w:top w:w="30" w:type="dxa"/>
-              <w:left w:w="40" w:type="dxa"/>
+              <w:left w:w="30" w:type="dxa"/>
               <w:bottom w:w="30" w:type="dxa"/>
-              <w:right w:w="40" w:type="dxa"/>
-            </w:tcMar>
-            <w:vAlign w:val="center"/>
-          </w:tcPr>
-          <w:p>
-            <w:pPr>
-              <w:spacing w:before="40" w:after="40"/>
+              <w:right w:w="0" w:type="dxa"/>
+            </w:tcMar>
+            <w:vAlign w:val="center"/>
+          </w:tcPr>
+          <w:p>
+            <w:pPr>
+              <w:spacing w:before="0" w:after="0"/>
               <w:jc w:val="center"/>
               <w:rPr>
                 <w:rFonts w:ascii="Arial" w:hAnsi="Arial" w:cs="Arial"/>
@@ -1883,10 +1918,11 @@
               </w:rPr>
             </w:pPr>
             <w:r>
-              <w:drawing>
-                <wp:inline xmlns:wp="http://schemas.openxmlformats.org/drawingml/2006/wordprocessingDrawing" distT="0" distB="0" distL="0" distR="0">
-                  <wp:extent cx="9300000" cy="1647488"/>
-                  <wp:docPr id="5001" name="Hazard pictorial guide" descr="Pictorial guide of the 24 hazard categories"/>
+              <w:drawing xmlns:w="http://schemas.openxmlformats.org/wordprocessingml/2006/main" xmlns:wpc="http://schemas.microsoft.com/office/word/2010/wordprocessingCanvas" xmlns:cx="http://schemas.microsoft.com/office/drawing/2014/chartex" xmlns:cx1="http://schemas.microsoft.com/office/drawing/2015/9/8/chartex" xmlns:cx2="http://schemas.microsoft.com/office/drawing/2015/10/21/chartex" xmlns:cx3="http://schemas.microsoft.com/office/drawing/2016/5/9/chartex" xmlns:cx4="http://schemas.microsoft.com/office/drawing/2016/5/10/chartex" xmlns:cx5="http://schemas.microsoft.com/office/drawing/2016/5/11/chartex" xmlns:cx6="http://schemas.microsoft.com/office/drawing/2016/5/12/chartex" xmlns:cx7="http://schemas.microsoft.com/office/drawing/2016/5/13/chartex" xmlns:cx8="http://schemas.microsoft.com/office/drawing/2016/5/14/chartex" xmlns:mc="http://schemas.openxmlformats.org/markup-compatibility/2006" xmlns:aink="http://schemas.microsoft.com/office/drawing/2016/ink" xmlns:am3d="http://schemas.microsoft.com/office/drawing/2017/model3d" xmlns:o="urn:schemas-microsoft-com:office:office" xmlns:oel="http://schemas.microsoft.com/office/2019/extlst" xmlns:r="http://schemas.openxmlformats.org/officeDocument/2006/relationships" xmlns:m="http://schemas.openxmlformats.org/officeDocument/2006/math" xmlns:v="urn:schemas-microsoft-com:vml" xmlns:wp14="http://schemas.microsoft.com/office/word/2010/wordprocessingDrawing" xmlns:wp="http://schemas.openxmlformats.org/drawingml/2006/wordprocessingDrawing" xmlns:w10="urn:schemas-microsoft-com:office:word" xmlns:w14="http://schemas.microsoft.com/office/word/2010/wordml" xmlns:w15="http://schemas.microsoft.com/office/word/2012/wordml" xmlns:w16cex="http://schemas.microsoft.com/office/word/2018/wordml/cex" xmlns:w16cid="http://schemas.microsoft.com/office/word/2016/wordml/cid" xmlns:w16="http://schemas.microsoft.com/office/word/2018/wordml" xmlns:w16sdtdh="http://schemas.microsoft.com/office/word/2020/wordml/sdtdatahash" xmlns:w16se="http://schemas.microsoft.com/office/word/2015/wordml/symex" xmlns:wpg="http://schemas.microsoft.com/office/word/2010/wordprocessingGroup" xmlns:wpi="http://schemas.microsoft.com/office/word/2010/wordprocessingInk" xmlns:wne="http://schemas.microsoft.com/office/word/2006/wordml" xmlns:wps="http://schemas.microsoft.com/office/word/2010/wordprocessingShape">
+                <wp:inline distT="0" distB="0" distL="0" distR="0" wp14:anchorId="310CB6E7" wp14:editId="4FD17EFA">
+                  <wp:extent cx="302895" cy="334645"/>
+                  <wp:effectExtent l="0" t="0" r="0" b="0"/>
+                  <wp:docPr id="1386814493" name="Picture 2" descr="simops"/>
                   <wp:cNvGraphicFramePr>
                     <a:graphicFrameLocks xmlns:a="http://schemas.openxmlformats.org/drawingml/2006/main" noChangeAspect="1"/>
                   </wp:cNvGraphicFramePr>
@@ -1894,29 +1930,2904 @@
                     <a:graphicData uri="http://schemas.openxmlformats.org/drawingml/2006/picture">
                       <pic:pic xmlns:pic="http://schemas.openxmlformats.org/drawingml/2006/picture">
                         <pic:nvPicPr>
-                          <pic:cNvPr id="5001" name="Hazard pictorial guide"/>
-                          <pic:cNvPicPr/>
+                          <pic:cNvPr id="0" name="Picture 2" descr="simops"/>
+                          <pic:cNvPicPr>
+                            <a:picLocks noChangeAspect="1" noChangeArrowheads="1"/>
+                          </pic:cNvPicPr>
                         </pic:nvPicPr>
                         <pic:blipFill>
-                          <a:blip xmlns:r="http://schemas.openxmlformats.org/officeDocument/2006/relationships" r:embed="rId10"/>
+                          <a:blip r:embed="rId11">
+                            <a:extLst>
+                              <a:ext uri="{28A0092B-C50C-407E-A947-70E740481C1C}">
+                                <a14:useLocalDpi xmlns:a14="http://schemas.microsoft.com/office/drawing/2010/main" val="0"/>
+                              </a:ext>
+                            </a:extLst>
+                          </a:blip>
+                          <a:srcRect/>
                           <a:stretch>
                             <a:fillRect/>
                           </a:stretch>
                         </pic:blipFill>
-                        <pic:spPr>
+                        <pic:spPr bwMode="auto">
                           <a:xfrm>
                             <a:off x="0" y="0"/>
-                            <a:ext cx="9300000" cy="1647488"/>
+                            <a:ext cx="302895" cy="334645"/>
                           </a:xfrm>
                           <a:prstGeom prst="rect">
                             <a:avLst/>
                           </a:prstGeom>
+                          <a:noFill/>
+                          <a:ln>
+                            <a:noFill/>
+                          </a:ln>
                         </pic:spPr>
                       </pic:pic>
                     </a:graphicData>
                   </a:graphic>
                 </wp:inline>
               </w:drawing>
+            </w:r>
+          </w:p>
+        </w:tc>
+        <w:tc>
+          <w:tcPr>
+            <w:tcW w:w="1793" w:type="dxa"/>
+            <w:tcBorders>
+              <w:top w:val="single" w:sz="8" w:space="0" w:color="000000"/>
+              <w:left w:val="nil"/>
+              <w:bottom w:val="single" w:sz="8" w:space="0" w:color="000000"/>
+              <w:right w:val="single" w:sz="8" w:space="0" w:color="000000"/>
+            </w:tcBorders>
+            <w:shd w:val="clear" w:color="auto" w:fill="CCFFFF"/>
+            <w:tcMar>
+              <w:top w:w="30" w:type="dxa"/>
+              <w:left w:w="30" w:type="dxa"/>
+              <w:bottom w:w="30" w:type="dxa"/>
+              <w:right w:w="30" w:type="dxa"/>
+            </w:tcMar>
+            <w:vAlign w:val="center"/>
+          </w:tcPr>
+          <w:p>
+            <w:pPr>
+              <w:spacing w:before="0" w:after="0"/>
+              <w:jc w:val="left"/>
+              <w:rPr>
+                <w:rFonts w:ascii="Arial" w:hAnsi="Arial" w:cs="Arial"/>
+                <w:sz w:val="18"/>
+                <w:szCs w:val="18"/>
+              </w:rPr>
+            </w:pPr>
+            <w:r>
+              <w:rPr>
+                <w:rFonts w:ascii="Arial" w:hAnsi="Arial" w:cs="Arial" w:eastAsia="Arial"/>
+                <w:b/>
+                <w:bCs/>
+                <w:sz w:val="17"/>
+                <w:szCs w:val="17"/>
+                <w:lang w:val="en-GB"/>
+              </w:rPr>
+              <w:t xml:space="preserve">Uncontrolled SIMOPS</w:t>
+            </w:r>
+          </w:p>
+        </w:tc>
+        <w:tc>
+          <w:tcPr>
+            <w:tcW w:w="700" w:type="dxa"/>
+            <w:tcBorders>
+              <w:top w:val="single" w:sz="8" w:space="0" w:color="000000"/>
+              <w:left w:val="single" w:sz="8" w:space="0" w:color="000000"/>
+              <w:bottom w:val="single" w:sz="8" w:space="0" w:color="000000"/>
+              <w:right w:val="nil"/>
+            </w:tcBorders>
+            <w:shd w:val="clear" w:color="auto" w:fill="CCFFFF"/>
+            <w:tcMar>
+              <w:top w:w="30" w:type="dxa"/>
+              <w:left w:w="30" w:type="dxa"/>
+              <w:bottom w:w="30" w:type="dxa"/>
+              <w:right w:w="0" w:type="dxa"/>
+            </w:tcMar>
+            <w:vAlign w:val="center"/>
+          </w:tcPr>
+          <w:p>
+            <w:pPr>
+              <w:spacing w:before="0" w:after="0"/>
+              <w:jc w:val="center"/>
+              <w:rPr>
+                <w:rFonts w:ascii="Arial" w:hAnsi="Arial" w:cs="Arial"/>
+                <w:sz w:val="18"/>
+                <w:szCs w:val="18"/>
+              </w:rPr>
+            </w:pPr>
+            <w:r>
+              <w:drawing xmlns:w="http://schemas.openxmlformats.org/wordprocessingml/2006/main" xmlns:wpc="http://schemas.microsoft.com/office/word/2010/wordprocessingCanvas" xmlns:cx="http://schemas.microsoft.com/office/drawing/2014/chartex" xmlns:cx1="http://schemas.microsoft.com/office/drawing/2015/9/8/chartex" xmlns:cx2="http://schemas.microsoft.com/office/drawing/2015/10/21/chartex" xmlns:cx3="http://schemas.microsoft.com/office/drawing/2016/5/9/chartex" xmlns:cx4="http://schemas.microsoft.com/office/drawing/2016/5/10/chartex" xmlns:cx5="http://schemas.microsoft.com/office/drawing/2016/5/11/chartex" xmlns:cx6="http://schemas.microsoft.com/office/drawing/2016/5/12/chartex" xmlns:cx7="http://schemas.microsoft.com/office/drawing/2016/5/13/chartex" xmlns:cx8="http://schemas.microsoft.com/office/drawing/2016/5/14/chartex" xmlns:mc="http://schemas.openxmlformats.org/markup-compatibility/2006" xmlns:aink="http://schemas.microsoft.com/office/drawing/2016/ink" xmlns:am3d="http://schemas.microsoft.com/office/drawing/2017/model3d" xmlns:o="urn:schemas-microsoft-com:office:office" xmlns:oel="http://schemas.microsoft.com/office/2019/extlst" xmlns:r="http://schemas.openxmlformats.org/officeDocument/2006/relationships" xmlns:m="http://schemas.openxmlformats.org/officeDocument/2006/math" xmlns:v="urn:schemas-microsoft-com:vml" xmlns:wp14="http://schemas.microsoft.com/office/word/2010/wordprocessingDrawing" xmlns:wp="http://schemas.openxmlformats.org/drawingml/2006/wordprocessingDrawing" xmlns:w10="urn:schemas-microsoft-com:office:word" xmlns:w14="http://schemas.microsoft.com/office/word/2010/wordml" xmlns:w15="http://schemas.microsoft.com/office/word/2012/wordml" xmlns:w16cex="http://schemas.microsoft.com/office/word/2018/wordml/cex" xmlns:w16cid="http://schemas.microsoft.com/office/word/2016/wordml/cid" xmlns:w16="http://schemas.microsoft.com/office/word/2018/wordml" xmlns:w16sdtdh="http://schemas.microsoft.com/office/word/2020/wordml/sdtdatahash" xmlns:w16se="http://schemas.microsoft.com/office/word/2015/wordml/symex" xmlns:wpg="http://schemas.microsoft.com/office/word/2010/wordprocessingGroup" xmlns:wpi="http://schemas.microsoft.com/office/word/2010/wordprocessingInk" xmlns:wne="http://schemas.microsoft.com/office/word/2006/wordml" xmlns:wps="http://schemas.microsoft.com/office/word/2010/wordprocessingShape">
+                <wp:inline distT="0" distB="0" distL="0" distR="0" wp14:anchorId="33012C77" wp14:editId="4F139D6F">
+                  <wp:extent cx="315595" cy="334645"/>
+                  <wp:effectExtent l="0" t="0" r="0" b="0"/>
+                  <wp:docPr id="2068371152" name="Picture 2068371152" descr="Pres"/>
+                  <wp:cNvGraphicFramePr>
+                    <a:graphicFrameLocks xmlns:a="http://schemas.openxmlformats.org/drawingml/2006/main" noChangeAspect="1"/>
+                  </wp:cNvGraphicFramePr>
+                  <a:graphic xmlns:a="http://schemas.openxmlformats.org/drawingml/2006/main">
+                    <a:graphicData uri="http://schemas.openxmlformats.org/drawingml/2006/picture">
+                      <pic:pic xmlns:pic="http://schemas.openxmlformats.org/drawingml/2006/picture">
+                        <pic:nvPicPr>
+                          <pic:cNvPr id="0" name="Picture 3" descr="Pres"/>
+                          <pic:cNvPicPr>
+                            <a:picLocks noChangeAspect="1" noChangeArrowheads="1"/>
+                          </pic:cNvPicPr>
+                        </pic:nvPicPr>
+                        <pic:blipFill>
+                          <a:blip r:embed="rId12">
+                            <a:extLst>
+                              <a:ext uri="{28A0092B-C50C-407E-A947-70E740481C1C}">
+                                <a14:useLocalDpi xmlns:a14="http://schemas.microsoft.com/office/drawing/2010/main" val="0"/>
+                              </a:ext>
+                            </a:extLst>
+                          </a:blip>
+                          <a:srcRect/>
+                          <a:stretch>
+                            <a:fillRect/>
+                          </a:stretch>
+                        </pic:blipFill>
+                        <pic:spPr bwMode="auto">
+                          <a:xfrm>
+                            <a:off x="0" y="0"/>
+                            <a:ext cx="315595" cy="334645"/>
+                          </a:xfrm>
+                          <a:prstGeom prst="rect">
+                            <a:avLst/>
+                          </a:prstGeom>
+                          <a:noFill/>
+                          <a:ln>
+                            <a:noFill/>
+                          </a:ln>
+                        </pic:spPr>
+                      </pic:pic>
+                    </a:graphicData>
+                  </a:graphic>
+                </wp:inline>
+              </w:drawing>
+            </w:r>
+          </w:p>
+        </w:tc>
+        <w:tc>
+          <w:tcPr>
+            <w:tcW w:w="1793" w:type="dxa"/>
+            <w:tcBorders>
+              <w:top w:val="single" w:sz="8" w:space="0" w:color="000000"/>
+              <w:left w:val="nil"/>
+              <w:bottom w:val="single" w:sz="8" w:space="0" w:color="000000"/>
+              <w:right w:val="single" w:sz="8" w:space="0" w:color="000000"/>
+            </w:tcBorders>
+            <w:shd w:val="clear" w:color="auto" w:fill="CCFFFF"/>
+            <w:tcMar>
+              <w:top w:w="30" w:type="dxa"/>
+              <w:left w:w="30" w:type="dxa"/>
+              <w:bottom w:w="30" w:type="dxa"/>
+              <w:right w:w="30" w:type="dxa"/>
+            </w:tcMar>
+            <w:vAlign w:val="center"/>
+          </w:tcPr>
+          <w:p>
+            <w:pPr>
+              <w:spacing w:before="0" w:after="0"/>
+              <w:jc w:val="left"/>
+              <w:rPr>
+                <w:rFonts w:ascii="Arial" w:hAnsi="Arial" w:cs="Arial"/>
+                <w:sz w:val="18"/>
+                <w:szCs w:val="18"/>
+              </w:rPr>
+            </w:pPr>
+            <w:r>
+              <w:rPr>
+                <w:rFonts w:ascii="Arial" w:hAnsi="Arial" w:cs="Arial" w:eastAsia="Arial"/>
+                <w:b/>
+                <w:bCs/>
+                <w:sz w:val="17"/>
+                <w:szCs w:val="17"/>
+                <w:lang w:val="en-GB"/>
+              </w:rPr>
+              <w:t xml:space="preserve">Release of Stored Energy</w:t>
+            </w:r>
+          </w:p>
+        </w:tc>
+        <w:tc>
+          <w:tcPr>
+            <w:tcW w:w="700" w:type="dxa"/>
+            <w:tcBorders>
+              <w:top w:val="single" w:sz="8" w:space="0" w:color="000000"/>
+              <w:left w:val="single" w:sz="8" w:space="0" w:color="000000"/>
+              <w:bottom w:val="single" w:sz="8" w:space="0" w:color="000000"/>
+              <w:right w:val="nil"/>
+            </w:tcBorders>
+            <w:shd w:val="clear" w:color="auto" w:fill="CCFFFF"/>
+            <w:tcMar>
+              <w:top w:w="30" w:type="dxa"/>
+              <w:left w:w="30" w:type="dxa"/>
+              <w:bottom w:w="30" w:type="dxa"/>
+              <w:right w:w="0" w:type="dxa"/>
+            </w:tcMar>
+            <w:vAlign w:val="center"/>
+          </w:tcPr>
+          <w:p>
+            <w:pPr>
+              <w:spacing w:before="0" w:after="0"/>
+              <w:jc w:val="center"/>
+              <w:rPr>
+                <w:rFonts w:ascii="Arial" w:hAnsi="Arial" w:cs="Arial"/>
+                <w:sz w:val="18"/>
+                <w:szCs w:val="18"/>
+              </w:rPr>
+            </w:pPr>
+            <w:r>
+              <w:drawing xmlns:w="http://schemas.openxmlformats.org/wordprocessingml/2006/main" xmlns:wpc="http://schemas.microsoft.com/office/word/2010/wordprocessingCanvas" xmlns:cx="http://schemas.microsoft.com/office/drawing/2014/chartex" xmlns:cx1="http://schemas.microsoft.com/office/drawing/2015/9/8/chartex" xmlns:cx2="http://schemas.microsoft.com/office/drawing/2015/10/21/chartex" xmlns:cx3="http://schemas.microsoft.com/office/drawing/2016/5/9/chartex" xmlns:cx4="http://schemas.microsoft.com/office/drawing/2016/5/10/chartex" xmlns:cx5="http://schemas.microsoft.com/office/drawing/2016/5/11/chartex" xmlns:cx6="http://schemas.microsoft.com/office/drawing/2016/5/12/chartex" xmlns:cx7="http://schemas.microsoft.com/office/drawing/2016/5/13/chartex" xmlns:cx8="http://schemas.microsoft.com/office/drawing/2016/5/14/chartex" xmlns:mc="http://schemas.openxmlformats.org/markup-compatibility/2006" xmlns:aink="http://schemas.microsoft.com/office/drawing/2016/ink" xmlns:am3d="http://schemas.microsoft.com/office/drawing/2017/model3d" xmlns:o="urn:schemas-microsoft-com:office:office" xmlns:oel="http://schemas.microsoft.com/office/2019/extlst" xmlns:r="http://schemas.openxmlformats.org/officeDocument/2006/relationships" xmlns:m="http://schemas.openxmlformats.org/officeDocument/2006/math" xmlns:v="urn:schemas-microsoft-com:vml" xmlns:wp14="http://schemas.microsoft.com/office/word/2010/wordprocessingDrawing" xmlns:wp="http://schemas.openxmlformats.org/drawingml/2006/wordprocessingDrawing" xmlns:w10="urn:schemas-microsoft-com:office:word" xmlns:w14="http://schemas.microsoft.com/office/word/2010/wordml" xmlns:w15="http://schemas.microsoft.com/office/word/2012/wordml" xmlns:w16cex="http://schemas.microsoft.com/office/word/2018/wordml/cex" xmlns:w16cid="http://schemas.microsoft.com/office/word/2016/wordml/cid" xmlns:w16="http://schemas.microsoft.com/office/word/2018/wordml" xmlns:w16sdtdh="http://schemas.microsoft.com/office/word/2020/wordml/sdtdatahash" xmlns:w16se="http://schemas.microsoft.com/office/word/2015/wordml/symex" xmlns:wpg="http://schemas.microsoft.com/office/word/2010/wordprocessingGroup" xmlns:wpi="http://schemas.microsoft.com/office/word/2010/wordprocessingInk" xmlns:wne="http://schemas.microsoft.com/office/word/2006/wordml" xmlns:wps="http://schemas.microsoft.com/office/word/2010/wordprocessingShape">
+                <wp:inline distT="0" distB="0" distL="0" distR="0" wp14:anchorId="3E8B7AC0" wp14:editId="07F0DFE9">
+                  <wp:extent cx="340995" cy="321945"/>
+                  <wp:effectExtent l="0" t="0" r="0" b="0"/>
+                  <wp:docPr id="352547112" name="Picture 352547112" descr="spark"/>
+                  <wp:cNvGraphicFramePr>
+                    <a:graphicFrameLocks xmlns:a="http://schemas.openxmlformats.org/drawingml/2006/main" noChangeAspect="1"/>
+                  </wp:cNvGraphicFramePr>
+                  <a:graphic xmlns:a="http://schemas.openxmlformats.org/drawingml/2006/main">
+                    <a:graphicData uri="http://schemas.openxmlformats.org/drawingml/2006/picture">
+                      <pic:pic xmlns:pic="http://schemas.openxmlformats.org/drawingml/2006/picture">
+                        <pic:nvPicPr>
+                          <pic:cNvPr id="0" name="Picture 4" descr="spark"/>
+                          <pic:cNvPicPr>
+                            <a:picLocks noChangeAspect="1" noChangeArrowheads="1"/>
+                          </pic:cNvPicPr>
+                        </pic:nvPicPr>
+                        <pic:blipFill>
+                          <a:blip r:embed="rId13">
+                            <a:clrChange>
+                              <a:clrFrom>
+                                <a:srgbClr val="FEFEFE"/>
+                              </a:clrFrom>
+                              <a:clrTo>
+                                <a:srgbClr val="FEFEFE">
+                                  <a:alpha val="0"/>
+                                </a:srgbClr>
+                              </a:clrTo>
+                            </a:clrChange>
+                            <a:extLst>
+                              <a:ext uri="{28A0092B-C50C-407E-A947-70E740481C1C}">
+                                <a14:useLocalDpi xmlns:a14="http://schemas.microsoft.com/office/drawing/2010/main" val="0"/>
+                              </a:ext>
+                            </a:extLst>
+                          </a:blip>
+                          <a:srcRect/>
+                          <a:stretch>
+                            <a:fillRect/>
+                          </a:stretch>
+                        </pic:blipFill>
+                        <pic:spPr bwMode="auto">
+                          <a:xfrm>
+                            <a:off x="0" y="0"/>
+                            <a:ext cx="340995" cy="321945"/>
+                          </a:xfrm>
+                          <a:prstGeom prst="rect">
+                            <a:avLst/>
+                          </a:prstGeom>
+                          <a:noFill/>
+                          <a:ln>
+                            <a:noFill/>
+                          </a:ln>
+                        </pic:spPr>
+                      </pic:pic>
+                    </a:graphicData>
+                  </a:graphic>
+                </wp:inline>
+              </w:drawing>
+            </w:r>
+          </w:p>
+        </w:tc>
+        <w:tc>
+          <w:tcPr>
+            <w:tcW w:w="1793" w:type="dxa"/>
+            <w:tcBorders>
+              <w:top w:val="single" w:sz="8" w:space="0" w:color="000000"/>
+              <w:left w:val="nil"/>
+              <w:bottom w:val="single" w:sz="8" w:space="0" w:color="000000"/>
+              <w:right w:val="single" w:sz="8" w:space="0" w:color="000000"/>
+            </w:tcBorders>
+            <w:shd w:val="clear" w:color="auto" w:fill="CCFFFF"/>
+            <w:tcMar>
+              <w:top w:w="30" w:type="dxa"/>
+              <w:left w:w="30" w:type="dxa"/>
+              <w:bottom w:w="30" w:type="dxa"/>
+              <w:right w:w="30" w:type="dxa"/>
+            </w:tcMar>
+            <w:vAlign w:val="center"/>
+          </w:tcPr>
+          <w:p>
+            <w:pPr>
+              <w:spacing w:before="0" w:after="0"/>
+              <w:jc w:val="left"/>
+              <w:rPr>
+                <w:rFonts w:ascii="Arial" w:hAnsi="Arial" w:cs="Arial"/>
+                <w:sz w:val="18"/>
+                <w:szCs w:val="18"/>
+              </w:rPr>
+            </w:pPr>
+            <w:r>
+              <w:rPr>
+                <w:rFonts w:ascii="Arial" w:hAnsi="Arial" w:cs="Arial" w:eastAsia="Arial"/>
+                <w:b/>
+                <w:bCs/>
+                <w:sz w:val="17"/>
+                <w:szCs w:val="17"/>
+                <w:lang w:val="en-GB"/>
+              </w:rPr>
+              <w:t xml:space="preserve">Ignition Source</w:t>
+            </w:r>
+          </w:p>
+        </w:tc>
+        <w:tc>
+          <w:tcPr>
+            <w:tcW w:w="700" w:type="dxa"/>
+            <w:tcBorders>
+              <w:top w:val="single" w:sz="8" w:space="0" w:color="000000"/>
+              <w:left w:val="single" w:sz="8" w:space="0" w:color="000000"/>
+              <w:bottom w:val="single" w:sz="8" w:space="0" w:color="000000"/>
+              <w:right w:val="nil"/>
+            </w:tcBorders>
+            <w:shd w:val="clear" w:color="auto" w:fill="CCFFFF"/>
+            <w:tcMar>
+              <w:top w:w="30" w:type="dxa"/>
+              <w:left w:w="30" w:type="dxa"/>
+              <w:bottom w:w="30" w:type="dxa"/>
+              <w:right w:w="0" w:type="dxa"/>
+            </w:tcMar>
+            <w:vAlign w:val="center"/>
+          </w:tcPr>
+          <w:p>
+            <w:pPr>
+              <w:spacing w:before="0" w:after="0"/>
+              <w:jc w:val="center"/>
+              <w:rPr>
+                <w:rFonts w:ascii="Arial" w:hAnsi="Arial" w:cs="Arial"/>
+                <w:sz w:val="18"/>
+                <w:szCs w:val="18"/>
+              </w:rPr>
+            </w:pPr>
+            <w:r>
+              <w:drawing xmlns:w="http://schemas.openxmlformats.org/wordprocessingml/2006/main" xmlns:wpc="http://schemas.microsoft.com/office/word/2010/wordprocessingCanvas" xmlns:cx="http://schemas.microsoft.com/office/drawing/2014/chartex" xmlns:cx1="http://schemas.microsoft.com/office/drawing/2015/9/8/chartex" xmlns:cx2="http://schemas.microsoft.com/office/drawing/2015/10/21/chartex" xmlns:cx3="http://schemas.microsoft.com/office/drawing/2016/5/9/chartex" xmlns:cx4="http://schemas.microsoft.com/office/drawing/2016/5/10/chartex" xmlns:cx5="http://schemas.microsoft.com/office/drawing/2016/5/11/chartex" xmlns:cx6="http://schemas.microsoft.com/office/drawing/2016/5/12/chartex" xmlns:cx7="http://schemas.microsoft.com/office/drawing/2016/5/13/chartex" xmlns:cx8="http://schemas.microsoft.com/office/drawing/2016/5/14/chartex" xmlns:mc="http://schemas.openxmlformats.org/markup-compatibility/2006" xmlns:aink="http://schemas.microsoft.com/office/drawing/2016/ink" xmlns:am3d="http://schemas.microsoft.com/office/drawing/2017/model3d" xmlns:o="urn:schemas-microsoft-com:office:office" xmlns:oel="http://schemas.microsoft.com/office/2019/extlst" xmlns:r="http://schemas.openxmlformats.org/officeDocument/2006/relationships" xmlns:m="http://schemas.openxmlformats.org/officeDocument/2006/math" xmlns:v="urn:schemas-microsoft-com:vml" xmlns:wp14="http://schemas.microsoft.com/office/word/2010/wordprocessingDrawing" xmlns:wp="http://schemas.openxmlformats.org/drawingml/2006/wordprocessingDrawing" xmlns:w10="urn:schemas-microsoft-com:office:word" xmlns:w14="http://schemas.microsoft.com/office/word/2010/wordml" xmlns:w15="http://schemas.microsoft.com/office/word/2012/wordml" xmlns:w16cex="http://schemas.microsoft.com/office/word/2018/wordml/cex" xmlns:w16cid="http://schemas.microsoft.com/office/word/2016/wordml/cid" xmlns:w16="http://schemas.microsoft.com/office/word/2018/wordml" xmlns:w16sdtdh="http://schemas.microsoft.com/office/word/2020/wordml/sdtdatahash" xmlns:w16se="http://schemas.microsoft.com/office/word/2015/wordml/symex" xmlns:wpg="http://schemas.microsoft.com/office/word/2010/wordprocessingGroup" xmlns:wpi="http://schemas.microsoft.com/office/word/2010/wordprocessingInk" xmlns:wne="http://schemas.microsoft.com/office/word/2006/wordml" xmlns:wps="http://schemas.microsoft.com/office/word/2010/wordprocessingShape">
+                <wp:inline distT="0" distB="0" distL="0" distR="0" wp14:anchorId="3ECA9E0C" wp14:editId="7E1E193C">
+                  <wp:extent cx="379730" cy="321945"/>
+                  <wp:effectExtent l="0" t="0" r="0" b="0"/>
+                  <wp:docPr id="1821278399" name="Picture 8" descr="spark"/>
+                  <wp:cNvGraphicFramePr>
+                    <a:graphicFrameLocks xmlns:a="http://schemas.openxmlformats.org/drawingml/2006/main" noChangeAspect="1"/>
+                  </wp:cNvGraphicFramePr>
+                  <a:graphic xmlns:a="http://schemas.openxmlformats.org/drawingml/2006/main">
+                    <a:graphicData uri="http://schemas.openxmlformats.org/drawingml/2006/picture">
+                      <pic:pic xmlns:pic="http://schemas.openxmlformats.org/drawingml/2006/picture">
+                        <pic:nvPicPr>
+                          <pic:cNvPr id="0" name="Picture 8" descr="spark"/>
+                          <pic:cNvPicPr>
+                            <a:picLocks noChangeAspect="1" noChangeArrowheads="1"/>
+                          </pic:cNvPicPr>
+                        </pic:nvPicPr>
+                        <pic:blipFill>
+                          <a:blip r:embed="rId14">
+                            <a:extLst>
+                              <a:ext uri="{28A0092B-C50C-407E-A947-70E740481C1C}">
+                                <a14:useLocalDpi xmlns:a14="http://schemas.microsoft.com/office/drawing/2010/main" val="0"/>
+                              </a:ext>
+                            </a:extLst>
+                          </a:blip>
+                          <a:srcRect/>
+                          <a:stretch>
+                            <a:fillRect/>
+                          </a:stretch>
+                        </pic:blipFill>
+                        <pic:spPr bwMode="auto">
+                          <a:xfrm>
+                            <a:off x="0" y="0"/>
+                            <a:ext cx="379730" cy="321945"/>
+                          </a:xfrm>
+                          <a:prstGeom prst="rect">
+                            <a:avLst/>
+                          </a:prstGeom>
+                          <a:noFill/>
+                          <a:ln>
+                            <a:noFill/>
+                          </a:ln>
+                        </pic:spPr>
+                      </pic:pic>
+                    </a:graphicData>
+                  </a:graphic>
+                </wp:inline>
+              </w:drawing>
+            </w:r>
+          </w:p>
+        </w:tc>
+        <w:tc>
+          <w:tcPr>
+            <w:tcW w:w="1793" w:type="dxa"/>
+            <w:tcBorders>
+              <w:top w:val="single" w:sz="8" w:space="0" w:color="000000"/>
+              <w:left w:val="nil"/>
+              <w:bottom w:val="single" w:sz="8" w:space="0" w:color="000000"/>
+              <w:right w:val="single" w:sz="8" w:space="0" w:color="000000"/>
+            </w:tcBorders>
+            <w:shd w:val="clear" w:color="auto" w:fill="CCFFFF"/>
+            <w:tcMar>
+              <w:top w:w="30" w:type="dxa"/>
+              <w:left w:w="30" w:type="dxa"/>
+              <w:bottom w:w="30" w:type="dxa"/>
+              <w:right w:w="30" w:type="dxa"/>
+            </w:tcMar>
+            <w:vAlign w:val="center"/>
+          </w:tcPr>
+          <w:p>
+            <w:pPr>
+              <w:spacing w:before="0" w:after="0"/>
+              <w:jc w:val="left"/>
+              <w:rPr>
+                <w:rFonts w:ascii="Arial" w:hAnsi="Arial" w:cs="Arial"/>
+                <w:sz w:val="18"/>
+                <w:szCs w:val="18"/>
+              </w:rPr>
+            </w:pPr>
+            <w:r>
+              <w:rPr>
+                <w:rFonts w:ascii="Arial" w:hAnsi="Arial" w:cs="Arial" w:eastAsia="Arial"/>
+                <w:b/>
+                <w:bCs/>
+                <w:sz w:val="17"/>
+                <w:szCs w:val="17"/>
+                <w:lang w:val="en-GB"/>
+              </w:rPr>
+              <w:t xml:space="preserve">Uncontrolled Hot Work</w:t>
+            </w:r>
+          </w:p>
+        </w:tc>
+        <w:tc>
+          <w:tcPr>
+            <w:tcW w:w="700" w:type="dxa"/>
+            <w:tcBorders>
+              <w:top w:val="single" w:sz="8" w:space="0" w:color="000000"/>
+              <w:left w:val="single" w:sz="8" w:space="0" w:color="000000"/>
+              <w:bottom w:val="single" w:sz="8" w:space="0" w:color="000000"/>
+              <w:right w:val="nil"/>
+            </w:tcBorders>
+            <w:shd w:val="clear" w:color="auto" w:fill="CCFFFF"/>
+            <w:tcMar>
+              <w:top w:w="30" w:type="dxa"/>
+              <w:left w:w="30" w:type="dxa"/>
+              <w:bottom w:w="30" w:type="dxa"/>
+              <w:right w:w="0" w:type="dxa"/>
+            </w:tcMar>
+            <w:vAlign w:val="center"/>
+          </w:tcPr>
+          <w:p>
+            <w:pPr>
+              <w:spacing w:before="0" w:after="0"/>
+              <w:jc w:val="center"/>
+              <w:rPr>
+                <w:rFonts w:ascii="Arial" w:hAnsi="Arial" w:cs="Arial"/>
+                <w:sz w:val="18"/>
+                <w:szCs w:val="18"/>
+              </w:rPr>
+            </w:pPr>
+            <w:r>
+              <w:drawing xmlns:w="http://schemas.openxmlformats.org/wordprocessingml/2006/main" xmlns:wpc="http://schemas.microsoft.com/office/word/2010/wordprocessingCanvas" xmlns:cx="http://schemas.microsoft.com/office/drawing/2014/chartex" xmlns:cx1="http://schemas.microsoft.com/office/drawing/2015/9/8/chartex" xmlns:cx2="http://schemas.microsoft.com/office/drawing/2015/10/21/chartex" xmlns:cx3="http://schemas.microsoft.com/office/drawing/2016/5/9/chartex" xmlns:cx4="http://schemas.microsoft.com/office/drawing/2016/5/10/chartex" xmlns:cx5="http://schemas.microsoft.com/office/drawing/2016/5/11/chartex" xmlns:cx6="http://schemas.microsoft.com/office/drawing/2016/5/12/chartex" xmlns:cx7="http://schemas.microsoft.com/office/drawing/2016/5/13/chartex" xmlns:cx8="http://schemas.microsoft.com/office/drawing/2016/5/14/chartex" xmlns:mc="http://schemas.openxmlformats.org/markup-compatibility/2006" xmlns:aink="http://schemas.microsoft.com/office/drawing/2016/ink" xmlns:am3d="http://schemas.microsoft.com/office/drawing/2017/model3d" xmlns:o="urn:schemas-microsoft-com:office:office" xmlns:oel="http://schemas.microsoft.com/office/2019/extlst" xmlns:r="http://schemas.openxmlformats.org/officeDocument/2006/relationships" xmlns:m="http://schemas.openxmlformats.org/officeDocument/2006/math" xmlns:v="urn:schemas-microsoft-com:vml" xmlns:wp14="http://schemas.microsoft.com/office/word/2010/wordprocessingDrawing" xmlns:wp="http://schemas.openxmlformats.org/drawingml/2006/wordprocessingDrawing" xmlns:w10="urn:schemas-microsoft-com:office:word" xmlns:w14="http://schemas.microsoft.com/office/word/2010/wordml" xmlns:w15="http://schemas.microsoft.com/office/word/2012/wordml" xmlns:w16cex="http://schemas.microsoft.com/office/word/2018/wordml/cex" xmlns:w16cid="http://schemas.microsoft.com/office/word/2016/wordml/cid" xmlns:w16="http://schemas.microsoft.com/office/word/2018/wordml" xmlns:w16sdtdh="http://schemas.microsoft.com/office/word/2020/wordml/sdtdatahash" xmlns:w16se="http://schemas.microsoft.com/office/word/2015/wordml/symex" xmlns:wpg="http://schemas.microsoft.com/office/word/2010/wordprocessingGroup" xmlns:wpi="http://schemas.microsoft.com/office/word/2010/wordprocessingInk" xmlns:wne="http://schemas.microsoft.com/office/word/2006/wordml" xmlns:wps="http://schemas.microsoft.com/office/word/2010/wordprocessingShape">
+                <wp:inline distT="0" distB="0" distL="0" distR="0" wp14:anchorId="63BAFBB2" wp14:editId="1756C0E5">
+                  <wp:extent cx="334645" cy="334645"/>
+                  <wp:effectExtent l="0" t="0" r="0" b="0"/>
+                  <wp:docPr id="54230629" name="Picture 3" descr="elec"/>
+                  <wp:cNvGraphicFramePr>
+                    <a:graphicFrameLocks xmlns:a="http://schemas.openxmlformats.org/drawingml/2006/main" noChangeAspect="1"/>
+                  </wp:cNvGraphicFramePr>
+                  <a:graphic xmlns:a="http://schemas.openxmlformats.org/drawingml/2006/main">
+                    <a:graphicData uri="http://schemas.openxmlformats.org/drawingml/2006/picture">
+                      <pic:pic xmlns:pic="http://schemas.openxmlformats.org/drawingml/2006/picture">
+                        <pic:nvPicPr>
+                          <pic:cNvPr id="0" name="Picture 5" descr="elec"/>
+                          <pic:cNvPicPr>
+                            <a:picLocks noChangeAspect="1" noChangeArrowheads="1"/>
+                          </pic:cNvPicPr>
+                        </pic:nvPicPr>
+                        <pic:blipFill>
+                          <a:blip r:embed="rId15">
+                            <a:extLst>
+                              <a:ext uri="{28A0092B-C50C-407E-A947-70E740481C1C}">
+                                <a14:useLocalDpi xmlns:a14="http://schemas.microsoft.com/office/drawing/2010/main" val="0"/>
+                              </a:ext>
+                            </a:extLst>
+                          </a:blip>
+                          <a:srcRect/>
+                          <a:stretch>
+                            <a:fillRect/>
+                          </a:stretch>
+                        </pic:blipFill>
+                        <pic:spPr bwMode="auto">
+                          <a:xfrm>
+                            <a:off x="0" y="0"/>
+                            <a:ext cx="334645" cy="334645"/>
+                          </a:xfrm>
+                          <a:prstGeom prst="rect">
+                            <a:avLst/>
+                          </a:prstGeom>
+                          <a:noFill/>
+                          <a:ln>
+                            <a:noFill/>
+                          </a:ln>
+                        </pic:spPr>
+                      </pic:pic>
+                    </a:graphicData>
+                  </a:graphic>
+                </wp:inline>
+              </w:drawing>
+            </w:r>
+          </w:p>
+        </w:tc>
+        <w:tc>
+          <w:tcPr>
+            <w:tcW w:w="1793" w:type="dxa"/>
+            <w:tcBorders>
+              <w:top w:val="single" w:sz="8" w:space="0" w:color="000000"/>
+              <w:left w:val="nil"/>
+              <w:bottom w:val="single" w:sz="8" w:space="0" w:color="000000"/>
+              <w:right w:val="single" w:sz="8" w:space="0" w:color="000000"/>
+            </w:tcBorders>
+            <w:shd w:val="clear" w:color="auto" w:fill="CCFFFF"/>
+            <w:tcMar>
+              <w:top w:w="30" w:type="dxa"/>
+              <w:left w:w="30" w:type="dxa"/>
+              <w:bottom w:w="30" w:type="dxa"/>
+              <w:right w:w="30" w:type="dxa"/>
+            </w:tcMar>
+            <w:vAlign w:val="center"/>
+          </w:tcPr>
+          <w:p>
+            <w:pPr>
+              <w:spacing w:before="0" w:after="0"/>
+              <w:jc w:val="left"/>
+              <w:rPr>
+                <w:rFonts w:ascii="Arial" w:hAnsi="Arial" w:cs="Arial"/>
+                <w:sz w:val="18"/>
+                <w:szCs w:val="18"/>
+              </w:rPr>
+            </w:pPr>
+            <w:r>
+              <w:rPr>
+                <w:rFonts w:ascii="Arial" w:hAnsi="Arial" w:cs="Arial" w:eastAsia="Arial"/>
+                <w:b/>
+                <w:bCs/>
+                <w:sz w:val="17"/>
+                <w:szCs w:val="17"/>
+                <w:lang w:val="en-GB"/>
+              </w:rPr>
+              <w:t xml:space="preserve">Contact with Electrical Energy</w:t>
+            </w:r>
+          </w:p>
+        </w:tc>
+        <w:tc>
+          <w:tcPr>
+            <w:tcW w:w="700" w:type="dxa"/>
+            <w:tcBorders>
+              <w:top w:val="single" w:sz="8" w:space="0" w:color="000000"/>
+              <w:left w:val="single" w:sz="8" w:space="0" w:color="000000"/>
+              <w:bottom w:val="single" w:sz="8" w:space="0" w:color="000000"/>
+              <w:right w:val="nil"/>
+            </w:tcBorders>
+            <w:shd w:val="clear" w:color="auto" w:fill="CCFFFF"/>
+            <w:tcMar>
+              <w:top w:w="30" w:type="dxa"/>
+              <w:left w:w="30" w:type="dxa"/>
+              <w:bottom w:w="30" w:type="dxa"/>
+              <w:right w:w="0" w:type="dxa"/>
+            </w:tcMar>
+            <w:vAlign w:val="center"/>
+          </w:tcPr>
+          <w:p>
+            <w:pPr>
+              <w:spacing w:before="0" w:after="0"/>
+              <w:jc w:val="center"/>
+              <w:rPr>
+                <w:rFonts w:ascii="Arial" w:hAnsi="Arial" w:cs="Arial"/>
+                <w:sz w:val="18"/>
+                <w:szCs w:val="18"/>
+              </w:rPr>
+            </w:pPr>
+            <w:r>
+              <w:drawing xmlns:w="http://schemas.openxmlformats.org/wordprocessingml/2006/main" xmlns:wpc="http://schemas.microsoft.com/office/word/2010/wordprocessingCanvas" xmlns:cx="http://schemas.microsoft.com/office/drawing/2014/chartex" xmlns:cx1="http://schemas.microsoft.com/office/drawing/2015/9/8/chartex" xmlns:cx2="http://schemas.microsoft.com/office/drawing/2015/10/21/chartex" xmlns:cx3="http://schemas.microsoft.com/office/drawing/2016/5/9/chartex" xmlns:cx4="http://schemas.microsoft.com/office/drawing/2016/5/10/chartex" xmlns:cx5="http://schemas.microsoft.com/office/drawing/2016/5/11/chartex" xmlns:cx6="http://schemas.microsoft.com/office/drawing/2016/5/12/chartex" xmlns:cx7="http://schemas.microsoft.com/office/drawing/2016/5/13/chartex" xmlns:cx8="http://schemas.microsoft.com/office/drawing/2016/5/14/chartex" xmlns:mc="http://schemas.openxmlformats.org/markup-compatibility/2006" xmlns:aink="http://schemas.microsoft.com/office/drawing/2016/ink" xmlns:am3d="http://schemas.microsoft.com/office/drawing/2017/model3d" xmlns:o="urn:schemas-microsoft-com:office:office" xmlns:oel="http://schemas.microsoft.com/office/2019/extlst" xmlns:r="http://schemas.openxmlformats.org/officeDocument/2006/relationships" xmlns:m="http://schemas.openxmlformats.org/officeDocument/2006/math" xmlns:v="urn:schemas-microsoft-com:vml" xmlns:wp14="http://schemas.microsoft.com/office/word/2010/wordprocessingDrawing" xmlns:wp="http://schemas.openxmlformats.org/drawingml/2006/wordprocessingDrawing" xmlns:w10="urn:schemas-microsoft-com:office:word" xmlns:w14="http://schemas.microsoft.com/office/word/2010/wordml" xmlns:w15="http://schemas.microsoft.com/office/word/2012/wordml" xmlns:w16cex="http://schemas.microsoft.com/office/word/2018/wordml/cex" xmlns:w16cid="http://schemas.microsoft.com/office/word/2016/wordml/cid" xmlns:w16="http://schemas.microsoft.com/office/word/2018/wordml" xmlns:w16sdtdh="http://schemas.microsoft.com/office/word/2020/wordml/sdtdatahash" xmlns:w16se="http://schemas.microsoft.com/office/word/2015/wordml/symex" xmlns:wpg="http://schemas.microsoft.com/office/word/2010/wordprocessingGroup" xmlns:wpi="http://schemas.microsoft.com/office/word/2010/wordprocessingInk" xmlns:wne="http://schemas.microsoft.com/office/word/2006/wordml" xmlns:wps="http://schemas.microsoft.com/office/word/2010/wordprocessingShape">
+                <wp:inline distT="0" distB="0" distL="0" distR="0" wp14:anchorId="7632D3E0" wp14:editId="16F72B8B">
+                  <wp:extent cx="264160" cy="334645"/>
+                  <wp:effectExtent l="0" t="0" r="0" b="0"/>
+                  <wp:docPr id="39568626" name="Picture 39568626" descr="whe"/>
+                  <wp:cNvGraphicFramePr>
+                    <a:graphicFrameLocks xmlns:a="http://schemas.openxmlformats.org/drawingml/2006/main" noChangeAspect="1"/>
+                  </wp:cNvGraphicFramePr>
+                  <a:graphic xmlns:a="http://schemas.openxmlformats.org/drawingml/2006/main">
+                    <a:graphicData uri="http://schemas.openxmlformats.org/drawingml/2006/picture">
+                      <pic:pic xmlns:pic="http://schemas.openxmlformats.org/drawingml/2006/picture">
+                        <pic:nvPicPr>
+                          <pic:cNvPr id="0" name="Picture 28" descr="whe"/>
+                          <pic:cNvPicPr>
+                            <a:picLocks noChangeAspect="1" noChangeArrowheads="1"/>
+                          </pic:cNvPicPr>
+                        </pic:nvPicPr>
+                        <pic:blipFill>
+                          <a:blip r:embed="rId16">
+                            <a:extLst>
+                              <a:ext uri="{28A0092B-C50C-407E-A947-70E740481C1C}">
+                                <a14:useLocalDpi xmlns:a14="http://schemas.microsoft.com/office/drawing/2010/main" val="0"/>
+                              </a:ext>
+                            </a:extLst>
+                          </a:blip>
+                          <a:srcRect/>
+                          <a:stretch>
+                            <a:fillRect/>
+                          </a:stretch>
+                        </pic:blipFill>
+                        <pic:spPr bwMode="auto">
+                          <a:xfrm>
+                            <a:off x="0" y="0"/>
+                            <a:ext cx="264160" cy="334645"/>
+                          </a:xfrm>
+                          <a:prstGeom prst="rect">
+                            <a:avLst/>
+                          </a:prstGeom>
+                          <a:noFill/>
+                          <a:ln>
+                            <a:noFill/>
+                          </a:ln>
+                        </pic:spPr>
+                      </pic:pic>
+                    </a:graphicData>
+                  </a:graphic>
+                </wp:inline>
+              </w:drawing>
+            </w:r>
+          </w:p>
+        </w:tc>
+        <w:tc>
+          <w:tcPr>
+            <w:tcW w:w="1793" w:type="dxa"/>
+            <w:tcBorders>
+              <w:top w:val="single" w:sz="8" w:space="0" w:color="000000"/>
+              <w:left w:val="nil"/>
+              <w:bottom w:val="single" w:sz="8" w:space="0" w:color="000000"/>
+              <w:right w:val="single" w:sz="8" w:space="0" w:color="000000"/>
+            </w:tcBorders>
+            <w:shd w:val="clear" w:color="auto" w:fill="CCFFFF"/>
+            <w:tcMar>
+              <w:top w:w="30" w:type="dxa"/>
+              <w:left w:w="30" w:type="dxa"/>
+              <w:bottom w:w="30" w:type="dxa"/>
+              <w:right w:w="30" w:type="dxa"/>
+            </w:tcMar>
+            <w:vAlign w:val="center"/>
+          </w:tcPr>
+          <w:p>
+            <w:pPr>
+              <w:spacing w:before="0" w:after="0"/>
+              <w:jc w:val="left"/>
+              <w:rPr>
+                <w:rFonts w:ascii="Arial" w:hAnsi="Arial" w:cs="Arial"/>
+                <w:sz w:val="18"/>
+                <w:szCs w:val="18"/>
+              </w:rPr>
+            </w:pPr>
+            <w:r>
+              <w:rPr>
+                <w:rFonts w:ascii="Arial" w:hAnsi="Arial" w:cs="Arial" w:eastAsia="Arial"/>
+                <w:b/>
+                <w:bCs/>
+                <w:sz w:val="17"/>
+                <w:szCs w:val="17"/>
+                <w:lang w:val="en-GB"/>
+              </w:rPr>
+              <w:t xml:space="preserve">Moving Object or Equipment</w:t>
+            </w:r>
+          </w:p>
+        </w:tc>
+      </w:tr>
+      <w:tr>
+        <w:trPr>
+          <w:cantSplit/>
+          <w:trHeight w:val="620" w:hRule="atLeast"/>
+        </w:trPr>
+        <w:tc>
+          <w:tcPr>
+            <w:tcW w:w="700" w:type="dxa"/>
+            <w:tcBorders>
+              <w:top w:val="single" w:sz="8" w:space="0" w:color="000000"/>
+              <w:left w:val="single" w:sz="8" w:space="0" w:color="000000"/>
+              <w:bottom w:val="single" w:sz="8" w:space="0" w:color="000000"/>
+              <w:right w:val="nil"/>
+            </w:tcBorders>
+            <w:shd w:val="clear" w:color="auto" w:fill="CCFFFF"/>
+            <w:tcMar>
+              <w:top w:w="30" w:type="dxa"/>
+              <w:left w:w="30" w:type="dxa"/>
+              <w:bottom w:w="30" w:type="dxa"/>
+              <w:right w:w="0" w:type="dxa"/>
+            </w:tcMar>
+            <w:vAlign w:val="center"/>
+          </w:tcPr>
+          <w:p>
+            <w:pPr>
+              <w:spacing w:before="0" w:after="0"/>
+              <w:jc w:val="center"/>
+              <w:rPr>
+                <w:rFonts w:ascii="Arial" w:hAnsi="Arial" w:cs="Arial"/>
+                <w:sz w:val="18"/>
+                <w:szCs w:val="18"/>
+              </w:rPr>
+            </w:pPr>
+            <w:r>
+              <w:drawing xmlns:w="http://schemas.openxmlformats.org/wordprocessingml/2006/main" xmlns:wpc="http://schemas.microsoft.com/office/word/2010/wordprocessingCanvas" xmlns:cx="http://schemas.microsoft.com/office/drawing/2014/chartex" xmlns:cx1="http://schemas.microsoft.com/office/drawing/2015/9/8/chartex" xmlns:cx2="http://schemas.microsoft.com/office/drawing/2015/10/21/chartex" xmlns:cx3="http://schemas.microsoft.com/office/drawing/2016/5/9/chartex" xmlns:cx4="http://schemas.microsoft.com/office/drawing/2016/5/10/chartex" xmlns:cx5="http://schemas.microsoft.com/office/drawing/2016/5/11/chartex" xmlns:cx6="http://schemas.microsoft.com/office/drawing/2016/5/12/chartex" xmlns:cx7="http://schemas.microsoft.com/office/drawing/2016/5/13/chartex" xmlns:cx8="http://schemas.microsoft.com/office/drawing/2016/5/14/chartex" xmlns:mc="http://schemas.openxmlformats.org/markup-compatibility/2006" xmlns:aink="http://schemas.microsoft.com/office/drawing/2016/ink" xmlns:am3d="http://schemas.microsoft.com/office/drawing/2017/model3d" xmlns:o="urn:schemas-microsoft-com:office:office" xmlns:oel="http://schemas.microsoft.com/office/2019/extlst" xmlns:r="http://schemas.openxmlformats.org/officeDocument/2006/relationships" xmlns:m="http://schemas.openxmlformats.org/officeDocument/2006/math" xmlns:v="urn:schemas-microsoft-com:vml" xmlns:wp14="http://schemas.microsoft.com/office/word/2010/wordprocessingDrawing" xmlns:wp="http://schemas.openxmlformats.org/drawingml/2006/wordprocessingDrawing" xmlns:w10="urn:schemas-microsoft-com:office:word" xmlns:w14="http://schemas.microsoft.com/office/word/2010/wordml" xmlns:w15="http://schemas.microsoft.com/office/word/2012/wordml" xmlns:w16cex="http://schemas.microsoft.com/office/word/2018/wordml/cex" xmlns:w16cid="http://schemas.microsoft.com/office/word/2016/wordml/cid" xmlns:w16="http://schemas.microsoft.com/office/word/2018/wordml" xmlns:w16sdtdh="http://schemas.microsoft.com/office/word/2020/wordml/sdtdatahash" xmlns:w16se="http://schemas.microsoft.com/office/word/2015/wordml/symex" xmlns:wpg="http://schemas.microsoft.com/office/word/2010/wordprocessingGroup" xmlns:wpi="http://schemas.microsoft.com/office/word/2010/wordprocessingInk" xmlns:wne="http://schemas.microsoft.com/office/word/2006/wordml" xmlns:wps="http://schemas.microsoft.com/office/word/2010/wordprocessingShape">
+                <wp:inline distT="0" distB="0" distL="0" distR="0" wp14:anchorId="234E2E04" wp14:editId="094823FA">
+                  <wp:extent cx="315595" cy="334645"/>
+                  <wp:effectExtent l="0" t="0" r="0" b="0"/>
+                  <wp:docPr id="561133330" name="Picture 20" descr="haz"/>
+                  <wp:cNvGraphicFramePr>
+                    <a:graphicFrameLocks xmlns:a="http://schemas.openxmlformats.org/drawingml/2006/main" noChangeAspect="1"/>
+                  </wp:cNvGraphicFramePr>
+                  <a:graphic xmlns:a="http://schemas.openxmlformats.org/drawingml/2006/main">
+                    <a:graphicData uri="http://schemas.openxmlformats.org/drawingml/2006/picture">
+                      <pic:pic xmlns:pic="http://schemas.openxmlformats.org/drawingml/2006/picture">
+                        <pic:nvPicPr>
+                          <pic:cNvPr id="0" name="Picture 20" descr="haz"/>
+                          <pic:cNvPicPr>
+                            <a:picLocks noChangeAspect="1" noChangeArrowheads="1"/>
+                          </pic:cNvPicPr>
+                        </pic:nvPicPr>
+                        <pic:blipFill>
+                          <a:blip r:embed="rId17">
+                            <a:extLst>
+                              <a:ext uri="{28A0092B-C50C-407E-A947-70E740481C1C}">
+                                <a14:useLocalDpi xmlns:a14="http://schemas.microsoft.com/office/drawing/2010/main" val="0"/>
+                              </a:ext>
+                            </a:extLst>
+                          </a:blip>
+                          <a:srcRect/>
+                          <a:stretch>
+                            <a:fillRect/>
+                          </a:stretch>
+                        </pic:blipFill>
+                        <pic:spPr bwMode="auto">
+                          <a:xfrm>
+                            <a:off x="0" y="0"/>
+                            <a:ext cx="315595" cy="334645"/>
+                          </a:xfrm>
+                          <a:prstGeom prst="rect">
+                            <a:avLst/>
+                          </a:prstGeom>
+                          <a:noFill/>
+                          <a:ln>
+                            <a:noFill/>
+                          </a:ln>
+                        </pic:spPr>
+                      </pic:pic>
+                    </a:graphicData>
+                  </a:graphic>
+                </wp:inline>
+              </w:drawing>
+            </w:r>
+          </w:p>
+        </w:tc>
+        <w:tc>
+          <w:tcPr>
+            <w:tcW w:w="1793" w:type="dxa"/>
+            <w:tcBorders>
+              <w:top w:val="single" w:sz="8" w:space="0" w:color="000000"/>
+              <w:left w:val="nil"/>
+              <w:bottom w:val="single" w:sz="8" w:space="0" w:color="000000"/>
+              <w:right w:val="single" w:sz="8" w:space="0" w:color="000000"/>
+            </w:tcBorders>
+            <w:shd w:val="clear" w:color="auto" w:fill="CCFFFF"/>
+            <w:tcMar>
+              <w:top w:w="30" w:type="dxa"/>
+              <w:left w:w="30" w:type="dxa"/>
+              <w:bottom w:w="30" w:type="dxa"/>
+              <w:right w:w="30" w:type="dxa"/>
+            </w:tcMar>
+            <w:vAlign w:val="center"/>
+          </w:tcPr>
+          <w:p>
+            <w:pPr>
+              <w:spacing w:before="0" w:after="0"/>
+              <w:jc w:val="left"/>
+              <w:rPr>
+                <w:rFonts w:ascii="Arial" w:hAnsi="Arial" w:cs="Arial"/>
+                <w:sz w:val="18"/>
+                <w:szCs w:val="18"/>
+              </w:rPr>
+            </w:pPr>
+            <w:r>
+              <w:rPr>
+                <w:rFonts w:ascii="Arial" w:hAnsi="Arial" w:cs="Arial" w:eastAsia="Arial"/>
+                <w:b/>
+                <w:bCs/>
+                <w:sz w:val="17"/>
+                <w:szCs w:val="17"/>
+                <w:lang w:val="en-GB"/>
+              </w:rPr>
+              <w:t xml:space="preserve">Exposure to Hazardous Substances</w:t>
+            </w:r>
+          </w:p>
+        </w:tc>
+        <w:tc>
+          <w:tcPr>
+            <w:tcW w:w="700" w:type="dxa"/>
+            <w:tcBorders>
+              <w:top w:val="single" w:sz="8" w:space="0" w:color="000000"/>
+              <w:left w:val="single" w:sz="8" w:space="0" w:color="000000"/>
+              <w:bottom w:val="single" w:sz="8" w:space="0" w:color="000000"/>
+              <w:right w:val="nil"/>
+            </w:tcBorders>
+            <w:shd w:val="clear" w:color="auto" w:fill="CCFFFF"/>
+            <w:tcMar>
+              <w:top w:w="30" w:type="dxa"/>
+              <w:left w:w="30" w:type="dxa"/>
+              <w:bottom w:w="30" w:type="dxa"/>
+              <w:right w:w="0" w:type="dxa"/>
+            </w:tcMar>
+            <w:vAlign w:val="center"/>
+          </w:tcPr>
+          <w:p>
+            <w:pPr>
+              <w:spacing w:before="0" w:after="0"/>
+              <w:jc w:val="center"/>
+              <w:rPr>
+                <w:rFonts w:ascii="Arial" w:hAnsi="Arial" w:cs="Arial"/>
+                <w:sz w:val="18"/>
+                <w:szCs w:val="18"/>
+              </w:rPr>
+            </w:pPr>
+            <w:r>
+              <w:drawing xmlns:w="http://schemas.openxmlformats.org/wordprocessingml/2006/main" xmlns:wpc="http://schemas.microsoft.com/office/word/2010/wordprocessingCanvas" xmlns:cx="http://schemas.microsoft.com/office/drawing/2014/chartex" xmlns:cx1="http://schemas.microsoft.com/office/drawing/2015/9/8/chartex" xmlns:cx2="http://schemas.microsoft.com/office/drawing/2015/10/21/chartex" xmlns:cx3="http://schemas.microsoft.com/office/drawing/2016/5/9/chartex" xmlns:cx4="http://schemas.microsoft.com/office/drawing/2016/5/10/chartex" xmlns:cx5="http://schemas.microsoft.com/office/drawing/2016/5/11/chartex" xmlns:cx6="http://schemas.microsoft.com/office/drawing/2016/5/12/chartex" xmlns:cx7="http://schemas.microsoft.com/office/drawing/2016/5/13/chartex" xmlns:cx8="http://schemas.microsoft.com/office/drawing/2016/5/14/chartex" xmlns:mc="http://schemas.openxmlformats.org/markup-compatibility/2006" xmlns:aink="http://schemas.microsoft.com/office/drawing/2016/ink" xmlns:am3d="http://schemas.microsoft.com/office/drawing/2017/model3d" xmlns:o="urn:schemas-microsoft-com:office:office" xmlns:oel="http://schemas.microsoft.com/office/2019/extlst" xmlns:r="http://schemas.openxmlformats.org/officeDocument/2006/relationships" xmlns:m="http://schemas.openxmlformats.org/officeDocument/2006/math" xmlns:v="urn:schemas-microsoft-com:vml" xmlns:wp14="http://schemas.microsoft.com/office/word/2010/wordprocessingDrawing" xmlns:wp="http://schemas.openxmlformats.org/drawingml/2006/wordprocessingDrawing" xmlns:w10="urn:schemas-microsoft-com:office:word" xmlns:w14="http://schemas.microsoft.com/office/word/2010/wordml" xmlns:w15="http://schemas.microsoft.com/office/word/2012/wordml" xmlns:w16cex="http://schemas.microsoft.com/office/word/2018/wordml/cex" xmlns:w16cid="http://schemas.microsoft.com/office/word/2016/wordml/cid" xmlns:w16="http://schemas.microsoft.com/office/word/2018/wordml" xmlns:w16sdtdh="http://schemas.microsoft.com/office/word/2020/wordml/sdtdatahash" xmlns:w16se="http://schemas.microsoft.com/office/word/2015/wordml/symex" xmlns:wpg="http://schemas.microsoft.com/office/word/2010/wordprocessingGroup" xmlns:wpi="http://schemas.microsoft.com/office/word/2010/wordprocessingInk" xmlns:wne="http://schemas.microsoft.com/office/word/2006/wordml" xmlns:wps="http://schemas.microsoft.com/office/word/2010/wordprocessingShape">
+                <wp:inline distT="0" distB="0" distL="0" distR="0" wp14:anchorId="2F98DD1A" wp14:editId="1666F987">
+                  <wp:extent cx="302895" cy="334645"/>
+                  <wp:effectExtent l="0" t="0" r="0" b="0"/>
+                  <wp:docPr id="720018451" name="Picture 21" descr="hot cold"/>
+                  <wp:cNvGraphicFramePr>
+                    <a:graphicFrameLocks xmlns:a="http://schemas.openxmlformats.org/drawingml/2006/main" noChangeAspect="1"/>
+                  </wp:cNvGraphicFramePr>
+                  <a:graphic xmlns:a="http://schemas.openxmlformats.org/drawingml/2006/main">
+                    <a:graphicData uri="http://schemas.openxmlformats.org/drawingml/2006/picture">
+                      <pic:pic xmlns:pic="http://schemas.openxmlformats.org/drawingml/2006/picture">
+                        <pic:nvPicPr>
+                          <pic:cNvPr id="0" name="Picture 21" descr="hot cold"/>
+                          <pic:cNvPicPr>
+                            <a:picLocks noChangeAspect="1" noChangeArrowheads="1"/>
+                          </pic:cNvPicPr>
+                        </pic:nvPicPr>
+                        <pic:blipFill>
+                          <a:blip r:embed="rId18">
+                            <a:extLst>
+                              <a:ext uri="{28A0092B-C50C-407E-A947-70E740481C1C}">
+                                <a14:useLocalDpi xmlns:a14="http://schemas.microsoft.com/office/drawing/2010/main" val="0"/>
+                              </a:ext>
+                            </a:extLst>
+                          </a:blip>
+                          <a:srcRect/>
+                          <a:stretch>
+                            <a:fillRect/>
+                          </a:stretch>
+                        </pic:blipFill>
+                        <pic:spPr bwMode="auto">
+                          <a:xfrm>
+                            <a:off x="0" y="0"/>
+                            <a:ext cx="302895" cy="334645"/>
+                          </a:xfrm>
+                          <a:prstGeom prst="rect">
+                            <a:avLst/>
+                          </a:prstGeom>
+                          <a:noFill/>
+                          <a:ln>
+                            <a:noFill/>
+                          </a:ln>
+                        </pic:spPr>
+                      </pic:pic>
+                    </a:graphicData>
+                  </a:graphic>
+                </wp:inline>
+              </w:drawing>
+            </w:r>
+          </w:p>
+        </w:tc>
+        <w:tc>
+          <w:tcPr>
+            <w:tcW w:w="1793" w:type="dxa"/>
+            <w:tcBorders>
+              <w:top w:val="single" w:sz="8" w:space="0" w:color="000000"/>
+              <w:left w:val="nil"/>
+              <w:bottom w:val="single" w:sz="8" w:space="0" w:color="000000"/>
+              <w:right w:val="single" w:sz="8" w:space="0" w:color="000000"/>
+            </w:tcBorders>
+            <w:shd w:val="clear" w:color="auto" w:fill="CCFFFF"/>
+            <w:tcMar>
+              <w:top w:w="30" w:type="dxa"/>
+              <w:left w:w="30" w:type="dxa"/>
+              <w:bottom w:w="30" w:type="dxa"/>
+              <w:right w:w="30" w:type="dxa"/>
+            </w:tcMar>
+            <w:vAlign w:val="center"/>
+          </w:tcPr>
+          <w:p>
+            <w:pPr>
+              <w:spacing w:before="0" w:after="0"/>
+              <w:jc w:val="left"/>
+              <w:rPr>
+                <w:rFonts w:ascii="Arial" w:hAnsi="Arial" w:cs="Arial"/>
+                <w:sz w:val="18"/>
+                <w:szCs w:val="18"/>
+              </w:rPr>
+            </w:pPr>
+            <w:r>
+              <w:rPr>
+                <w:rFonts w:ascii="Arial" w:hAnsi="Arial" w:cs="Arial" w:eastAsia="Arial"/>
+                <w:b/>
+                <w:bCs/>
+                <w:sz w:val="17"/>
+                <w:szCs w:val="17"/>
+                <w:lang w:val="en-GB"/>
+              </w:rPr>
+              <w:t xml:space="preserve">Exposure to Hot or Cold Equipment</w:t>
+            </w:r>
+          </w:p>
+        </w:tc>
+        <w:tc>
+          <w:tcPr>
+            <w:tcW w:w="700" w:type="dxa"/>
+            <w:tcBorders>
+              <w:top w:val="single" w:sz="8" w:space="0" w:color="000000"/>
+              <w:left w:val="single" w:sz="8" w:space="0" w:color="000000"/>
+              <w:bottom w:val="single" w:sz="8" w:space="0" w:color="000000"/>
+              <w:right w:val="nil"/>
+            </w:tcBorders>
+            <w:shd w:val="clear" w:color="auto" w:fill="CCFFFF"/>
+            <w:tcMar>
+              <w:top w:w="30" w:type="dxa"/>
+              <w:left w:w="30" w:type="dxa"/>
+              <w:bottom w:w="30" w:type="dxa"/>
+              <w:right w:w="0" w:type="dxa"/>
+            </w:tcMar>
+            <w:vAlign w:val="center"/>
+          </w:tcPr>
+          <w:p>
+            <w:pPr>
+              <w:spacing w:before="0" w:after="0"/>
+              <w:jc w:val="center"/>
+              <w:rPr>
+                <w:rFonts w:ascii="Arial" w:hAnsi="Arial" w:cs="Arial"/>
+                <w:sz w:val="18"/>
+                <w:szCs w:val="18"/>
+              </w:rPr>
+            </w:pPr>
+            <w:r>
+              <w:drawing xmlns:w="http://schemas.openxmlformats.org/wordprocessingml/2006/main" xmlns:wpc="http://schemas.microsoft.com/office/word/2010/wordprocessingCanvas" xmlns:cx="http://schemas.microsoft.com/office/drawing/2014/chartex" xmlns:cx1="http://schemas.microsoft.com/office/drawing/2015/9/8/chartex" xmlns:cx2="http://schemas.microsoft.com/office/drawing/2015/10/21/chartex" xmlns:cx3="http://schemas.microsoft.com/office/drawing/2016/5/9/chartex" xmlns:cx4="http://schemas.microsoft.com/office/drawing/2016/5/10/chartex" xmlns:cx5="http://schemas.microsoft.com/office/drawing/2016/5/11/chartex" xmlns:cx6="http://schemas.microsoft.com/office/drawing/2016/5/12/chartex" xmlns:cx7="http://schemas.microsoft.com/office/drawing/2016/5/13/chartex" xmlns:cx8="http://schemas.microsoft.com/office/drawing/2016/5/14/chartex" xmlns:mc="http://schemas.openxmlformats.org/markup-compatibility/2006" xmlns:aink="http://schemas.microsoft.com/office/drawing/2016/ink" xmlns:am3d="http://schemas.microsoft.com/office/drawing/2017/model3d" xmlns:o="urn:schemas-microsoft-com:office:office" xmlns:oel="http://schemas.microsoft.com/office/2019/extlst" xmlns:r="http://schemas.openxmlformats.org/officeDocument/2006/relationships" xmlns:m="http://schemas.openxmlformats.org/officeDocument/2006/math" xmlns:v="urn:schemas-microsoft-com:vml" xmlns:wp14="http://schemas.microsoft.com/office/word/2010/wordprocessingDrawing" xmlns:wp="http://schemas.openxmlformats.org/drawingml/2006/wordprocessingDrawing" xmlns:w10="urn:schemas-microsoft-com:office:word" xmlns:w14="http://schemas.microsoft.com/office/word/2010/wordml" xmlns:w15="http://schemas.microsoft.com/office/word/2012/wordml" xmlns:w16cex="http://schemas.microsoft.com/office/word/2018/wordml/cex" xmlns:w16cid="http://schemas.microsoft.com/office/word/2016/wordml/cid" xmlns:w16="http://schemas.microsoft.com/office/word/2018/wordml" xmlns:w16sdtdh="http://schemas.microsoft.com/office/word/2020/wordml/sdtdatahash" xmlns:w16se="http://schemas.microsoft.com/office/word/2015/wordml/symex" xmlns:wpg="http://schemas.microsoft.com/office/word/2010/wordprocessingGroup" xmlns:wpi="http://schemas.microsoft.com/office/word/2010/wordprocessingInk" xmlns:wne="http://schemas.microsoft.com/office/word/2006/wordml" xmlns:wps="http://schemas.microsoft.com/office/word/2010/wordprocessingShape">
+                <wp:inline distT="0" distB="0" distL="0" distR="0" wp14:anchorId="077F63AC" wp14:editId="3D1F76BB">
+                  <wp:extent cx="418465" cy="315595"/>
+                  <wp:effectExtent l="0" t="0" r="0" b="0"/>
+                  <wp:docPr id="748166024" name="Picture 748166024" descr="cse"/>
+                  <wp:cNvGraphicFramePr>
+                    <a:graphicFrameLocks xmlns:a="http://schemas.openxmlformats.org/drawingml/2006/main" noChangeAspect="1"/>
+                  </wp:cNvGraphicFramePr>
+                  <a:graphic xmlns:a="http://schemas.openxmlformats.org/drawingml/2006/main">
+                    <a:graphicData uri="http://schemas.openxmlformats.org/drawingml/2006/picture">
+                      <pic:pic xmlns:pic="http://schemas.openxmlformats.org/drawingml/2006/picture">
+                        <pic:nvPicPr>
+                          <pic:cNvPr id="0" name="Picture 25" descr="cse"/>
+                          <pic:cNvPicPr>
+                            <a:picLocks noChangeAspect="1" noChangeArrowheads="1"/>
+                          </pic:cNvPicPr>
+                        </pic:nvPicPr>
+                        <pic:blipFill>
+                          <a:blip r:embed="rId19">
+                            <a:extLst>
+                              <a:ext uri="{28A0092B-C50C-407E-A947-70E740481C1C}">
+                                <a14:useLocalDpi xmlns:a14="http://schemas.microsoft.com/office/drawing/2010/main" val="0"/>
+                              </a:ext>
+                            </a:extLst>
+                          </a:blip>
+                          <a:srcRect/>
+                          <a:stretch>
+                            <a:fillRect/>
+                          </a:stretch>
+                        </pic:blipFill>
+                        <pic:spPr bwMode="auto">
+                          <a:xfrm>
+                            <a:off x="0" y="0"/>
+                            <a:ext cx="418465" cy="315595"/>
+                          </a:xfrm>
+                          <a:prstGeom prst="rect">
+                            <a:avLst/>
+                          </a:prstGeom>
+                          <a:noFill/>
+                          <a:ln>
+                            <a:noFill/>
+                          </a:ln>
+                        </pic:spPr>
+                      </pic:pic>
+                    </a:graphicData>
+                  </a:graphic>
+                </wp:inline>
+              </w:drawing>
+            </w:r>
+          </w:p>
+        </w:tc>
+        <w:tc>
+          <w:tcPr>
+            <w:tcW w:w="1793" w:type="dxa"/>
+            <w:tcBorders>
+              <w:top w:val="single" w:sz="8" w:space="0" w:color="000000"/>
+              <w:left w:val="nil"/>
+              <w:bottom w:val="single" w:sz="8" w:space="0" w:color="000000"/>
+              <w:right w:val="single" w:sz="8" w:space="0" w:color="000000"/>
+            </w:tcBorders>
+            <w:shd w:val="clear" w:color="auto" w:fill="CCFFFF"/>
+            <w:tcMar>
+              <w:top w:w="30" w:type="dxa"/>
+              <w:left w:w="30" w:type="dxa"/>
+              <w:bottom w:w="30" w:type="dxa"/>
+              <w:right w:w="30" w:type="dxa"/>
+            </w:tcMar>
+            <w:vAlign w:val="center"/>
+          </w:tcPr>
+          <w:p>
+            <w:pPr>
+              <w:spacing w:before="0" w:after="0"/>
+              <w:jc w:val="left"/>
+              <w:rPr>
+                <w:rFonts w:ascii="Arial" w:hAnsi="Arial" w:cs="Arial"/>
+                <w:sz w:val="18"/>
+                <w:szCs w:val="18"/>
+              </w:rPr>
+            </w:pPr>
+            <w:r>
+              <w:rPr>
+                <w:rFonts w:ascii="Arial" w:hAnsi="Arial" w:cs="Arial" w:eastAsia="Arial"/>
+                <w:b/>
+                <w:bCs/>
+                <w:sz w:val="17"/>
+                <w:szCs w:val="17"/>
+                <w:lang w:val="en-GB"/>
+              </w:rPr>
+              <w:t xml:space="preserve">Unauthorized Confined Space Entry</w:t>
+            </w:r>
+          </w:p>
+        </w:tc>
+        <w:tc>
+          <w:tcPr>
+            <w:tcW w:w="700" w:type="dxa"/>
+            <w:tcBorders>
+              <w:top w:val="single" w:sz="8" w:space="0" w:color="000000"/>
+              <w:left w:val="single" w:sz="8" w:space="0" w:color="000000"/>
+              <w:bottom w:val="single" w:sz="8" w:space="0" w:color="000000"/>
+              <w:right w:val="nil"/>
+            </w:tcBorders>
+            <w:shd w:val="clear" w:color="auto" w:fill="CCFFFF"/>
+            <w:tcMar>
+              <w:top w:w="30" w:type="dxa"/>
+              <w:left w:w="30" w:type="dxa"/>
+              <w:bottom w:w="30" w:type="dxa"/>
+              <w:right w:w="0" w:type="dxa"/>
+            </w:tcMar>
+            <w:vAlign w:val="center"/>
+          </w:tcPr>
+          <w:p>
+            <w:pPr>
+              <w:spacing w:before="0" w:after="0"/>
+              <w:jc w:val="center"/>
+              <w:rPr>
+                <w:rFonts w:ascii="Arial" w:hAnsi="Arial" w:cs="Arial"/>
+                <w:sz w:val="18"/>
+                <w:szCs w:val="18"/>
+              </w:rPr>
+            </w:pPr>
+            <w:r>
+              <w:drawing xmlns:w="http://schemas.openxmlformats.org/wordprocessingml/2006/main" xmlns:wpc="http://schemas.microsoft.com/office/word/2010/wordprocessingCanvas" xmlns:cx="http://schemas.microsoft.com/office/drawing/2014/chartex" xmlns:cx1="http://schemas.microsoft.com/office/drawing/2015/9/8/chartex" xmlns:cx2="http://schemas.microsoft.com/office/drawing/2015/10/21/chartex" xmlns:cx3="http://schemas.microsoft.com/office/drawing/2016/5/9/chartex" xmlns:cx4="http://schemas.microsoft.com/office/drawing/2016/5/10/chartex" xmlns:cx5="http://schemas.microsoft.com/office/drawing/2016/5/11/chartex" xmlns:cx6="http://schemas.microsoft.com/office/drawing/2016/5/12/chartex" xmlns:cx7="http://schemas.microsoft.com/office/drawing/2016/5/13/chartex" xmlns:cx8="http://schemas.microsoft.com/office/drawing/2016/5/14/chartex" xmlns:mc="http://schemas.openxmlformats.org/markup-compatibility/2006" xmlns:aink="http://schemas.microsoft.com/office/drawing/2016/ink" xmlns:am3d="http://schemas.microsoft.com/office/drawing/2017/model3d" xmlns:o="urn:schemas-microsoft-com:office:office" xmlns:oel="http://schemas.microsoft.com/office/2019/extlst" xmlns:r="http://schemas.openxmlformats.org/officeDocument/2006/relationships" xmlns:m="http://schemas.openxmlformats.org/officeDocument/2006/math" xmlns:v="urn:schemas-microsoft-com:vml" xmlns:wp14="http://schemas.microsoft.com/office/word/2010/wordprocessingDrawing" xmlns:wp="http://schemas.openxmlformats.org/drawingml/2006/wordprocessingDrawing" xmlns:w10="urn:schemas-microsoft-com:office:word" xmlns:w14="http://schemas.microsoft.com/office/word/2010/wordml" xmlns:w15="http://schemas.microsoft.com/office/word/2012/wordml" xmlns:w16cex="http://schemas.microsoft.com/office/word/2018/wordml/cex" xmlns:w16cid="http://schemas.microsoft.com/office/word/2016/wordml/cid" xmlns:w16="http://schemas.microsoft.com/office/word/2018/wordml" xmlns:w16sdtdh="http://schemas.microsoft.com/office/word/2020/wordml/sdtdatahash" xmlns:w16se="http://schemas.microsoft.com/office/word/2015/wordml/symex" xmlns:wpg="http://schemas.microsoft.com/office/word/2010/wordprocessingGroup" xmlns:wpi="http://schemas.microsoft.com/office/word/2010/wordprocessingInk" xmlns:wne="http://schemas.microsoft.com/office/word/2006/wordml" xmlns:wps="http://schemas.microsoft.com/office/word/2010/wordprocessingShape">
+                <wp:inline distT="0" distB="0" distL="0" distR="0" wp14:anchorId="7B1AB514" wp14:editId="4AA1B59A">
+                  <wp:extent cx="420000" cy="285945"/>
+                  <wp:effectExtent l="0" t="0" r="0" b="0"/>
+                  <wp:docPr id="828781619" name="Picture 23" descr="ex"/>
+                  <wp:cNvGraphicFramePr>
+                    <a:graphicFrameLocks xmlns:a="http://schemas.openxmlformats.org/drawingml/2006/main" noChangeAspect="1"/>
+                  </wp:cNvGraphicFramePr>
+                  <a:graphic xmlns:a="http://schemas.openxmlformats.org/drawingml/2006/main">
+                    <a:graphicData uri="http://schemas.openxmlformats.org/drawingml/2006/picture">
+                      <pic:pic xmlns:pic="http://schemas.openxmlformats.org/drawingml/2006/picture">
+                        <pic:nvPicPr>
+                          <pic:cNvPr id="0" name="Picture 23" descr="ex"/>
+                          <pic:cNvPicPr>
+                            <a:picLocks noChangeAspect="1" noChangeArrowheads="1"/>
+                          </pic:cNvPicPr>
+                        </pic:nvPicPr>
+                        <pic:blipFill>
+                          <a:blip r:embed="rId20">
+                            <a:extLst>
+                              <a:ext uri="{28A0092B-C50C-407E-A947-70E740481C1C}">
+                                <a14:useLocalDpi xmlns:a14="http://schemas.microsoft.com/office/drawing/2010/main" val="0"/>
+                              </a:ext>
+                            </a:extLst>
+                          </a:blip>
+                          <a:srcRect/>
+                          <a:stretch>
+                            <a:fillRect/>
+                          </a:stretch>
+                        </pic:blipFill>
+                        <pic:spPr bwMode="auto">
+                          <a:xfrm>
+                            <a:off x="0" y="0"/>
+                            <a:ext cx="420000" cy="285945"/>
+                          </a:xfrm>
+                          <a:prstGeom prst="rect">
+                            <a:avLst/>
+                          </a:prstGeom>
+                          <a:noFill/>
+                          <a:ln>
+                            <a:noFill/>
+                          </a:ln>
+                        </pic:spPr>
+                      </pic:pic>
+                    </a:graphicData>
+                  </a:graphic>
+                </wp:inline>
+              </w:drawing>
+            </w:r>
+          </w:p>
+        </w:tc>
+        <w:tc>
+          <w:tcPr>
+            <w:tcW w:w="1793" w:type="dxa"/>
+            <w:tcBorders>
+              <w:top w:val="single" w:sz="8" w:space="0" w:color="000000"/>
+              <w:left w:val="nil"/>
+              <w:bottom w:val="single" w:sz="8" w:space="0" w:color="000000"/>
+              <w:right w:val="single" w:sz="8" w:space="0" w:color="000000"/>
+            </w:tcBorders>
+            <w:shd w:val="clear" w:color="auto" w:fill="CCFFFF"/>
+            <w:tcMar>
+              <w:top w:w="30" w:type="dxa"/>
+              <w:left w:w="30" w:type="dxa"/>
+              <w:bottom w:w="30" w:type="dxa"/>
+              <w:right w:w="30" w:type="dxa"/>
+            </w:tcMar>
+            <w:vAlign w:val="center"/>
+          </w:tcPr>
+          <w:p>
+            <w:pPr>
+              <w:spacing w:before="0" w:after="0"/>
+              <w:jc w:val="left"/>
+              <w:rPr>
+                <w:rFonts w:ascii="Arial" w:hAnsi="Arial" w:cs="Arial"/>
+                <w:sz w:val="18"/>
+                <w:szCs w:val="18"/>
+              </w:rPr>
+            </w:pPr>
+            <w:r>
+              <w:rPr>
+                <w:rFonts w:ascii="Arial" w:hAnsi="Arial" w:cs="Arial" w:eastAsia="Arial"/>
+                <w:b/>
+                <w:bCs/>
+                <w:sz w:val="17"/>
+                <w:szCs w:val="17"/>
+                <w:lang w:val="en-GB"/>
+              </w:rPr>
+              <w:t xml:space="preserve">Excavations</w:t>
+            </w:r>
+          </w:p>
+        </w:tc>
+        <w:tc>
+          <w:tcPr>
+            <w:tcW w:w="700" w:type="dxa"/>
+            <w:tcBorders>
+              <w:top w:val="single" w:sz="8" w:space="0" w:color="000000"/>
+              <w:left w:val="single" w:sz="8" w:space="0" w:color="000000"/>
+              <w:bottom w:val="single" w:sz="8" w:space="0" w:color="000000"/>
+              <w:right w:val="nil"/>
+            </w:tcBorders>
+            <w:shd w:val="clear" w:color="auto" w:fill="CCFFFF"/>
+            <w:tcMar>
+              <w:top w:w="30" w:type="dxa"/>
+              <w:left w:w="30" w:type="dxa"/>
+              <w:bottom w:w="30" w:type="dxa"/>
+              <w:right w:w="0" w:type="dxa"/>
+            </w:tcMar>
+            <w:vAlign w:val="center"/>
+          </w:tcPr>
+          <w:p>
+            <w:pPr>
+              <w:spacing w:before="0" w:after="0"/>
+              <w:jc w:val="center"/>
+              <w:rPr>
+                <w:rFonts w:ascii="Arial" w:hAnsi="Arial" w:cs="Arial"/>
+                <w:sz w:val="18"/>
+                <w:szCs w:val="18"/>
+              </w:rPr>
+            </w:pPr>
+            <w:r>
+              <w:drawing xmlns:w="http://schemas.openxmlformats.org/wordprocessingml/2006/main" xmlns:wpc="http://schemas.microsoft.com/office/word/2010/wordprocessingCanvas" xmlns:cx="http://schemas.microsoft.com/office/drawing/2014/chartex" xmlns:cx1="http://schemas.microsoft.com/office/drawing/2015/9/8/chartex" xmlns:cx2="http://schemas.microsoft.com/office/drawing/2015/10/21/chartex" xmlns:cx3="http://schemas.microsoft.com/office/drawing/2016/5/9/chartex" xmlns:cx4="http://schemas.microsoft.com/office/drawing/2016/5/10/chartex" xmlns:cx5="http://schemas.microsoft.com/office/drawing/2016/5/11/chartex" xmlns:cx6="http://schemas.microsoft.com/office/drawing/2016/5/12/chartex" xmlns:cx7="http://schemas.microsoft.com/office/drawing/2016/5/13/chartex" xmlns:cx8="http://schemas.microsoft.com/office/drawing/2016/5/14/chartex" xmlns:mc="http://schemas.openxmlformats.org/markup-compatibility/2006" xmlns:aink="http://schemas.microsoft.com/office/drawing/2016/ink" xmlns:am3d="http://schemas.microsoft.com/office/drawing/2017/model3d" xmlns:o="urn:schemas-microsoft-com:office:office" xmlns:oel="http://schemas.microsoft.com/office/2019/extlst" xmlns:r="http://schemas.openxmlformats.org/officeDocument/2006/relationships" xmlns:m="http://schemas.openxmlformats.org/officeDocument/2006/math" xmlns:v="urn:schemas-microsoft-com:vml" xmlns:wp14="http://schemas.microsoft.com/office/word/2010/wordprocessingDrawing" xmlns:wp="http://schemas.openxmlformats.org/drawingml/2006/wordprocessingDrawing" xmlns:w10="urn:schemas-microsoft-com:office:word" xmlns:w14="http://schemas.microsoft.com/office/word/2010/wordml" xmlns:w15="http://schemas.microsoft.com/office/word/2012/wordml" xmlns:w16cex="http://schemas.microsoft.com/office/word/2018/wordml/cex" xmlns:w16cid="http://schemas.microsoft.com/office/word/2016/wordml/cid" xmlns:w16="http://schemas.microsoft.com/office/word/2018/wordml" xmlns:w16sdtdh="http://schemas.microsoft.com/office/word/2020/wordml/sdtdatahash" xmlns:w16se="http://schemas.microsoft.com/office/word/2015/wordml/symex" xmlns:wpg="http://schemas.microsoft.com/office/word/2010/wordprocessingGroup" xmlns:wpi="http://schemas.microsoft.com/office/word/2010/wordprocessingInk" xmlns:wne="http://schemas.microsoft.com/office/word/2006/wordml" xmlns:wps="http://schemas.microsoft.com/office/word/2010/wordprocessingShape">
+                <wp:inline distT="0" distB="0" distL="0" distR="0" wp14:anchorId="38C0C02B" wp14:editId="559908B0">
+                  <wp:extent cx="238125" cy="315595"/>
+                  <wp:effectExtent l="0" t="0" r="0" b="0"/>
+                  <wp:docPr id="338782499" name="Picture 24" descr="ladder"/>
+                  <wp:cNvGraphicFramePr>
+                    <a:graphicFrameLocks xmlns:a="http://schemas.openxmlformats.org/drawingml/2006/main" noChangeAspect="1"/>
+                  </wp:cNvGraphicFramePr>
+                  <a:graphic xmlns:a="http://schemas.openxmlformats.org/drawingml/2006/main">
+                    <a:graphicData uri="http://schemas.openxmlformats.org/drawingml/2006/picture">
+                      <pic:pic xmlns:pic="http://schemas.openxmlformats.org/drawingml/2006/picture">
+                        <pic:nvPicPr>
+                          <pic:cNvPr id="0" name="Picture 24" descr="ladder"/>
+                          <pic:cNvPicPr>
+                            <a:picLocks noChangeAspect="1" noChangeArrowheads="1"/>
+                          </pic:cNvPicPr>
+                        </pic:nvPicPr>
+                        <pic:blipFill>
+                          <a:blip r:embed="rId21">
+                            <a:extLst>
+                              <a:ext uri="{28A0092B-C50C-407E-A947-70E740481C1C}">
+                                <a14:useLocalDpi xmlns:a14="http://schemas.microsoft.com/office/drawing/2010/main" val="0"/>
+                              </a:ext>
+                            </a:extLst>
+                          </a:blip>
+                          <a:srcRect/>
+                          <a:stretch>
+                            <a:fillRect/>
+                          </a:stretch>
+                        </pic:blipFill>
+                        <pic:spPr bwMode="auto">
+                          <a:xfrm>
+                            <a:off x="0" y="0"/>
+                            <a:ext cx="238125" cy="315595"/>
+                          </a:xfrm>
+                          <a:prstGeom prst="rect">
+                            <a:avLst/>
+                          </a:prstGeom>
+                          <a:noFill/>
+                          <a:ln>
+                            <a:noFill/>
+                          </a:ln>
+                        </pic:spPr>
+                      </pic:pic>
+                    </a:graphicData>
+                  </a:graphic>
+                </wp:inline>
+              </w:drawing>
+            </w:r>
+          </w:p>
+        </w:tc>
+        <w:tc>
+          <w:tcPr>
+            <w:tcW w:w="1793" w:type="dxa"/>
+            <w:tcBorders>
+              <w:top w:val="single" w:sz="8" w:space="0" w:color="000000"/>
+              <w:left w:val="nil"/>
+              <w:bottom w:val="single" w:sz="8" w:space="0" w:color="000000"/>
+              <w:right w:val="single" w:sz="8" w:space="0" w:color="000000"/>
+            </w:tcBorders>
+            <w:shd w:val="clear" w:color="auto" w:fill="CCFFFF"/>
+            <w:tcMar>
+              <w:top w:w="30" w:type="dxa"/>
+              <w:left w:w="30" w:type="dxa"/>
+              <w:bottom w:w="30" w:type="dxa"/>
+              <w:right w:w="30" w:type="dxa"/>
+            </w:tcMar>
+            <w:vAlign w:val="center"/>
+          </w:tcPr>
+          <w:p>
+            <w:pPr>
+              <w:spacing w:before="0" w:after="0"/>
+              <w:jc w:val="left"/>
+              <w:rPr>
+                <w:rFonts w:ascii="Arial" w:hAnsi="Arial" w:cs="Arial"/>
+                <w:sz w:val="18"/>
+                <w:szCs w:val="18"/>
+              </w:rPr>
+            </w:pPr>
+            <w:r>
+              <w:rPr>
+                <w:rFonts w:ascii="Arial" w:hAnsi="Arial" w:cs="Arial" w:eastAsia="Arial"/>
+                <w:b/>
+                <w:bCs/>
+                <w:sz w:val="17"/>
+                <w:szCs w:val="17"/>
+                <w:lang w:val="en-GB"/>
+              </w:rPr>
+              <w:t xml:space="preserve">Fall from Height</w:t>
+            </w:r>
+          </w:p>
+        </w:tc>
+        <w:tc>
+          <w:tcPr>
+            <w:tcW w:w="700" w:type="dxa"/>
+            <w:tcBorders>
+              <w:top w:val="single" w:sz="8" w:space="0" w:color="000000"/>
+              <w:left w:val="single" w:sz="8" w:space="0" w:color="000000"/>
+              <w:bottom w:val="single" w:sz="8" w:space="0" w:color="000000"/>
+              <w:right w:val="nil"/>
+            </w:tcBorders>
+            <w:shd w:val="clear" w:color="auto" w:fill="CCFFFF"/>
+            <w:tcMar>
+              <w:top w:w="30" w:type="dxa"/>
+              <w:left w:w="30" w:type="dxa"/>
+              <w:bottom w:w="30" w:type="dxa"/>
+              <w:right w:w="0" w:type="dxa"/>
+            </w:tcMar>
+            <w:vAlign w:val="center"/>
+          </w:tcPr>
+          <w:p>
+            <w:pPr>
+              <w:spacing w:before="0" w:after="0"/>
+              <w:jc w:val="center"/>
+              <w:rPr>
+                <w:rFonts w:ascii="Arial" w:hAnsi="Arial" w:cs="Arial"/>
+                <w:sz w:val="18"/>
+                <w:szCs w:val="18"/>
+              </w:rPr>
+            </w:pPr>
+            <w:r>
+              <w:drawing xmlns:w="http://schemas.openxmlformats.org/wordprocessingml/2006/main" xmlns:wpc="http://schemas.microsoft.com/office/word/2010/wordprocessingCanvas" xmlns:cx="http://schemas.microsoft.com/office/drawing/2014/chartex" xmlns:cx1="http://schemas.microsoft.com/office/drawing/2015/9/8/chartex" xmlns:cx2="http://schemas.microsoft.com/office/drawing/2015/10/21/chartex" xmlns:cx3="http://schemas.microsoft.com/office/drawing/2016/5/9/chartex" xmlns:cx4="http://schemas.microsoft.com/office/drawing/2016/5/10/chartex" xmlns:cx5="http://schemas.microsoft.com/office/drawing/2016/5/11/chartex" xmlns:cx6="http://schemas.microsoft.com/office/drawing/2016/5/12/chartex" xmlns:cx7="http://schemas.microsoft.com/office/drawing/2016/5/13/chartex" xmlns:cx8="http://schemas.microsoft.com/office/drawing/2016/5/14/chartex" xmlns:mc="http://schemas.openxmlformats.org/markup-compatibility/2006" xmlns:aink="http://schemas.microsoft.com/office/drawing/2016/ink" xmlns:am3d="http://schemas.microsoft.com/office/drawing/2017/model3d" xmlns:o="urn:schemas-microsoft-com:office:office" xmlns:oel="http://schemas.microsoft.com/office/2019/extlst" xmlns:r="http://schemas.openxmlformats.org/officeDocument/2006/relationships" xmlns:m="http://schemas.openxmlformats.org/officeDocument/2006/math" xmlns:v="urn:schemas-microsoft-com:vml" xmlns:wp14="http://schemas.microsoft.com/office/word/2010/wordprocessingDrawing" xmlns:wp="http://schemas.openxmlformats.org/drawingml/2006/wordprocessingDrawing" xmlns:w10="urn:schemas-microsoft-com:office:word" xmlns:w14="http://schemas.microsoft.com/office/word/2010/wordml" xmlns:w15="http://schemas.microsoft.com/office/word/2012/wordml" xmlns:w16cex="http://schemas.microsoft.com/office/word/2018/wordml/cex" xmlns:w16cid="http://schemas.microsoft.com/office/word/2016/wordml/cid" xmlns:w16="http://schemas.microsoft.com/office/word/2018/wordml" xmlns:w16sdtdh="http://schemas.microsoft.com/office/word/2020/wordml/sdtdatahash" xmlns:w16se="http://schemas.microsoft.com/office/word/2015/wordml/symex" xmlns:wpg="http://schemas.microsoft.com/office/word/2010/wordprocessingGroup" xmlns:wpi="http://schemas.microsoft.com/office/word/2010/wordprocessingInk" xmlns:wne="http://schemas.microsoft.com/office/word/2006/wordml" xmlns:wps="http://schemas.microsoft.com/office/word/2010/wordprocessingShape">
+                <wp:inline distT="0" distB="0" distL="0" distR="0" wp14:anchorId="6AEF2452" wp14:editId="73515C91">
+                  <wp:extent cx="295910" cy="334645"/>
+                  <wp:effectExtent l="0" t="0" r="0" b="0"/>
+                  <wp:docPr id="1147440802" name="Picture 1147440802" descr="poor light"/>
+                  <wp:cNvGraphicFramePr>
+                    <a:graphicFrameLocks xmlns:a="http://schemas.openxmlformats.org/drawingml/2006/main" noChangeAspect="1"/>
+                  </wp:cNvGraphicFramePr>
+                  <a:graphic xmlns:a="http://schemas.openxmlformats.org/drawingml/2006/main">
+                    <a:graphicData uri="http://schemas.openxmlformats.org/drawingml/2006/picture">
+                      <pic:pic xmlns:pic="http://schemas.openxmlformats.org/drawingml/2006/picture">
+                        <pic:nvPicPr>
+                          <pic:cNvPr id="0" name="Picture 18" descr="poor light"/>
+                          <pic:cNvPicPr>
+                            <a:picLocks noChangeAspect="1" noChangeArrowheads="1"/>
+                          </pic:cNvPicPr>
+                        </pic:nvPicPr>
+                        <pic:blipFill>
+                          <a:blip r:embed="rId22">
+                            <a:extLst>
+                              <a:ext uri="{28A0092B-C50C-407E-A947-70E740481C1C}">
+                                <a14:useLocalDpi xmlns:a14="http://schemas.microsoft.com/office/drawing/2010/main" val="0"/>
+                              </a:ext>
+                            </a:extLst>
+                          </a:blip>
+                          <a:srcRect/>
+                          <a:stretch>
+                            <a:fillRect/>
+                          </a:stretch>
+                        </pic:blipFill>
+                        <pic:spPr bwMode="auto">
+                          <a:xfrm>
+                            <a:off x="0" y="0"/>
+                            <a:ext cx="295910" cy="334645"/>
+                          </a:xfrm>
+                          <a:prstGeom prst="rect">
+                            <a:avLst/>
+                          </a:prstGeom>
+                          <a:noFill/>
+                          <a:ln>
+                            <a:noFill/>
+                          </a:ln>
+                        </pic:spPr>
+                      </pic:pic>
+                    </a:graphicData>
+                  </a:graphic>
+                </wp:inline>
+              </w:drawing>
+            </w:r>
+          </w:p>
+        </w:tc>
+        <w:tc>
+          <w:tcPr>
+            <w:tcW w:w="1793" w:type="dxa"/>
+            <w:tcBorders>
+              <w:top w:val="single" w:sz="8" w:space="0" w:color="000000"/>
+              <w:left w:val="nil"/>
+              <w:bottom w:val="single" w:sz="8" w:space="0" w:color="000000"/>
+              <w:right w:val="single" w:sz="8" w:space="0" w:color="000000"/>
+            </w:tcBorders>
+            <w:shd w:val="clear" w:color="auto" w:fill="CCFFFF"/>
+            <w:tcMar>
+              <w:top w:w="30" w:type="dxa"/>
+              <w:left w:w="30" w:type="dxa"/>
+              <w:bottom w:w="30" w:type="dxa"/>
+              <w:right w:w="30" w:type="dxa"/>
+            </w:tcMar>
+            <w:vAlign w:val="center"/>
+          </w:tcPr>
+          <w:p>
+            <w:pPr>
+              <w:spacing w:before="0" w:after="0"/>
+              <w:jc w:val="left"/>
+              <w:rPr>
+                <w:rFonts w:ascii="Arial" w:hAnsi="Arial" w:cs="Arial"/>
+                <w:sz w:val="18"/>
+                <w:szCs w:val="18"/>
+              </w:rPr>
+            </w:pPr>
+            <w:r>
+              <w:rPr>
+                <w:rFonts w:ascii="Arial" w:hAnsi="Arial" w:cs="Arial" w:eastAsia="Arial"/>
+                <w:b/>
+                <w:bCs/>
+                <w:sz w:val="17"/>
+                <w:szCs w:val="17"/>
+                <w:lang w:val="en-GB"/>
+              </w:rPr>
+              <w:t xml:space="preserve">Poor Lighting / visibility</w:t>
+            </w:r>
+          </w:p>
+        </w:tc>
+      </w:tr>
+      <w:tr>
+        <w:trPr>
+          <w:cantSplit/>
+          <w:trHeight w:val="620" w:hRule="atLeast"/>
+        </w:trPr>
+        <w:tc>
+          <w:tcPr>
+            <w:tcW w:w="700" w:type="dxa"/>
+            <w:tcBorders>
+              <w:top w:val="single" w:sz="8" w:space="0" w:color="000000"/>
+              <w:left w:val="single" w:sz="8" w:space="0" w:color="000000"/>
+              <w:bottom w:val="single" w:sz="8" w:space="0" w:color="000000"/>
+              <w:right w:val="nil"/>
+            </w:tcBorders>
+            <w:shd w:val="clear" w:color="auto" w:fill="CCFFFF"/>
+            <w:tcMar>
+              <w:top w:w="30" w:type="dxa"/>
+              <w:left w:w="30" w:type="dxa"/>
+              <w:bottom w:w="30" w:type="dxa"/>
+              <w:right w:w="0" w:type="dxa"/>
+            </w:tcMar>
+            <w:vAlign w:val="center"/>
+          </w:tcPr>
+          <w:p>
+            <w:pPr>
+              <w:spacing w:before="0" w:after="0"/>
+              <w:jc w:val="center"/>
+              <w:rPr>
+                <w:rFonts w:ascii="Arial" w:hAnsi="Arial" w:cs="Arial"/>
+                <w:sz w:val="18"/>
+                <w:szCs w:val="18"/>
+              </w:rPr>
+            </w:pPr>
+            <w:r>
+              <w:drawing xmlns:w="http://schemas.openxmlformats.org/wordprocessingml/2006/main" xmlns:wpc="http://schemas.microsoft.com/office/word/2010/wordprocessingCanvas" xmlns:cx="http://schemas.microsoft.com/office/drawing/2014/chartex" xmlns:cx1="http://schemas.microsoft.com/office/drawing/2015/9/8/chartex" xmlns:cx2="http://schemas.microsoft.com/office/drawing/2015/10/21/chartex" xmlns:cx3="http://schemas.microsoft.com/office/drawing/2016/5/9/chartex" xmlns:cx4="http://schemas.microsoft.com/office/drawing/2016/5/10/chartex" xmlns:cx5="http://schemas.microsoft.com/office/drawing/2016/5/11/chartex" xmlns:cx6="http://schemas.microsoft.com/office/drawing/2016/5/12/chartex" xmlns:cx7="http://schemas.microsoft.com/office/drawing/2016/5/13/chartex" xmlns:cx8="http://schemas.microsoft.com/office/drawing/2016/5/14/chartex" xmlns:mc="http://schemas.openxmlformats.org/markup-compatibility/2006" xmlns:aink="http://schemas.microsoft.com/office/drawing/2016/ink" xmlns:am3d="http://schemas.microsoft.com/office/drawing/2017/model3d" xmlns:o="urn:schemas-microsoft-com:office:office" xmlns:oel="http://schemas.microsoft.com/office/2019/extlst" xmlns:r="http://schemas.openxmlformats.org/officeDocument/2006/relationships" xmlns:m="http://schemas.openxmlformats.org/officeDocument/2006/math" xmlns:v="urn:schemas-microsoft-com:vml" xmlns:wp14="http://schemas.microsoft.com/office/word/2010/wordprocessingDrawing" xmlns:wp="http://schemas.openxmlformats.org/drawingml/2006/wordprocessingDrawing" xmlns:w10="urn:schemas-microsoft-com:office:word" xmlns:w14="http://schemas.microsoft.com/office/word/2010/wordml" xmlns:w15="http://schemas.microsoft.com/office/word/2012/wordml" xmlns:w16cex="http://schemas.microsoft.com/office/word/2018/wordml/cex" xmlns:w16cid="http://schemas.microsoft.com/office/word/2016/wordml/cid" xmlns:w16="http://schemas.microsoft.com/office/word/2018/wordml" xmlns:w16sdtdh="http://schemas.microsoft.com/office/word/2020/wordml/sdtdatahash" xmlns:w16se="http://schemas.microsoft.com/office/word/2015/wordml/symex" xmlns:wpg="http://schemas.microsoft.com/office/word/2010/wordprocessingGroup" xmlns:wpi="http://schemas.microsoft.com/office/word/2010/wordprocessingInk" xmlns:wne="http://schemas.microsoft.com/office/word/2006/wordml" xmlns:wps="http://schemas.microsoft.com/office/word/2010/wordprocessingShape">
+                <wp:inline distT="0" distB="0" distL="0" distR="0" wp14:anchorId="13590D68" wp14:editId="5A640374">
+                  <wp:extent cx="334645" cy="334645"/>
+                  <wp:effectExtent l="0" t="0" r="0" b="0"/>
+                  <wp:docPr id="1837694344" name="Picture 9" descr="tool"/>
+                  <wp:cNvGraphicFramePr>
+                    <a:graphicFrameLocks xmlns:a="http://schemas.openxmlformats.org/drawingml/2006/main" noChangeAspect="1"/>
+                  </wp:cNvGraphicFramePr>
+                  <a:graphic xmlns:a="http://schemas.openxmlformats.org/drawingml/2006/main">
+                    <a:graphicData uri="http://schemas.openxmlformats.org/drawingml/2006/picture">
+                      <pic:pic xmlns:pic="http://schemas.openxmlformats.org/drawingml/2006/picture">
+                        <pic:nvPicPr>
+                          <pic:cNvPr id="0" name="Picture 9" descr="tool"/>
+                          <pic:cNvPicPr>
+                            <a:picLocks noChangeAspect="1" noChangeArrowheads="1"/>
+                          </pic:cNvPicPr>
+                        </pic:nvPicPr>
+                        <pic:blipFill>
+                          <a:blip r:embed="rId23">
+                            <a:extLst>
+                              <a:ext uri="{28A0092B-C50C-407E-A947-70E740481C1C}">
+                                <a14:useLocalDpi xmlns:a14="http://schemas.microsoft.com/office/drawing/2010/main" val="0"/>
+                              </a:ext>
+                            </a:extLst>
+                          </a:blip>
+                          <a:srcRect/>
+                          <a:stretch>
+                            <a:fillRect/>
+                          </a:stretch>
+                        </pic:blipFill>
+                        <pic:spPr bwMode="auto">
+                          <a:xfrm>
+                            <a:off x="0" y="0"/>
+                            <a:ext cx="334645" cy="334645"/>
+                          </a:xfrm>
+                          <a:prstGeom prst="rect">
+                            <a:avLst/>
+                          </a:prstGeom>
+                          <a:noFill/>
+                          <a:ln>
+                            <a:noFill/>
+                          </a:ln>
+                        </pic:spPr>
+                      </pic:pic>
+                    </a:graphicData>
+                  </a:graphic>
+                </wp:inline>
+              </w:drawing>
+            </w:r>
+          </w:p>
+        </w:tc>
+        <w:tc>
+          <w:tcPr>
+            <w:tcW w:w="1793" w:type="dxa"/>
+            <w:tcBorders>
+              <w:top w:val="single" w:sz="8" w:space="0" w:color="000000"/>
+              <w:left w:val="nil"/>
+              <w:bottom w:val="single" w:sz="8" w:space="0" w:color="000000"/>
+              <w:right w:val="single" w:sz="8" w:space="0" w:color="000000"/>
+            </w:tcBorders>
+            <w:shd w:val="clear" w:color="auto" w:fill="CCFFFF"/>
+            <w:tcMar>
+              <w:top w:w="30" w:type="dxa"/>
+              <w:left w:w="30" w:type="dxa"/>
+              <w:bottom w:w="30" w:type="dxa"/>
+              <w:right w:w="30" w:type="dxa"/>
+            </w:tcMar>
+            <w:vAlign w:val="center"/>
+          </w:tcPr>
+          <w:p>
+            <w:pPr>
+              <w:spacing w:before="0" w:after="0"/>
+              <w:jc w:val="left"/>
+              <w:rPr>
+                <w:rFonts w:ascii="Arial" w:hAnsi="Arial" w:cs="Arial"/>
+                <w:sz w:val="18"/>
+                <w:szCs w:val="18"/>
+              </w:rPr>
+            </w:pPr>
+            <w:r>
+              <w:rPr>
+                <w:rFonts w:ascii="Arial" w:hAnsi="Arial" w:cs="Arial" w:eastAsia="Arial"/>
+                <w:b/>
+                <w:bCs/>
+                <w:sz w:val="17"/>
+                <w:szCs w:val="17"/>
+                <w:lang w:val="en-GB"/>
+              </w:rPr>
+              <w:t xml:space="preserve">Improper/Defective Equipment &amp; Tools</w:t>
+            </w:r>
+          </w:p>
+        </w:tc>
+        <w:tc>
+          <w:tcPr>
+            <w:tcW w:w="700" w:type="dxa"/>
+            <w:tcBorders>
+              <w:top w:val="single" w:sz="8" w:space="0" w:color="000000"/>
+              <w:left w:val="single" w:sz="8" w:space="0" w:color="000000"/>
+              <w:bottom w:val="single" w:sz="8" w:space="0" w:color="000000"/>
+              <w:right w:val="nil"/>
+            </w:tcBorders>
+            <w:shd w:val="clear" w:color="auto" w:fill="CCFFFF"/>
+            <w:tcMar>
+              <w:top w:w="30" w:type="dxa"/>
+              <w:left w:w="30" w:type="dxa"/>
+              <w:bottom w:w="30" w:type="dxa"/>
+              <w:right w:w="0" w:type="dxa"/>
+            </w:tcMar>
+            <w:vAlign w:val="center"/>
+          </w:tcPr>
+          <w:p>
+            <w:pPr>
+              <w:spacing w:before="0" w:after="0"/>
+              <w:jc w:val="center"/>
+              <w:rPr>
+                <w:rFonts w:ascii="Arial" w:hAnsi="Arial" w:cs="Arial"/>
+                <w:sz w:val="18"/>
+                <w:szCs w:val="18"/>
+              </w:rPr>
+            </w:pPr>
+            <w:r>
+              <w:drawing xmlns:w="http://schemas.openxmlformats.org/wordprocessingml/2006/main" xmlns:wpc="http://schemas.microsoft.com/office/word/2010/wordprocessingCanvas" xmlns:cx="http://schemas.microsoft.com/office/drawing/2014/chartex" xmlns:cx1="http://schemas.microsoft.com/office/drawing/2015/9/8/chartex" xmlns:cx2="http://schemas.microsoft.com/office/drawing/2015/10/21/chartex" xmlns:cx3="http://schemas.microsoft.com/office/drawing/2016/5/9/chartex" xmlns:cx4="http://schemas.microsoft.com/office/drawing/2016/5/10/chartex" xmlns:cx5="http://schemas.microsoft.com/office/drawing/2016/5/11/chartex" xmlns:cx6="http://schemas.microsoft.com/office/drawing/2016/5/12/chartex" xmlns:cx7="http://schemas.microsoft.com/office/drawing/2016/5/13/chartex" xmlns:cx8="http://schemas.microsoft.com/office/drawing/2016/5/14/chartex" xmlns:mc="http://schemas.openxmlformats.org/markup-compatibility/2006" xmlns:aink="http://schemas.microsoft.com/office/drawing/2016/ink" xmlns:am3d="http://schemas.microsoft.com/office/drawing/2017/model3d" xmlns:o="urn:schemas-microsoft-com:office:office" xmlns:oel="http://schemas.microsoft.com/office/2019/extlst" xmlns:r="http://schemas.openxmlformats.org/officeDocument/2006/relationships" xmlns:m="http://schemas.openxmlformats.org/officeDocument/2006/math" xmlns:v="urn:schemas-microsoft-com:vml" xmlns:wp14="http://schemas.microsoft.com/office/word/2010/wordprocessingDrawing" xmlns:wp="http://schemas.openxmlformats.org/drawingml/2006/wordprocessingDrawing" xmlns:w10="urn:schemas-microsoft-com:office:word" xmlns:w14="http://schemas.microsoft.com/office/word/2010/wordml" xmlns:w15="http://schemas.microsoft.com/office/word/2012/wordml" xmlns:w16cex="http://schemas.microsoft.com/office/word/2018/wordml/cex" xmlns:w16cid="http://schemas.microsoft.com/office/word/2016/wordml/cid" xmlns:w16="http://schemas.microsoft.com/office/word/2018/wordml" xmlns:w16sdtdh="http://schemas.microsoft.com/office/word/2020/wordml/sdtdatahash" xmlns:w16se="http://schemas.microsoft.com/office/word/2015/wordml/symex" xmlns:wpg="http://schemas.microsoft.com/office/word/2010/wordprocessingGroup" xmlns:wpi="http://schemas.microsoft.com/office/word/2010/wordprocessingInk" xmlns:wne="http://schemas.microsoft.com/office/word/2006/wordml" xmlns:wps="http://schemas.microsoft.com/office/word/2010/wordprocessingShape">
+                <wp:inline distT="0" distB="0" distL="0" distR="0" wp14:anchorId="49E56D94" wp14:editId="01A9AAF3">
+                  <wp:extent cx="302895" cy="334645"/>
+                  <wp:effectExtent l="0" t="0" r="0" b="0"/>
+                  <wp:docPr id="184704102" name="Picture 10" descr="manual hand"/>
+                  <wp:cNvGraphicFramePr>
+                    <a:graphicFrameLocks xmlns:a="http://schemas.openxmlformats.org/drawingml/2006/main" noChangeAspect="1"/>
+                  </wp:cNvGraphicFramePr>
+                  <a:graphic xmlns:a="http://schemas.openxmlformats.org/drawingml/2006/main">
+                    <a:graphicData uri="http://schemas.openxmlformats.org/drawingml/2006/picture">
+                      <pic:pic xmlns:pic="http://schemas.openxmlformats.org/drawingml/2006/picture">
+                        <pic:nvPicPr>
+                          <pic:cNvPr id="0" name="Picture 10" descr="manual hand"/>
+                          <pic:cNvPicPr>
+                            <a:picLocks noChangeAspect="1" noChangeArrowheads="1"/>
+                          </pic:cNvPicPr>
+                        </pic:nvPicPr>
+                        <pic:blipFill>
+                          <a:blip r:embed="rId24">
+                            <a:extLst>
+                              <a:ext uri="{28A0092B-C50C-407E-A947-70E740481C1C}">
+                                <a14:useLocalDpi xmlns:a14="http://schemas.microsoft.com/office/drawing/2010/main" val="0"/>
+                              </a:ext>
+                            </a:extLst>
+                          </a:blip>
+                          <a:srcRect/>
+                          <a:stretch>
+                            <a:fillRect/>
+                          </a:stretch>
+                        </pic:blipFill>
+                        <pic:spPr bwMode="auto">
+                          <a:xfrm>
+                            <a:off x="0" y="0"/>
+                            <a:ext cx="302895" cy="334645"/>
+                          </a:xfrm>
+                          <a:prstGeom prst="rect">
+                            <a:avLst/>
+                          </a:prstGeom>
+                          <a:noFill/>
+                          <a:ln>
+                            <a:noFill/>
+                          </a:ln>
+                        </pic:spPr>
+                      </pic:pic>
+                    </a:graphicData>
+                  </a:graphic>
+                </wp:inline>
+              </w:drawing>
+            </w:r>
+          </w:p>
+        </w:tc>
+        <w:tc>
+          <w:tcPr>
+            <w:tcW w:w="1793" w:type="dxa"/>
+            <w:tcBorders>
+              <w:top w:val="single" w:sz="8" w:space="0" w:color="000000"/>
+              <w:left w:val="nil"/>
+              <w:bottom w:val="single" w:sz="8" w:space="0" w:color="000000"/>
+              <w:right w:val="single" w:sz="8" w:space="0" w:color="000000"/>
+            </w:tcBorders>
+            <w:shd w:val="clear" w:color="auto" w:fill="CCFFFF"/>
+            <w:tcMar>
+              <w:top w:w="30" w:type="dxa"/>
+              <w:left w:w="30" w:type="dxa"/>
+              <w:bottom w:w="30" w:type="dxa"/>
+              <w:right w:w="30" w:type="dxa"/>
+            </w:tcMar>
+            <w:vAlign w:val="center"/>
+          </w:tcPr>
+          <w:p>
+            <w:pPr>
+              <w:spacing w:before="0" w:after="0"/>
+              <w:jc w:val="left"/>
+              <w:rPr>
+                <w:rFonts w:ascii="Arial" w:hAnsi="Arial" w:cs="Arial"/>
+                <w:sz w:val="18"/>
+                <w:szCs w:val="18"/>
+              </w:rPr>
+            </w:pPr>
+            <w:r>
+              <w:rPr>
+                <w:rFonts w:ascii="Arial" w:hAnsi="Arial" w:cs="Arial" w:eastAsia="Arial"/>
+                <w:b/>
+                <w:bCs/>
+                <w:sz w:val="17"/>
+                <w:szCs w:val="17"/>
+                <w:lang w:val="en-GB"/>
+              </w:rPr>
+              <w:t xml:space="preserve">Improper Manual Handling</w:t>
+            </w:r>
+          </w:p>
+        </w:tc>
+        <w:tc>
+          <w:tcPr>
+            <w:tcW w:w="700" w:type="dxa"/>
+            <w:tcBorders>
+              <w:top w:val="single" w:sz="8" w:space="0" w:color="000000"/>
+              <w:left w:val="single" w:sz="8" w:space="0" w:color="000000"/>
+              <w:bottom w:val="single" w:sz="8" w:space="0" w:color="000000"/>
+              <w:right w:val="nil"/>
+            </w:tcBorders>
+            <w:shd w:val="clear" w:color="auto" w:fill="CCFFFF"/>
+            <w:tcMar>
+              <w:top w:w="30" w:type="dxa"/>
+              <w:left w:w="30" w:type="dxa"/>
+              <w:bottom w:w="30" w:type="dxa"/>
+              <w:right w:w="0" w:type="dxa"/>
+            </w:tcMar>
+            <w:vAlign w:val="center"/>
+          </w:tcPr>
+          <w:p>
+            <w:pPr>
+              <w:spacing w:before="0" w:after="0"/>
+              <w:jc w:val="center"/>
+              <w:rPr>
+                <w:rFonts w:ascii="Arial" w:hAnsi="Arial" w:cs="Arial"/>
+                <w:sz w:val="18"/>
+                <w:szCs w:val="18"/>
+              </w:rPr>
+            </w:pPr>
+            <w:r>
+              <w:drawing xmlns:w="http://schemas.openxmlformats.org/wordprocessingml/2006/main" xmlns:wpc="http://schemas.microsoft.com/office/word/2010/wordprocessingCanvas" xmlns:cx="http://schemas.microsoft.com/office/drawing/2014/chartex" xmlns:cx1="http://schemas.microsoft.com/office/drawing/2015/9/8/chartex" xmlns:cx2="http://schemas.microsoft.com/office/drawing/2015/10/21/chartex" xmlns:cx3="http://schemas.microsoft.com/office/drawing/2016/5/9/chartex" xmlns:cx4="http://schemas.microsoft.com/office/drawing/2016/5/10/chartex" xmlns:cx5="http://schemas.microsoft.com/office/drawing/2016/5/11/chartex" xmlns:cx6="http://schemas.microsoft.com/office/drawing/2016/5/12/chartex" xmlns:cx7="http://schemas.microsoft.com/office/drawing/2016/5/13/chartex" xmlns:cx8="http://schemas.microsoft.com/office/drawing/2016/5/14/chartex" xmlns:mc="http://schemas.openxmlformats.org/markup-compatibility/2006" xmlns:aink="http://schemas.microsoft.com/office/drawing/2016/ink" xmlns:am3d="http://schemas.microsoft.com/office/drawing/2017/model3d" xmlns:o="urn:schemas-microsoft-com:office:office" xmlns:oel="http://schemas.microsoft.com/office/2019/extlst" xmlns:r="http://schemas.openxmlformats.org/officeDocument/2006/relationships" xmlns:m="http://schemas.openxmlformats.org/officeDocument/2006/math" xmlns:v="urn:schemas-microsoft-com:vml" xmlns:wp14="http://schemas.microsoft.com/office/word/2010/wordprocessingDrawing" xmlns:wp="http://schemas.openxmlformats.org/drawingml/2006/wordprocessingDrawing" xmlns:w10="urn:schemas-microsoft-com:office:word" xmlns:w14="http://schemas.microsoft.com/office/word/2010/wordml" xmlns:w15="http://schemas.microsoft.com/office/word/2012/wordml" xmlns:w16cex="http://schemas.microsoft.com/office/word/2018/wordml/cex" xmlns:w16cid="http://schemas.microsoft.com/office/word/2016/wordml/cid" xmlns:w16="http://schemas.microsoft.com/office/word/2018/wordml" xmlns:w16sdtdh="http://schemas.microsoft.com/office/word/2020/wordml/sdtdatahash" xmlns:w16se="http://schemas.microsoft.com/office/word/2015/wordml/symex" xmlns:wpg="http://schemas.microsoft.com/office/word/2010/wordprocessingGroup" xmlns:wpi="http://schemas.microsoft.com/office/word/2010/wordprocessingInk" xmlns:wne="http://schemas.microsoft.com/office/word/2006/wordml" xmlns:wps="http://schemas.microsoft.com/office/word/2010/wordprocessingShape">
+                <wp:inline distT="0" distB="0" distL="0" distR="0" wp14:anchorId="650FDA22" wp14:editId="2C302A7D">
+                  <wp:extent cx="334645" cy="334645"/>
+                  <wp:effectExtent l="0" t="0" r="0" b="0"/>
+                  <wp:docPr id="95202537" name="Picture 11" descr="fall"/>
+                  <wp:cNvGraphicFramePr>
+                    <a:graphicFrameLocks xmlns:a="http://schemas.openxmlformats.org/drawingml/2006/main" noChangeAspect="1"/>
+                  </wp:cNvGraphicFramePr>
+                  <a:graphic xmlns:a="http://schemas.openxmlformats.org/drawingml/2006/main">
+                    <a:graphicData uri="http://schemas.openxmlformats.org/drawingml/2006/picture">
+                      <pic:pic xmlns:pic="http://schemas.openxmlformats.org/drawingml/2006/picture">
+                        <pic:nvPicPr>
+                          <pic:cNvPr id="0" name="Picture 11" descr="fall"/>
+                          <pic:cNvPicPr>
+                            <a:picLocks noChangeAspect="1" noChangeArrowheads="1"/>
+                          </pic:cNvPicPr>
+                        </pic:nvPicPr>
+                        <pic:blipFill>
+                          <a:blip r:embed="rId25">
+                            <a:extLst>
+                              <a:ext uri="{28A0092B-C50C-407E-A947-70E740481C1C}">
+                                <a14:useLocalDpi xmlns:a14="http://schemas.microsoft.com/office/drawing/2010/main" val="0"/>
+                              </a:ext>
+                            </a:extLst>
+                          </a:blip>
+                          <a:srcRect/>
+                          <a:stretch>
+                            <a:fillRect/>
+                          </a:stretch>
+                        </pic:blipFill>
+                        <pic:spPr bwMode="auto">
+                          <a:xfrm>
+                            <a:off x="0" y="0"/>
+                            <a:ext cx="334645" cy="334645"/>
+                          </a:xfrm>
+                          <a:prstGeom prst="rect">
+                            <a:avLst/>
+                          </a:prstGeom>
+                          <a:noFill/>
+                          <a:ln>
+                            <a:noFill/>
+                          </a:ln>
+                        </pic:spPr>
+                      </pic:pic>
+                    </a:graphicData>
+                  </a:graphic>
+                </wp:inline>
+              </w:drawing>
+            </w:r>
+          </w:p>
+        </w:tc>
+        <w:tc>
+          <w:tcPr>
+            <w:tcW w:w="1793" w:type="dxa"/>
+            <w:tcBorders>
+              <w:top w:val="single" w:sz="8" w:space="0" w:color="000000"/>
+              <w:left w:val="nil"/>
+              <w:bottom w:val="single" w:sz="8" w:space="0" w:color="000000"/>
+              <w:right w:val="single" w:sz="8" w:space="0" w:color="000000"/>
+            </w:tcBorders>
+            <w:shd w:val="clear" w:color="auto" w:fill="CCFFFF"/>
+            <w:tcMar>
+              <w:top w:w="30" w:type="dxa"/>
+              <w:left w:w="30" w:type="dxa"/>
+              <w:bottom w:w="30" w:type="dxa"/>
+              <w:right w:w="30" w:type="dxa"/>
+            </w:tcMar>
+            <w:vAlign w:val="center"/>
+          </w:tcPr>
+          <w:p>
+            <w:pPr>
+              <w:spacing w:before="0" w:after="0"/>
+              <w:jc w:val="left"/>
+              <w:rPr>
+                <w:rFonts w:ascii="Arial" w:hAnsi="Arial" w:cs="Arial"/>
+                <w:sz w:val="18"/>
+                <w:szCs w:val="18"/>
+              </w:rPr>
+            </w:pPr>
+            <w:r>
+              <w:rPr>
+                <w:rFonts w:ascii="Arial" w:hAnsi="Arial" w:cs="Arial" w:eastAsia="Arial"/>
+                <w:b/>
+                <w:bCs/>
+                <w:sz w:val="17"/>
+                <w:szCs w:val="17"/>
+                <w:lang w:val="en-GB"/>
+              </w:rPr>
+              <w:t xml:space="preserve">Falling/Dropped Object</w:t>
+            </w:r>
+          </w:p>
+        </w:tc>
+        <w:tc>
+          <w:tcPr>
+            <w:tcW w:w="700" w:type="dxa"/>
+            <w:tcBorders>
+              <w:top w:val="single" w:sz="8" w:space="0" w:color="000000"/>
+              <w:left w:val="single" w:sz="8" w:space="0" w:color="000000"/>
+              <w:bottom w:val="single" w:sz="8" w:space="0" w:color="000000"/>
+              <w:right w:val="nil"/>
+            </w:tcBorders>
+            <w:shd w:val="clear" w:color="auto" w:fill="CCFFFF"/>
+            <w:tcMar>
+              <w:top w:w="30" w:type="dxa"/>
+              <w:left w:w="30" w:type="dxa"/>
+              <w:bottom w:w="30" w:type="dxa"/>
+              <w:right w:w="0" w:type="dxa"/>
+            </w:tcMar>
+            <w:vAlign w:val="center"/>
+          </w:tcPr>
+          <w:p>
+            <w:pPr>
+              <w:spacing w:before="0" w:after="0"/>
+              <w:jc w:val="center"/>
+              <w:rPr>
+                <w:rFonts w:ascii="Arial" w:hAnsi="Arial" w:cs="Arial"/>
+                <w:sz w:val="18"/>
+                <w:szCs w:val="18"/>
+              </w:rPr>
+            </w:pPr>
+            <w:r>
+              <w:drawing xmlns:w="http://schemas.openxmlformats.org/wordprocessingml/2006/main" xmlns:wpc="http://schemas.microsoft.com/office/word/2010/wordprocessingCanvas" xmlns:cx="http://schemas.microsoft.com/office/drawing/2014/chartex" xmlns:cx1="http://schemas.microsoft.com/office/drawing/2015/9/8/chartex" xmlns:cx2="http://schemas.microsoft.com/office/drawing/2015/10/21/chartex" xmlns:cx3="http://schemas.microsoft.com/office/drawing/2016/5/9/chartex" xmlns:cx4="http://schemas.microsoft.com/office/drawing/2016/5/10/chartex" xmlns:cx5="http://schemas.microsoft.com/office/drawing/2016/5/11/chartex" xmlns:cx6="http://schemas.microsoft.com/office/drawing/2016/5/12/chartex" xmlns:cx7="http://schemas.microsoft.com/office/drawing/2016/5/13/chartex" xmlns:cx8="http://schemas.microsoft.com/office/drawing/2016/5/14/chartex" xmlns:mc="http://schemas.openxmlformats.org/markup-compatibility/2006" xmlns:aink="http://schemas.microsoft.com/office/drawing/2016/ink" xmlns:am3d="http://schemas.microsoft.com/office/drawing/2017/model3d" xmlns:o="urn:schemas-microsoft-com:office:office" xmlns:oel="http://schemas.microsoft.com/office/2019/extlst" xmlns:r="http://schemas.openxmlformats.org/officeDocument/2006/relationships" xmlns:m="http://schemas.openxmlformats.org/officeDocument/2006/math" xmlns:v="urn:schemas-microsoft-com:vml" xmlns:wp14="http://schemas.microsoft.com/office/word/2010/wordprocessingDrawing" xmlns:wp="http://schemas.openxmlformats.org/drawingml/2006/wordprocessingDrawing" xmlns:w10="urn:schemas-microsoft-com:office:word" xmlns:w14="http://schemas.microsoft.com/office/word/2010/wordml" xmlns:w15="http://schemas.microsoft.com/office/word/2012/wordml" xmlns:w16cex="http://schemas.microsoft.com/office/word/2018/wordml/cex" xmlns:w16cid="http://schemas.microsoft.com/office/word/2016/wordml/cid" xmlns:w16="http://schemas.microsoft.com/office/word/2018/wordml" xmlns:w16sdtdh="http://schemas.microsoft.com/office/word/2020/wordml/sdtdatahash" xmlns:w16se="http://schemas.microsoft.com/office/word/2015/wordml/symex" xmlns:wpg="http://schemas.microsoft.com/office/word/2010/wordprocessingGroup" xmlns:wpi="http://schemas.microsoft.com/office/word/2010/wordprocessingInk" xmlns:wne="http://schemas.microsoft.com/office/word/2006/wordml" xmlns:wps="http://schemas.microsoft.com/office/word/2010/wordprocessingShape">
+                <wp:inline distT="0" distB="0" distL="0" distR="0" wp14:anchorId="4EDABE13" wp14:editId="38BAAF60">
+                  <wp:extent cx="283210" cy="321945"/>
+                  <wp:effectExtent l="0" t="0" r="0" b="0"/>
+                  <wp:docPr id="1817350202" name="Picture 12" descr="img4d08b36abe62d"/>
+                  <wp:cNvGraphicFramePr>
+                    <a:graphicFrameLocks xmlns:a="http://schemas.openxmlformats.org/drawingml/2006/main" noChangeAspect="1"/>
+                  </wp:cNvGraphicFramePr>
+                  <a:graphic xmlns:a="http://schemas.openxmlformats.org/drawingml/2006/main">
+                    <a:graphicData uri="http://schemas.openxmlformats.org/drawingml/2006/picture">
+                      <pic:pic xmlns:pic="http://schemas.openxmlformats.org/drawingml/2006/picture">
+                        <pic:nvPicPr>
+                          <pic:cNvPr id="0" name="Picture 12" descr="img4d08b36abe62d"/>
+                          <pic:cNvPicPr>
+                            <a:picLocks noChangeAspect="1" noChangeArrowheads="1"/>
+                          </pic:cNvPicPr>
+                        </pic:nvPicPr>
+                        <pic:blipFill>
+                          <a:blip r:embed="rId26">
+                            <a:clrChange>
+                              <a:clrFrom>
+                                <a:srgbClr val="FFFFFF"/>
+                              </a:clrFrom>
+                              <a:clrTo>
+                                <a:srgbClr val="FFFFFF">
+                                  <a:alpha val="0"/>
+                                </a:srgbClr>
+                              </a:clrTo>
+                            </a:clrChange>
+                            <a:extLst>
+                              <a:ext uri="{28A0092B-C50C-407E-A947-70E740481C1C}">
+                                <a14:useLocalDpi xmlns:a14="http://schemas.microsoft.com/office/drawing/2010/main" val="0"/>
+                              </a:ext>
+                            </a:extLst>
+                          </a:blip>
+                          <a:srcRect/>
+                          <a:stretch>
+                            <a:fillRect/>
+                          </a:stretch>
+                        </pic:blipFill>
+                        <pic:spPr bwMode="auto">
+                          <a:xfrm>
+                            <a:off x="0" y="0"/>
+                            <a:ext cx="283210" cy="321945"/>
+                          </a:xfrm>
+                          <a:prstGeom prst="rect">
+                            <a:avLst/>
+                          </a:prstGeom>
+                          <a:noFill/>
+                          <a:ln>
+                            <a:noFill/>
+                          </a:ln>
+                        </pic:spPr>
+                      </pic:pic>
+                    </a:graphicData>
+                  </a:graphic>
+                </wp:inline>
+              </w:drawing>
+            </w:r>
+          </w:p>
+        </w:tc>
+        <w:tc>
+          <w:tcPr>
+            <w:tcW w:w="1793" w:type="dxa"/>
+            <w:tcBorders>
+              <w:top w:val="single" w:sz="8" w:space="0" w:color="000000"/>
+              <w:left w:val="nil"/>
+              <w:bottom w:val="single" w:sz="8" w:space="0" w:color="000000"/>
+              <w:right w:val="single" w:sz="8" w:space="0" w:color="000000"/>
+            </w:tcBorders>
+            <w:shd w:val="clear" w:color="auto" w:fill="CCFFFF"/>
+            <w:tcMar>
+              <w:top w:w="30" w:type="dxa"/>
+              <w:left w:w="30" w:type="dxa"/>
+              <w:bottom w:w="30" w:type="dxa"/>
+              <w:right w:w="30" w:type="dxa"/>
+            </w:tcMar>
+            <w:vAlign w:val="center"/>
+          </w:tcPr>
+          <w:p>
+            <w:pPr>
+              <w:spacing w:before="0" w:after="0"/>
+              <w:jc w:val="left"/>
+              <w:rPr>
+                <w:rFonts w:ascii="Arial" w:hAnsi="Arial" w:cs="Arial"/>
+                <w:sz w:val="18"/>
+                <w:szCs w:val="18"/>
+              </w:rPr>
+            </w:pPr>
+            <w:r>
+              <w:rPr>
+                <w:rFonts w:ascii="Arial" w:hAnsi="Arial" w:cs="Arial" w:eastAsia="Arial"/>
+                <w:b/>
+                <w:bCs/>
+                <w:sz w:val="17"/>
+                <w:szCs w:val="17"/>
+                <w:lang w:val="en-GB"/>
+              </w:rPr>
+              <w:t xml:space="preserve">Interface with Vehicle</w:t>
+            </w:r>
+          </w:p>
+        </w:tc>
+        <w:tc>
+          <w:tcPr>
+            <w:tcW w:w="700" w:type="dxa"/>
+            <w:tcBorders>
+              <w:top w:val="single" w:sz="8" w:space="0" w:color="000000"/>
+              <w:left w:val="single" w:sz="8" w:space="0" w:color="000000"/>
+              <w:bottom w:val="single" w:sz="8" w:space="0" w:color="000000"/>
+              <w:right w:val="nil"/>
+            </w:tcBorders>
+            <w:shd w:val="clear" w:color="auto" w:fill="CCFFFF"/>
+            <w:tcMar>
+              <w:top w:w="30" w:type="dxa"/>
+              <w:left w:w="30" w:type="dxa"/>
+              <w:bottom w:w="30" w:type="dxa"/>
+              <w:right w:w="0" w:type="dxa"/>
+            </w:tcMar>
+            <w:vAlign w:val="center"/>
+          </w:tcPr>
+          <w:p>
+            <w:pPr>
+              <w:spacing w:before="0" w:after="0"/>
+              <w:jc w:val="center"/>
+              <w:rPr>
+                <w:rFonts w:ascii="Arial" w:hAnsi="Arial" w:cs="Arial"/>
+                <w:sz w:val="18"/>
+                <w:szCs w:val="18"/>
+              </w:rPr>
+            </w:pPr>
+            <w:r>
+              <w:drawing xmlns:w="http://schemas.openxmlformats.org/wordprocessingml/2006/main" xmlns:wpc="http://schemas.microsoft.com/office/word/2010/wordprocessingCanvas" xmlns:cx="http://schemas.microsoft.com/office/drawing/2014/chartex" xmlns:cx1="http://schemas.microsoft.com/office/drawing/2015/9/8/chartex" xmlns:cx2="http://schemas.microsoft.com/office/drawing/2015/10/21/chartex" xmlns:cx3="http://schemas.microsoft.com/office/drawing/2016/5/9/chartex" xmlns:cx4="http://schemas.microsoft.com/office/drawing/2016/5/10/chartex" xmlns:cx5="http://schemas.microsoft.com/office/drawing/2016/5/11/chartex" xmlns:cx6="http://schemas.microsoft.com/office/drawing/2016/5/12/chartex" xmlns:cx7="http://schemas.microsoft.com/office/drawing/2016/5/13/chartex" xmlns:cx8="http://schemas.microsoft.com/office/drawing/2016/5/14/chartex" xmlns:mc="http://schemas.openxmlformats.org/markup-compatibility/2006" xmlns:aink="http://schemas.microsoft.com/office/drawing/2016/ink" xmlns:am3d="http://schemas.microsoft.com/office/drawing/2017/model3d" xmlns:o="urn:schemas-microsoft-com:office:office" xmlns:oel="http://schemas.microsoft.com/office/2019/extlst" xmlns:r="http://schemas.openxmlformats.org/officeDocument/2006/relationships" xmlns:m="http://schemas.openxmlformats.org/officeDocument/2006/math" xmlns:v="urn:schemas-microsoft-com:vml" xmlns:wp14="http://schemas.microsoft.com/office/word/2010/wordprocessingDrawing" xmlns:wp="http://schemas.openxmlformats.org/drawingml/2006/wordprocessingDrawing" xmlns:w10="urn:schemas-microsoft-com:office:word" xmlns:w14="http://schemas.microsoft.com/office/word/2010/wordml" xmlns:w15="http://schemas.microsoft.com/office/word/2012/wordml" xmlns:w16cex="http://schemas.microsoft.com/office/word/2018/wordml/cex" xmlns:w16cid="http://schemas.microsoft.com/office/word/2016/wordml/cid" xmlns:w16="http://schemas.microsoft.com/office/word/2018/wordml" xmlns:w16sdtdh="http://schemas.microsoft.com/office/word/2020/wordml/sdtdatahash" xmlns:w16se="http://schemas.microsoft.com/office/word/2015/wordml/symex" xmlns:wpg="http://schemas.microsoft.com/office/word/2010/wordprocessingGroup" xmlns:wpi="http://schemas.microsoft.com/office/word/2010/wordprocessingInk" xmlns:wne="http://schemas.microsoft.com/office/word/2006/wordml" xmlns:wps="http://schemas.microsoft.com/office/word/2010/wordprocessingShape">
+                <wp:inline distT="0" distB="0" distL="0" distR="0" wp14:anchorId="6CE6D2DC" wp14:editId="6E342BB8">
+                  <wp:extent cx="334645" cy="334645"/>
+                  <wp:effectExtent l="0" t="0" r="0" b="0"/>
+                  <wp:docPr id="1058850469" name="Picture 27" descr="lift"/>
+                  <wp:cNvGraphicFramePr>
+                    <a:graphicFrameLocks xmlns:a="http://schemas.openxmlformats.org/drawingml/2006/main" noChangeAspect="1"/>
+                  </wp:cNvGraphicFramePr>
+                  <a:graphic xmlns:a="http://schemas.openxmlformats.org/drawingml/2006/main">
+                    <a:graphicData uri="http://schemas.openxmlformats.org/drawingml/2006/picture">
+                      <pic:pic xmlns:pic="http://schemas.openxmlformats.org/drawingml/2006/picture">
+                        <pic:nvPicPr>
+                          <pic:cNvPr id="0" name="Picture 27" descr="lift"/>
+                          <pic:cNvPicPr>
+                            <a:picLocks noChangeAspect="1" noChangeArrowheads="1"/>
+                          </pic:cNvPicPr>
+                        </pic:nvPicPr>
+                        <pic:blipFill>
+                          <a:blip r:embed="rId27">
+                            <a:extLst>
+                              <a:ext uri="{28A0092B-C50C-407E-A947-70E740481C1C}">
+                                <a14:useLocalDpi xmlns:a14="http://schemas.microsoft.com/office/drawing/2010/main" val="0"/>
+                              </a:ext>
+                            </a:extLst>
+                          </a:blip>
+                          <a:srcRect/>
+                          <a:stretch>
+                            <a:fillRect/>
+                          </a:stretch>
+                        </pic:blipFill>
+                        <pic:spPr bwMode="auto">
+                          <a:xfrm>
+                            <a:off x="0" y="0"/>
+                            <a:ext cx="334645" cy="334645"/>
+                          </a:xfrm>
+                          <a:prstGeom prst="rect">
+                            <a:avLst/>
+                          </a:prstGeom>
+                          <a:noFill/>
+                          <a:ln>
+                            <a:noFill/>
+                          </a:ln>
+                        </pic:spPr>
+                      </pic:pic>
+                    </a:graphicData>
+                  </a:graphic>
+                </wp:inline>
+              </w:drawing>
+            </w:r>
+          </w:p>
+        </w:tc>
+        <w:tc>
+          <w:tcPr>
+            <w:tcW w:w="1793" w:type="dxa"/>
+            <w:tcBorders>
+              <w:top w:val="single" w:sz="8" w:space="0" w:color="000000"/>
+              <w:left w:val="nil"/>
+              <w:bottom w:val="single" w:sz="8" w:space="0" w:color="000000"/>
+              <w:right w:val="single" w:sz="8" w:space="0" w:color="000000"/>
+            </w:tcBorders>
+            <w:shd w:val="clear" w:color="auto" w:fill="CCFFFF"/>
+            <w:tcMar>
+              <w:top w:w="30" w:type="dxa"/>
+              <w:left w:w="30" w:type="dxa"/>
+              <w:bottom w:w="30" w:type="dxa"/>
+              <w:right w:w="30" w:type="dxa"/>
+            </w:tcMar>
+            <w:vAlign w:val="center"/>
+          </w:tcPr>
+          <w:p>
+            <w:pPr>
+              <w:spacing w:before="0" w:after="0"/>
+              <w:jc w:val="left"/>
+              <w:rPr>
+                <w:rFonts w:ascii="Arial" w:hAnsi="Arial" w:cs="Arial"/>
+                <w:sz w:val="18"/>
+                <w:szCs w:val="18"/>
+              </w:rPr>
+            </w:pPr>
+            <w:r>
+              <w:rPr>
+                <w:rFonts w:ascii="Arial" w:hAnsi="Arial" w:cs="Arial" w:eastAsia="Arial"/>
+                <w:b/>
+                <w:bCs/>
+                <w:sz w:val="17"/>
+                <w:szCs w:val="17"/>
+                <w:lang w:val="en-GB"/>
+              </w:rPr>
+              <w:t xml:space="preserve">Poor Condition/improper use of Lifting Gear</w:t>
+            </w:r>
+          </w:p>
+        </w:tc>
+        <w:tc>
+          <w:tcPr>
+            <w:tcW w:w="700" w:type="dxa"/>
+            <w:tcBorders>
+              <w:top w:val="single" w:sz="8" w:space="0" w:color="000000"/>
+              <w:left w:val="single" w:sz="8" w:space="0" w:color="000000"/>
+              <w:bottom w:val="single" w:sz="8" w:space="0" w:color="000000"/>
+              <w:right w:val="nil"/>
+            </w:tcBorders>
+            <w:shd w:val="clear" w:color="auto" w:fill="CCFFFF"/>
+            <w:tcMar>
+              <w:top w:w="30" w:type="dxa"/>
+              <w:left w:w="30" w:type="dxa"/>
+              <w:bottom w:w="30" w:type="dxa"/>
+              <w:right w:w="0" w:type="dxa"/>
+            </w:tcMar>
+            <w:vAlign w:val="center"/>
+          </w:tcPr>
+          <w:p>
+            <w:pPr>
+              <w:spacing w:before="0" w:after="0"/>
+              <w:jc w:val="center"/>
+              <w:rPr>
+                <w:rFonts w:ascii="Arial" w:hAnsi="Arial" w:cs="Arial"/>
+                <w:sz w:val="18"/>
+                <w:szCs w:val="18"/>
+              </w:rPr>
+            </w:pPr>
+            <w:r>
+              <w:drawing xmlns:w="http://schemas.openxmlformats.org/wordprocessingml/2006/main" xmlns:wpc="http://schemas.microsoft.com/office/word/2010/wordprocessingCanvas" xmlns:cx="http://schemas.microsoft.com/office/drawing/2014/chartex" xmlns:cx1="http://schemas.microsoft.com/office/drawing/2015/9/8/chartex" xmlns:cx2="http://schemas.microsoft.com/office/drawing/2015/10/21/chartex" xmlns:cx3="http://schemas.microsoft.com/office/drawing/2016/5/9/chartex" xmlns:cx4="http://schemas.microsoft.com/office/drawing/2016/5/10/chartex" xmlns:cx5="http://schemas.microsoft.com/office/drawing/2016/5/11/chartex" xmlns:cx6="http://schemas.microsoft.com/office/drawing/2016/5/12/chartex" xmlns:cx7="http://schemas.microsoft.com/office/drawing/2016/5/13/chartex" xmlns:cx8="http://schemas.microsoft.com/office/drawing/2016/5/14/chartex" xmlns:mc="http://schemas.openxmlformats.org/markup-compatibility/2006" xmlns:aink="http://schemas.microsoft.com/office/drawing/2016/ink" xmlns:am3d="http://schemas.microsoft.com/office/drawing/2017/model3d" xmlns:o="urn:schemas-microsoft-com:office:office" xmlns:oel="http://schemas.microsoft.com/office/2019/extlst" xmlns:r="http://schemas.openxmlformats.org/officeDocument/2006/relationships" xmlns:m="http://schemas.openxmlformats.org/officeDocument/2006/math" xmlns:v="urn:schemas-microsoft-com:vml" xmlns:wp14="http://schemas.microsoft.com/office/word/2010/wordprocessingDrawing" xmlns:wp="http://schemas.openxmlformats.org/drawingml/2006/wordprocessingDrawing" xmlns:w10="urn:schemas-microsoft-com:office:word" xmlns:w14="http://schemas.microsoft.com/office/word/2010/wordml" xmlns:w15="http://schemas.microsoft.com/office/word/2012/wordml" xmlns:w16cex="http://schemas.microsoft.com/office/word/2018/wordml/cex" xmlns:w16cid="http://schemas.microsoft.com/office/word/2016/wordml/cid" xmlns:w16="http://schemas.microsoft.com/office/word/2018/wordml" xmlns:w16sdtdh="http://schemas.microsoft.com/office/word/2020/wordml/sdtdatahash" xmlns:w16se="http://schemas.microsoft.com/office/word/2015/wordml/symex" xmlns:wpg="http://schemas.microsoft.com/office/word/2010/wordprocessingGroup" xmlns:wpi="http://schemas.microsoft.com/office/word/2010/wordprocessingInk" xmlns:wne="http://schemas.microsoft.com/office/word/2006/wordml" xmlns:wps="http://schemas.microsoft.com/office/word/2010/wordprocessingShape">
+                <wp:inline distT="0" distB="0" distL="0" distR="0" wp14:anchorId="627E1DF7" wp14:editId="1B506AC5">
+                  <wp:extent cx="295910" cy="334645"/>
+                  <wp:effectExtent l="0" t="0" r="0" b="0"/>
+                  <wp:docPr id="1769617072" name="Picture 29" descr="vib"/>
+                  <wp:cNvGraphicFramePr>
+                    <a:graphicFrameLocks xmlns:a="http://schemas.openxmlformats.org/drawingml/2006/main" noChangeAspect="1"/>
+                  </wp:cNvGraphicFramePr>
+                  <a:graphic xmlns:a="http://schemas.openxmlformats.org/drawingml/2006/main">
+                    <a:graphicData uri="http://schemas.openxmlformats.org/drawingml/2006/picture">
+                      <pic:pic xmlns:pic="http://schemas.openxmlformats.org/drawingml/2006/picture">
+                        <pic:nvPicPr>
+                          <pic:cNvPr id="0" name="Picture 29" descr="vib"/>
+                          <pic:cNvPicPr>
+                            <a:picLocks noChangeAspect="1" noChangeArrowheads="1"/>
+                          </pic:cNvPicPr>
+                        </pic:nvPicPr>
+                        <pic:blipFill>
+                          <a:blip r:embed="rId28">
+                            <a:extLst>
+                              <a:ext uri="{28A0092B-C50C-407E-A947-70E740481C1C}">
+                                <a14:useLocalDpi xmlns:a14="http://schemas.microsoft.com/office/drawing/2010/main" val="0"/>
+                              </a:ext>
+                            </a:extLst>
+                          </a:blip>
+                          <a:srcRect/>
+                          <a:stretch>
+                            <a:fillRect/>
+                          </a:stretch>
+                        </pic:blipFill>
+                        <pic:spPr bwMode="auto">
+                          <a:xfrm>
+                            <a:off x="0" y="0"/>
+                            <a:ext cx="295910" cy="334645"/>
+                          </a:xfrm>
+                          <a:prstGeom prst="rect">
+                            <a:avLst/>
+                          </a:prstGeom>
+                          <a:noFill/>
+                          <a:ln>
+                            <a:noFill/>
+                          </a:ln>
+                        </pic:spPr>
+                      </pic:pic>
+                    </a:graphicData>
+                  </a:graphic>
+                </wp:inline>
+              </w:drawing>
+            </w:r>
+          </w:p>
+        </w:tc>
+        <w:tc>
+          <w:tcPr>
+            <w:tcW w:w="1793" w:type="dxa"/>
+            <w:tcBorders>
+              <w:top w:val="single" w:sz="8" w:space="0" w:color="000000"/>
+              <w:left w:val="nil"/>
+              <w:bottom w:val="single" w:sz="8" w:space="0" w:color="000000"/>
+              <w:right w:val="single" w:sz="8" w:space="0" w:color="000000"/>
+            </w:tcBorders>
+            <w:shd w:val="clear" w:color="auto" w:fill="CCFFFF"/>
+            <w:tcMar>
+              <w:top w:w="30" w:type="dxa"/>
+              <w:left w:w="30" w:type="dxa"/>
+              <w:bottom w:w="30" w:type="dxa"/>
+              <w:right w:w="30" w:type="dxa"/>
+            </w:tcMar>
+            <w:vAlign w:val="center"/>
+          </w:tcPr>
+          <w:p>
+            <w:pPr>
+              <w:spacing w:before="0" w:after="0"/>
+              <w:jc w:val="left"/>
+              <w:rPr>
+                <w:rFonts w:ascii="Arial" w:hAnsi="Arial" w:cs="Arial"/>
+                <w:sz w:val="18"/>
+                <w:szCs w:val="18"/>
+              </w:rPr>
+            </w:pPr>
+            <w:r>
+              <w:rPr>
+                <w:rFonts w:ascii="Arial" w:hAnsi="Arial" w:cs="Arial" w:eastAsia="Arial"/>
+                <w:b/>
+                <w:bCs/>
+                <w:sz w:val="17"/>
+                <w:szCs w:val="17"/>
+                <w:lang w:val="en-GB"/>
+              </w:rPr>
+              <w:t xml:space="preserve">Vibrating Equipment</w:t>
+            </w:r>
+          </w:p>
+        </w:tc>
+      </w:tr>
+      <w:tr>
+        <w:trPr>
+          <w:cantSplit/>
+          <w:trHeight w:val="620" w:hRule="atLeast"/>
+        </w:trPr>
+        <w:tc>
+          <w:tcPr>
+            <w:tcW w:w="700" w:type="dxa"/>
+            <w:tcBorders>
+              <w:top w:val="single" w:sz="8" w:space="0" w:color="000000"/>
+              <w:left w:val="single" w:sz="8" w:space="0" w:color="000000"/>
+              <w:bottom w:val="single" w:sz="8" w:space="0" w:color="000000"/>
+              <w:right w:val="nil"/>
+            </w:tcBorders>
+            <w:shd w:val="clear" w:color="auto" w:fill="CCFFFF"/>
+            <w:tcMar>
+              <w:top w:w="30" w:type="dxa"/>
+              <w:left w:w="30" w:type="dxa"/>
+              <w:bottom w:w="30" w:type="dxa"/>
+              <w:right w:w="0" w:type="dxa"/>
+            </w:tcMar>
+            <w:vAlign w:val="center"/>
+          </w:tcPr>
+          <w:p>
+            <w:pPr>
+              <w:spacing w:before="0" w:after="0"/>
+              <w:jc w:val="center"/>
+              <w:rPr>
+                <w:rFonts w:ascii="Arial" w:hAnsi="Arial" w:cs="Arial"/>
+                <w:sz w:val="18"/>
+                <w:szCs w:val="18"/>
+              </w:rPr>
+            </w:pPr>
+            <w:r>
+              <w:drawing xmlns:w="http://schemas.openxmlformats.org/wordprocessingml/2006/main" xmlns:wpc="http://schemas.microsoft.com/office/word/2010/wordprocessingCanvas" xmlns:cx="http://schemas.microsoft.com/office/drawing/2014/chartex" xmlns:cx1="http://schemas.microsoft.com/office/drawing/2015/9/8/chartex" xmlns:cx2="http://schemas.microsoft.com/office/drawing/2015/10/21/chartex" xmlns:cx3="http://schemas.microsoft.com/office/drawing/2016/5/9/chartex" xmlns:cx4="http://schemas.microsoft.com/office/drawing/2016/5/10/chartex" xmlns:cx5="http://schemas.microsoft.com/office/drawing/2016/5/11/chartex" xmlns:cx6="http://schemas.microsoft.com/office/drawing/2016/5/12/chartex" xmlns:cx7="http://schemas.microsoft.com/office/drawing/2016/5/13/chartex" xmlns:cx8="http://schemas.microsoft.com/office/drawing/2016/5/14/chartex" xmlns:mc="http://schemas.openxmlformats.org/markup-compatibility/2006" xmlns:aink="http://schemas.microsoft.com/office/drawing/2016/ink" xmlns:am3d="http://schemas.microsoft.com/office/drawing/2017/model3d" xmlns:o="urn:schemas-microsoft-com:office:office" xmlns:oel="http://schemas.microsoft.com/office/2019/extlst" xmlns:r="http://schemas.openxmlformats.org/officeDocument/2006/relationships" xmlns:m="http://schemas.openxmlformats.org/officeDocument/2006/math" xmlns:v="urn:schemas-microsoft-com:vml" xmlns:wp14="http://schemas.microsoft.com/office/word/2010/wordprocessingDrawing" xmlns:wp="http://schemas.openxmlformats.org/drawingml/2006/wordprocessingDrawing" xmlns:w10="urn:schemas-microsoft-com:office:word" xmlns:w14="http://schemas.microsoft.com/office/word/2010/wordml" xmlns:w15="http://schemas.microsoft.com/office/word/2012/wordml" xmlns:w16cex="http://schemas.microsoft.com/office/word/2018/wordml/cex" xmlns:w16cid="http://schemas.microsoft.com/office/word/2016/wordml/cid" xmlns:w16="http://schemas.microsoft.com/office/word/2018/wordml" xmlns:w16sdtdh="http://schemas.microsoft.com/office/word/2020/wordml/sdtdatahash" xmlns:w16se="http://schemas.microsoft.com/office/word/2015/wordml/symex" xmlns:wpg="http://schemas.microsoft.com/office/word/2010/wordprocessingGroup" xmlns:wpi="http://schemas.microsoft.com/office/word/2010/wordprocessingInk" xmlns:wne="http://schemas.microsoft.com/office/word/2006/wordml" xmlns:wps="http://schemas.microsoft.com/office/word/2010/wordprocessingShape">
+                <wp:inline distT="0" distB="0" distL="0" distR="0" wp14:anchorId="771CB977" wp14:editId="24040963">
+                  <wp:extent cx="354330" cy="321945"/>
+                  <wp:effectExtent l="0" t="0" r="0" b="0"/>
+                  <wp:docPr id="850671330" name="Picture 13" descr="slip"/>
+                  <wp:cNvGraphicFramePr>
+                    <a:graphicFrameLocks xmlns:a="http://schemas.openxmlformats.org/drawingml/2006/main" noChangeAspect="1"/>
+                  </wp:cNvGraphicFramePr>
+                  <a:graphic xmlns:a="http://schemas.openxmlformats.org/drawingml/2006/main">
+                    <a:graphicData uri="http://schemas.openxmlformats.org/drawingml/2006/picture">
+                      <pic:pic xmlns:pic="http://schemas.openxmlformats.org/drawingml/2006/picture">
+                        <pic:nvPicPr>
+                          <pic:cNvPr id="0" name="Picture 13" descr="slip"/>
+                          <pic:cNvPicPr>
+                            <a:picLocks noChangeAspect="1" noChangeArrowheads="1"/>
+                          </pic:cNvPicPr>
+                        </pic:nvPicPr>
+                        <pic:blipFill>
+                          <a:blip r:embed="rId29">
+                            <a:extLst>
+                              <a:ext uri="{28A0092B-C50C-407E-A947-70E740481C1C}">
+                                <a14:useLocalDpi xmlns:a14="http://schemas.microsoft.com/office/drawing/2010/main" val="0"/>
+                              </a:ext>
+                            </a:extLst>
+                          </a:blip>
+                          <a:srcRect/>
+                          <a:stretch>
+                            <a:fillRect/>
+                          </a:stretch>
+                        </pic:blipFill>
+                        <pic:spPr bwMode="auto">
+                          <a:xfrm>
+                            <a:off x="0" y="0"/>
+                            <a:ext cx="354330" cy="321945"/>
+                          </a:xfrm>
+                          <a:prstGeom prst="rect">
+                            <a:avLst/>
+                          </a:prstGeom>
+                          <a:noFill/>
+                          <a:ln>
+                            <a:noFill/>
+                          </a:ln>
+                        </pic:spPr>
+                      </pic:pic>
+                    </a:graphicData>
+                  </a:graphic>
+                </wp:inline>
+              </w:drawing>
+            </w:r>
+          </w:p>
+        </w:tc>
+        <w:tc>
+          <w:tcPr>
+            <w:tcW w:w="1793" w:type="dxa"/>
+            <w:tcBorders>
+              <w:top w:val="single" w:sz="8" w:space="0" w:color="000000"/>
+              <w:left w:val="nil"/>
+              <w:bottom w:val="single" w:sz="8" w:space="0" w:color="000000"/>
+              <w:right w:val="single" w:sz="8" w:space="0" w:color="000000"/>
+            </w:tcBorders>
+            <w:shd w:val="clear" w:color="auto" w:fill="CCFFFF"/>
+            <w:tcMar>
+              <w:top w:w="30" w:type="dxa"/>
+              <w:left w:w="30" w:type="dxa"/>
+              <w:bottom w:w="30" w:type="dxa"/>
+              <w:right w:w="30" w:type="dxa"/>
+            </w:tcMar>
+            <w:vAlign w:val="center"/>
+          </w:tcPr>
+          <w:p>
+            <w:pPr>
+              <w:spacing w:before="0" w:after="0"/>
+              <w:jc w:val="left"/>
+              <w:rPr>
+                <w:rFonts w:ascii="Arial" w:hAnsi="Arial" w:cs="Arial"/>
+                <w:sz w:val="18"/>
+                <w:szCs w:val="18"/>
+              </w:rPr>
+            </w:pPr>
+            <w:r>
+              <w:rPr>
+                <w:rFonts w:ascii="Arial" w:hAnsi="Arial" w:cs="Arial" w:eastAsia="Arial"/>
+                <w:b/>
+                <w:bCs/>
+                <w:sz w:val="17"/>
+                <w:szCs w:val="17"/>
+                <w:lang w:val="en-GB"/>
+              </w:rPr>
+              <w:t xml:space="preserve">Slips, Trips &amp; Falls</w:t>
+            </w:r>
+          </w:p>
+        </w:tc>
+        <w:tc>
+          <w:tcPr>
+            <w:tcW w:w="700" w:type="dxa"/>
+            <w:tcBorders>
+              <w:top w:val="single" w:sz="8" w:space="0" w:color="000000"/>
+              <w:left w:val="single" w:sz="8" w:space="0" w:color="000000"/>
+              <w:bottom w:val="single" w:sz="8" w:space="0" w:color="000000"/>
+              <w:right w:val="nil"/>
+            </w:tcBorders>
+            <w:shd w:val="clear" w:color="auto" w:fill="CCFFFF"/>
+            <w:tcMar>
+              <w:top w:w="30" w:type="dxa"/>
+              <w:left w:w="30" w:type="dxa"/>
+              <w:bottom w:w="30" w:type="dxa"/>
+              <w:right w:w="0" w:type="dxa"/>
+            </w:tcMar>
+            <w:vAlign w:val="center"/>
+          </w:tcPr>
+          <w:p>
+            <w:pPr>
+              <w:spacing w:before="0" w:after="0"/>
+              <w:jc w:val="center"/>
+              <w:rPr>
+                <w:rFonts w:ascii="Arial" w:hAnsi="Arial" w:cs="Arial"/>
+                <w:sz w:val="18"/>
+                <w:szCs w:val="18"/>
+              </w:rPr>
+            </w:pPr>
+            <w:r>
+              <w:drawing xmlns:w="http://schemas.openxmlformats.org/wordprocessingml/2006/main" xmlns:wpc="http://schemas.microsoft.com/office/word/2010/wordprocessingCanvas" xmlns:cx="http://schemas.microsoft.com/office/drawing/2014/chartex" xmlns:cx1="http://schemas.microsoft.com/office/drawing/2015/9/8/chartex" xmlns:cx2="http://schemas.microsoft.com/office/drawing/2015/10/21/chartex" xmlns:cx3="http://schemas.microsoft.com/office/drawing/2016/5/9/chartex" xmlns:cx4="http://schemas.microsoft.com/office/drawing/2016/5/10/chartex" xmlns:cx5="http://schemas.microsoft.com/office/drawing/2016/5/11/chartex" xmlns:cx6="http://schemas.microsoft.com/office/drawing/2016/5/12/chartex" xmlns:cx7="http://schemas.microsoft.com/office/drawing/2016/5/13/chartex" xmlns:cx8="http://schemas.microsoft.com/office/drawing/2016/5/14/chartex" xmlns:mc="http://schemas.openxmlformats.org/markup-compatibility/2006" xmlns:aink="http://schemas.microsoft.com/office/drawing/2016/ink" xmlns:am3d="http://schemas.microsoft.com/office/drawing/2017/model3d" xmlns:o="urn:schemas-microsoft-com:office:office" xmlns:oel="http://schemas.microsoft.com/office/2019/extlst" xmlns:r="http://schemas.openxmlformats.org/officeDocument/2006/relationships" xmlns:m="http://schemas.openxmlformats.org/officeDocument/2006/math" xmlns:v="urn:schemas-microsoft-com:vml" xmlns:wp14="http://schemas.microsoft.com/office/word/2010/wordprocessingDrawing" xmlns:wp="http://schemas.openxmlformats.org/drawingml/2006/wordprocessingDrawing" xmlns:w10="urn:schemas-microsoft-com:office:word" xmlns:w14="http://schemas.microsoft.com/office/word/2010/wordml" xmlns:w15="http://schemas.microsoft.com/office/word/2012/wordml" xmlns:w16cex="http://schemas.microsoft.com/office/word/2018/wordml/cex" xmlns:w16cid="http://schemas.microsoft.com/office/word/2016/wordml/cid" xmlns:w16="http://schemas.microsoft.com/office/word/2018/wordml" xmlns:w16sdtdh="http://schemas.microsoft.com/office/word/2020/wordml/sdtdatahash" xmlns:w16se="http://schemas.microsoft.com/office/word/2015/wordml/symex" xmlns:wpg="http://schemas.microsoft.com/office/word/2010/wordprocessingGroup" xmlns:wpi="http://schemas.microsoft.com/office/word/2010/wordprocessingInk" xmlns:wne="http://schemas.microsoft.com/office/word/2006/wordml" xmlns:wps="http://schemas.microsoft.com/office/word/2010/wordprocessingShape">
+                <wp:inline distT="0" distB="0" distL="0" distR="0" wp14:anchorId="49E8D7E2" wp14:editId="04AEC66E">
+                  <wp:extent cx="393065" cy="321945"/>
+                  <wp:effectExtent l="0" t="0" r="0" b="0"/>
+                  <wp:docPr id="478675133" name="Picture 14" descr="spill"/>
+                  <wp:cNvGraphicFramePr>
+                    <a:graphicFrameLocks xmlns:a="http://schemas.openxmlformats.org/drawingml/2006/main" noChangeAspect="1"/>
+                  </wp:cNvGraphicFramePr>
+                  <a:graphic xmlns:a="http://schemas.openxmlformats.org/drawingml/2006/main">
+                    <a:graphicData uri="http://schemas.openxmlformats.org/drawingml/2006/picture">
+                      <pic:pic xmlns:pic="http://schemas.openxmlformats.org/drawingml/2006/picture">
+                        <pic:nvPicPr>
+                          <pic:cNvPr id="0" name="Picture 14" descr="spill"/>
+                          <pic:cNvPicPr>
+                            <a:picLocks noChangeAspect="1" noChangeArrowheads="1"/>
+                          </pic:cNvPicPr>
+                        </pic:nvPicPr>
+                        <pic:blipFill>
+                          <a:blip r:embed="rId30">
+                            <a:extLst>
+                              <a:ext uri="{28A0092B-C50C-407E-A947-70E740481C1C}">
+                                <a14:useLocalDpi xmlns:a14="http://schemas.microsoft.com/office/drawing/2010/main" val="0"/>
+                              </a:ext>
+                            </a:extLst>
+                          </a:blip>
+                          <a:srcRect/>
+                          <a:stretch>
+                            <a:fillRect/>
+                          </a:stretch>
+                        </pic:blipFill>
+                        <pic:spPr bwMode="auto">
+                          <a:xfrm>
+                            <a:off x="0" y="0"/>
+                            <a:ext cx="393065" cy="321945"/>
+                          </a:xfrm>
+                          <a:prstGeom prst="rect">
+                            <a:avLst/>
+                          </a:prstGeom>
+                          <a:noFill/>
+                          <a:ln>
+                            <a:noFill/>
+                          </a:ln>
+                        </pic:spPr>
+                      </pic:pic>
+                    </a:graphicData>
+                  </a:graphic>
+                </wp:inline>
+              </w:drawing>
+            </w:r>
+          </w:p>
+        </w:tc>
+        <w:tc>
+          <w:tcPr>
+            <w:tcW w:w="1793" w:type="dxa"/>
+            <w:tcBorders>
+              <w:top w:val="single" w:sz="8" w:space="0" w:color="000000"/>
+              <w:left w:val="nil"/>
+              <w:bottom w:val="single" w:sz="8" w:space="0" w:color="000000"/>
+              <w:right w:val="single" w:sz="8" w:space="0" w:color="000000"/>
+            </w:tcBorders>
+            <w:shd w:val="clear" w:color="auto" w:fill="CCFFFF"/>
+            <w:tcMar>
+              <w:top w:w="30" w:type="dxa"/>
+              <w:left w:w="30" w:type="dxa"/>
+              <w:bottom w:w="30" w:type="dxa"/>
+              <w:right w:w="30" w:type="dxa"/>
+            </w:tcMar>
+            <w:vAlign w:val="center"/>
+          </w:tcPr>
+          <w:p>
+            <w:pPr>
+              <w:spacing w:before="0" w:after="0"/>
+              <w:jc w:val="left"/>
+              <w:rPr>
+                <w:rFonts w:ascii="Arial" w:hAnsi="Arial" w:cs="Arial"/>
+                <w:sz w:val="18"/>
+                <w:szCs w:val="18"/>
+              </w:rPr>
+            </w:pPr>
+            <w:r>
+              <w:rPr>
+                <w:rFonts w:ascii="Arial" w:hAnsi="Arial" w:cs="Arial" w:eastAsia="Arial"/>
+                <w:b/>
+                <w:bCs/>
+                <w:sz w:val="17"/>
+                <w:szCs w:val="17"/>
+                <w:lang w:val="en-GB"/>
+              </w:rPr>
+              <w:t xml:space="preserve">Environmental Spills</w:t>
+            </w:r>
+          </w:p>
+        </w:tc>
+        <w:tc>
+          <w:tcPr>
+            <w:tcW w:w="700" w:type="dxa"/>
+            <w:tcBorders>
+              <w:top w:val="single" w:sz="8" w:space="0" w:color="000000"/>
+              <w:left w:val="single" w:sz="8" w:space="0" w:color="000000"/>
+              <w:bottom w:val="single" w:sz="8" w:space="0" w:color="000000"/>
+              <w:right w:val="nil"/>
+            </w:tcBorders>
+            <w:shd w:val="clear" w:color="auto" w:fill="CCFFFF"/>
+            <w:tcMar>
+              <w:top w:w="30" w:type="dxa"/>
+              <w:left w:w="30" w:type="dxa"/>
+              <w:bottom w:w="30" w:type="dxa"/>
+              <w:right w:w="0" w:type="dxa"/>
+            </w:tcMar>
+            <w:vAlign w:val="center"/>
+          </w:tcPr>
+          <w:p>
+            <w:pPr>
+              <w:spacing w:before="0" w:after="0"/>
+              <w:jc w:val="center"/>
+              <w:rPr>
+                <w:rFonts w:ascii="Arial" w:hAnsi="Arial" w:cs="Arial"/>
+                <w:sz w:val="18"/>
+                <w:szCs w:val="18"/>
+              </w:rPr>
+            </w:pPr>
+            <w:r>
+              <w:drawing xmlns:w="http://schemas.openxmlformats.org/wordprocessingml/2006/main" xmlns:wpc="http://schemas.microsoft.com/office/word/2010/wordprocessingCanvas" xmlns:cx="http://schemas.microsoft.com/office/drawing/2014/chartex" xmlns:cx1="http://schemas.microsoft.com/office/drawing/2015/9/8/chartex" xmlns:cx2="http://schemas.microsoft.com/office/drawing/2015/10/21/chartex" xmlns:cx3="http://schemas.microsoft.com/office/drawing/2016/5/9/chartex" xmlns:cx4="http://schemas.microsoft.com/office/drawing/2016/5/10/chartex" xmlns:cx5="http://schemas.microsoft.com/office/drawing/2016/5/11/chartex" xmlns:cx6="http://schemas.microsoft.com/office/drawing/2016/5/12/chartex" xmlns:cx7="http://schemas.microsoft.com/office/drawing/2016/5/13/chartex" xmlns:cx8="http://schemas.microsoft.com/office/drawing/2016/5/14/chartex" xmlns:mc="http://schemas.openxmlformats.org/markup-compatibility/2006" xmlns:aink="http://schemas.microsoft.com/office/drawing/2016/ink" xmlns:am3d="http://schemas.microsoft.com/office/drawing/2017/model3d" xmlns:o="urn:schemas-microsoft-com:office:office" xmlns:oel="http://schemas.microsoft.com/office/2019/extlst" xmlns:r="http://schemas.openxmlformats.org/officeDocument/2006/relationships" xmlns:m="http://schemas.openxmlformats.org/officeDocument/2006/math" xmlns:v="urn:schemas-microsoft-com:vml" xmlns:wp14="http://schemas.microsoft.com/office/word/2010/wordprocessingDrawing" xmlns:wp="http://schemas.openxmlformats.org/drawingml/2006/wordprocessingDrawing" xmlns:w10="urn:schemas-microsoft-com:office:word" xmlns:w14="http://schemas.microsoft.com/office/word/2010/wordml" xmlns:w15="http://schemas.microsoft.com/office/word/2012/wordml" xmlns:w16cex="http://schemas.microsoft.com/office/word/2018/wordml/cex" xmlns:w16cid="http://schemas.microsoft.com/office/word/2016/wordml/cid" xmlns:w16="http://schemas.microsoft.com/office/word/2018/wordml" xmlns:w16sdtdh="http://schemas.microsoft.com/office/word/2020/wordml/sdtdatahash" xmlns:w16se="http://schemas.microsoft.com/office/word/2015/wordml/symex" xmlns:wpg="http://schemas.microsoft.com/office/word/2010/wordprocessingGroup" xmlns:wpi="http://schemas.microsoft.com/office/word/2010/wordprocessingInk" xmlns:wne="http://schemas.microsoft.com/office/word/2006/wordml" xmlns:wps="http://schemas.microsoft.com/office/word/2010/wordprocessingShape">
+                <wp:inline distT="0" distB="0" distL="0" distR="0" wp14:anchorId="3FFF2ED2" wp14:editId="3BB4055B">
+                  <wp:extent cx="295910" cy="334645"/>
+                  <wp:effectExtent l="0" t="0" r="0" b="0"/>
+                  <wp:docPr id="1305802777" name="Picture 15" descr="waste"/>
+                  <wp:cNvGraphicFramePr>
+                    <a:graphicFrameLocks xmlns:a="http://schemas.openxmlformats.org/drawingml/2006/main" noChangeAspect="1"/>
+                  </wp:cNvGraphicFramePr>
+                  <a:graphic xmlns:a="http://schemas.openxmlformats.org/drawingml/2006/main">
+                    <a:graphicData uri="http://schemas.openxmlformats.org/drawingml/2006/picture">
+                      <pic:pic xmlns:pic="http://schemas.openxmlformats.org/drawingml/2006/picture">
+                        <pic:nvPicPr>
+                          <pic:cNvPr id="0" name="Picture 15" descr="waste"/>
+                          <pic:cNvPicPr>
+                            <a:picLocks noChangeAspect="1" noChangeArrowheads="1"/>
+                          </pic:cNvPicPr>
+                        </pic:nvPicPr>
+                        <pic:blipFill>
+                          <a:blip r:embed="rId31">
+                            <a:extLst>
+                              <a:ext uri="{28A0092B-C50C-407E-A947-70E740481C1C}">
+                                <a14:useLocalDpi xmlns:a14="http://schemas.microsoft.com/office/drawing/2010/main" val="0"/>
+                              </a:ext>
+                            </a:extLst>
+                          </a:blip>
+                          <a:srcRect/>
+                          <a:stretch>
+                            <a:fillRect/>
+                          </a:stretch>
+                        </pic:blipFill>
+                        <pic:spPr bwMode="auto">
+                          <a:xfrm>
+                            <a:off x="0" y="0"/>
+                            <a:ext cx="295910" cy="334645"/>
+                          </a:xfrm>
+                          <a:prstGeom prst="rect">
+                            <a:avLst/>
+                          </a:prstGeom>
+                          <a:noFill/>
+                          <a:ln>
+                            <a:noFill/>
+                          </a:ln>
+                        </pic:spPr>
+                      </pic:pic>
+                    </a:graphicData>
+                  </a:graphic>
+                </wp:inline>
+              </w:drawing>
+            </w:r>
+          </w:p>
+        </w:tc>
+        <w:tc>
+          <w:tcPr>
+            <w:tcW w:w="1793" w:type="dxa"/>
+            <w:tcBorders>
+              <w:top w:val="single" w:sz="8" w:space="0" w:color="000000"/>
+              <w:left w:val="nil"/>
+              <w:bottom w:val="single" w:sz="8" w:space="0" w:color="000000"/>
+              <w:right w:val="single" w:sz="8" w:space="0" w:color="000000"/>
+            </w:tcBorders>
+            <w:shd w:val="clear" w:color="auto" w:fill="CCFFFF"/>
+            <w:tcMar>
+              <w:top w:w="30" w:type="dxa"/>
+              <w:left w:w="30" w:type="dxa"/>
+              <w:bottom w:w="30" w:type="dxa"/>
+              <w:right w:w="30" w:type="dxa"/>
+            </w:tcMar>
+            <w:vAlign w:val="center"/>
+          </w:tcPr>
+          <w:p>
+            <w:pPr>
+              <w:spacing w:before="0" w:after="0"/>
+              <w:jc w:val="left"/>
+              <w:rPr>
+                <w:rFonts w:ascii="Arial" w:hAnsi="Arial" w:cs="Arial"/>
+                <w:sz w:val="18"/>
+                <w:szCs w:val="18"/>
+              </w:rPr>
+            </w:pPr>
+            <w:r>
+              <w:rPr>
+                <w:rFonts w:ascii="Arial" w:hAnsi="Arial" w:cs="Arial" w:eastAsia="Arial"/>
+                <w:b/>
+                <w:bCs/>
+                <w:sz w:val="17"/>
+                <w:szCs w:val="17"/>
+                <w:lang w:val="en-GB"/>
+              </w:rPr>
+              <w:t xml:space="preserve">Waste Cleanup/ Disposal</w:t>
+            </w:r>
+          </w:p>
+        </w:tc>
+        <w:tc>
+          <w:tcPr>
+            <w:tcW w:w="700" w:type="dxa"/>
+            <w:tcBorders>
+              <w:top w:val="single" w:sz="8" w:space="0" w:color="000000"/>
+              <w:left w:val="single" w:sz="8" w:space="0" w:color="000000"/>
+              <w:bottom w:val="single" w:sz="8" w:space="0" w:color="000000"/>
+              <w:right w:val="nil"/>
+            </w:tcBorders>
+            <w:shd w:val="clear" w:color="auto" w:fill="CCFFFF"/>
+            <w:tcMar>
+              <w:top w:w="30" w:type="dxa"/>
+              <w:left w:w="30" w:type="dxa"/>
+              <w:bottom w:w="30" w:type="dxa"/>
+              <w:right w:w="0" w:type="dxa"/>
+            </w:tcMar>
+            <w:vAlign w:val="center"/>
+          </w:tcPr>
+          <w:p>
+            <w:pPr>
+              <w:spacing w:before="0" w:after="0"/>
+              <w:jc w:val="center"/>
+              <w:rPr>
+                <w:rFonts w:ascii="Arial" w:hAnsi="Arial" w:cs="Arial"/>
+                <w:sz w:val="18"/>
+                <w:szCs w:val="18"/>
+              </w:rPr>
+            </w:pPr>
+            <w:r>
+              <w:drawing xmlns:w="http://schemas.openxmlformats.org/wordprocessingml/2006/main" xmlns:wpc="http://schemas.microsoft.com/office/word/2010/wordprocessingCanvas" xmlns:cx="http://schemas.microsoft.com/office/drawing/2014/chartex" xmlns:cx1="http://schemas.microsoft.com/office/drawing/2015/9/8/chartex" xmlns:cx2="http://schemas.microsoft.com/office/drawing/2015/10/21/chartex" xmlns:cx3="http://schemas.microsoft.com/office/drawing/2016/5/9/chartex" xmlns:cx4="http://schemas.microsoft.com/office/drawing/2016/5/10/chartex" xmlns:cx5="http://schemas.microsoft.com/office/drawing/2016/5/11/chartex" xmlns:cx6="http://schemas.microsoft.com/office/drawing/2016/5/12/chartex" xmlns:cx7="http://schemas.microsoft.com/office/drawing/2016/5/13/chartex" xmlns:cx8="http://schemas.microsoft.com/office/drawing/2016/5/14/chartex" xmlns:mc="http://schemas.openxmlformats.org/markup-compatibility/2006" xmlns:aink="http://schemas.microsoft.com/office/drawing/2016/ink" xmlns:am3d="http://schemas.microsoft.com/office/drawing/2017/model3d" xmlns:o="urn:schemas-microsoft-com:office:office" xmlns:oel="http://schemas.microsoft.com/office/2019/extlst" xmlns:r="http://schemas.openxmlformats.org/officeDocument/2006/relationships" xmlns:m="http://schemas.openxmlformats.org/officeDocument/2006/math" xmlns:v="urn:schemas-microsoft-com:vml" xmlns:wp14="http://schemas.microsoft.com/office/word/2010/wordprocessingDrawing" xmlns:wp="http://schemas.openxmlformats.org/drawingml/2006/wordprocessingDrawing" xmlns:w10="urn:schemas-microsoft-com:office:word" xmlns:w14="http://schemas.microsoft.com/office/word/2010/wordml" xmlns:w15="http://schemas.microsoft.com/office/word/2012/wordml" xmlns:w16cex="http://schemas.microsoft.com/office/word/2018/wordml/cex" xmlns:w16cid="http://schemas.microsoft.com/office/word/2016/wordml/cid" xmlns:w16="http://schemas.microsoft.com/office/word/2018/wordml" xmlns:w16sdtdh="http://schemas.microsoft.com/office/word/2020/wordml/sdtdatahash" xmlns:w16se="http://schemas.microsoft.com/office/word/2015/wordml/symex" xmlns:wpg="http://schemas.microsoft.com/office/word/2010/wordprocessingGroup" xmlns:wpi="http://schemas.microsoft.com/office/word/2010/wordprocessingInk" xmlns:wne="http://schemas.microsoft.com/office/word/2006/wordml" xmlns:wps="http://schemas.microsoft.com/office/word/2010/wordprocessingShape">
+                <wp:inline distT="0" distB="0" distL="0" distR="0" wp14:anchorId="043E5073" wp14:editId="65A0FDD4">
+                  <wp:extent cx="340995" cy="321945"/>
+                  <wp:effectExtent l="0" t="0" r="0" b="0"/>
+                  <wp:docPr id="125876023" name="Picture 17" descr="Radia"/>
+                  <wp:cNvGraphicFramePr>
+                    <a:graphicFrameLocks xmlns:a="http://schemas.openxmlformats.org/drawingml/2006/main" noChangeAspect="1"/>
+                  </wp:cNvGraphicFramePr>
+                  <a:graphic xmlns:a="http://schemas.openxmlformats.org/drawingml/2006/main">
+                    <a:graphicData uri="http://schemas.openxmlformats.org/drawingml/2006/picture">
+                      <pic:pic xmlns:pic="http://schemas.openxmlformats.org/drawingml/2006/picture">
+                        <pic:nvPicPr>
+                          <pic:cNvPr id="0" name="Picture 17" descr="Radia"/>
+                          <pic:cNvPicPr>
+                            <a:picLocks noChangeAspect="1" noChangeArrowheads="1"/>
+                          </pic:cNvPicPr>
+                        </pic:nvPicPr>
+                        <pic:blipFill>
+                          <a:blip r:embed="rId32">
+                            <a:extLst>
+                              <a:ext uri="{28A0092B-C50C-407E-A947-70E740481C1C}">
+                                <a14:useLocalDpi xmlns:a14="http://schemas.microsoft.com/office/drawing/2010/main" val="0"/>
+                              </a:ext>
+                            </a:extLst>
+                          </a:blip>
+                          <a:srcRect/>
+                          <a:stretch>
+                            <a:fillRect/>
+                          </a:stretch>
+                        </pic:blipFill>
+                        <pic:spPr bwMode="auto">
+                          <a:xfrm>
+                            <a:off x="0" y="0"/>
+                            <a:ext cx="340995" cy="321945"/>
+                          </a:xfrm>
+                          <a:prstGeom prst="rect">
+                            <a:avLst/>
+                          </a:prstGeom>
+                          <a:noFill/>
+                          <a:ln>
+                            <a:noFill/>
+                          </a:ln>
+                        </pic:spPr>
+                      </pic:pic>
+                    </a:graphicData>
+                  </a:graphic>
+                </wp:inline>
+              </w:drawing>
+            </w:r>
+          </w:p>
+        </w:tc>
+        <w:tc>
+          <w:tcPr>
+            <w:tcW w:w="1793" w:type="dxa"/>
+            <w:tcBorders>
+              <w:top w:val="single" w:sz="8" w:space="0" w:color="000000"/>
+              <w:left w:val="nil"/>
+              <w:bottom w:val="single" w:sz="8" w:space="0" w:color="000000"/>
+              <w:right w:val="single" w:sz="8" w:space="0" w:color="000000"/>
+            </w:tcBorders>
+            <w:shd w:val="clear" w:color="auto" w:fill="CCFFFF"/>
+            <w:tcMar>
+              <w:top w:w="30" w:type="dxa"/>
+              <w:left w:w="30" w:type="dxa"/>
+              <w:bottom w:w="30" w:type="dxa"/>
+              <w:right w:w="30" w:type="dxa"/>
+            </w:tcMar>
+            <w:vAlign w:val="center"/>
+          </w:tcPr>
+          <w:p>
+            <w:pPr>
+              <w:spacing w:before="0" w:after="0"/>
+              <w:jc w:val="left"/>
+              <w:rPr>
+                <w:rFonts w:ascii="Arial" w:hAnsi="Arial" w:cs="Arial"/>
+                <w:sz w:val="18"/>
+                <w:szCs w:val="18"/>
+              </w:rPr>
+            </w:pPr>
+            <w:r>
+              <w:rPr>
+                <w:rFonts w:ascii="Arial" w:hAnsi="Arial" w:cs="Arial" w:eastAsia="Arial"/>
+                <w:b/>
+                <w:bCs/>
+                <w:sz w:val="17"/>
+                <w:szCs w:val="17"/>
+                <w:lang w:val="en-GB"/>
+              </w:rPr>
+              <w:t xml:space="preserve">Exposure to Radiation Hazards</w:t>
+            </w:r>
+          </w:p>
+        </w:tc>
+        <w:tc>
+          <w:tcPr>
+            <w:tcW w:w="700" w:type="dxa"/>
+            <w:tcBorders>
+              <w:top w:val="single" w:sz="8" w:space="0" w:color="000000"/>
+              <w:left w:val="single" w:sz="8" w:space="0" w:color="000000"/>
+              <w:bottom w:val="single" w:sz="8" w:space="0" w:color="000000"/>
+              <w:right w:val="nil"/>
+            </w:tcBorders>
+            <w:shd w:val="clear" w:color="auto" w:fill="CCFFFF"/>
+            <w:tcMar>
+              <w:top w:w="30" w:type="dxa"/>
+              <w:left w:w="30" w:type="dxa"/>
+              <w:bottom w:w="30" w:type="dxa"/>
+              <w:right w:w="0" w:type="dxa"/>
+            </w:tcMar>
+            <w:vAlign w:val="center"/>
+          </w:tcPr>
+          <w:p>
+            <w:pPr>
+              <w:spacing w:before="0" w:after="0"/>
+              <w:jc w:val="center"/>
+              <w:rPr>
+                <w:rFonts w:ascii="Arial" w:hAnsi="Arial" w:cs="Arial"/>
+                <w:sz w:val="18"/>
+                <w:szCs w:val="18"/>
+              </w:rPr>
+            </w:pPr>
+            <w:r>
+              <w:drawing xmlns:w="http://schemas.openxmlformats.org/wordprocessingml/2006/main" xmlns:wpc="http://schemas.microsoft.com/office/word/2010/wordprocessingCanvas" xmlns:cx="http://schemas.microsoft.com/office/drawing/2014/chartex" xmlns:cx1="http://schemas.microsoft.com/office/drawing/2015/9/8/chartex" xmlns:cx2="http://schemas.microsoft.com/office/drawing/2015/10/21/chartex" xmlns:cx3="http://schemas.microsoft.com/office/drawing/2016/5/9/chartex" xmlns:cx4="http://schemas.microsoft.com/office/drawing/2016/5/10/chartex" xmlns:cx5="http://schemas.microsoft.com/office/drawing/2016/5/11/chartex" xmlns:cx6="http://schemas.microsoft.com/office/drawing/2016/5/12/chartex" xmlns:cx7="http://schemas.microsoft.com/office/drawing/2016/5/13/chartex" xmlns:cx8="http://schemas.microsoft.com/office/drawing/2016/5/14/chartex" xmlns:mc="http://schemas.openxmlformats.org/markup-compatibility/2006" xmlns:aink="http://schemas.microsoft.com/office/drawing/2016/ink" xmlns:am3d="http://schemas.microsoft.com/office/drawing/2017/model3d" xmlns:o="urn:schemas-microsoft-com:office:office" xmlns:oel="http://schemas.microsoft.com/office/2019/extlst" xmlns:r="http://schemas.openxmlformats.org/officeDocument/2006/relationships" xmlns:m="http://schemas.openxmlformats.org/officeDocument/2006/math" xmlns:v="urn:schemas-microsoft-com:vml" xmlns:wp14="http://schemas.microsoft.com/office/word/2010/wordprocessingDrawing" xmlns:wp="http://schemas.openxmlformats.org/drawingml/2006/wordprocessingDrawing" xmlns:w10="urn:schemas-microsoft-com:office:word" xmlns:w14="http://schemas.microsoft.com/office/word/2010/wordml" xmlns:w15="http://schemas.microsoft.com/office/word/2012/wordml" xmlns:w16cex="http://schemas.microsoft.com/office/word/2018/wordml/cex" xmlns:w16cid="http://schemas.microsoft.com/office/word/2016/wordml/cid" xmlns:w16="http://schemas.microsoft.com/office/word/2018/wordml" xmlns:w16sdtdh="http://schemas.microsoft.com/office/word/2020/wordml/sdtdatahash" xmlns:w16se="http://schemas.microsoft.com/office/word/2015/wordml/symex" xmlns:wpg="http://schemas.microsoft.com/office/word/2010/wordprocessingGroup" xmlns:wpi="http://schemas.microsoft.com/office/word/2010/wordprocessingInk" xmlns:wne="http://schemas.microsoft.com/office/word/2006/wordml" xmlns:wps="http://schemas.microsoft.com/office/word/2010/wordprocessingShape">
+                <wp:inline distT="0" distB="0" distL="0" distR="0" wp14:anchorId="6C3694BD" wp14:editId="04F517FE">
+                  <wp:extent cx="354330" cy="321945"/>
+                  <wp:effectExtent l="0" t="0" r="0" b="0"/>
+                  <wp:docPr id="1197154758" name="Picture 16" descr="high nois"/>
+                  <wp:cNvGraphicFramePr>
+                    <a:graphicFrameLocks xmlns:a="http://schemas.openxmlformats.org/drawingml/2006/main" noChangeAspect="1"/>
+                  </wp:cNvGraphicFramePr>
+                  <a:graphic xmlns:a="http://schemas.openxmlformats.org/drawingml/2006/main">
+                    <a:graphicData uri="http://schemas.openxmlformats.org/drawingml/2006/picture">
+                      <pic:pic xmlns:pic="http://schemas.openxmlformats.org/drawingml/2006/picture">
+                        <pic:nvPicPr>
+                          <pic:cNvPr id="0" name="Picture 16" descr="high nois"/>
+                          <pic:cNvPicPr>
+                            <a:picLocks noChangeAspect="1" noChangeArrowheads="1"/>
+                          </pic:cNvPicPr>
+                        </pic:nvPicPr>
+                        <pic:blipFill>
+                          <a:blip r:embed="rId33">
+                            <a:extLst>
+                              <a:ext uri="{28A0092B-C50C-407E-A947-70E740481C1C}">
+                                <a14:useLocalDpi xmlns:a14="http://schemas.microsoft.com/office/drawing/2010/main" val="0"/>
+                              </a:ext>
+                            </a:extLst>
+                          </a:blip>
+                          <a:srcRect/>
+                          <a:stretch>
+                            <a:fillRect/>
+                          </a:stretch>
+                        </pic:blipFill>
+                        <pic:spPr bwMode="auto">
+                          <a:xfrm>
+                            <a:off x="0" y="0"/>
+                            <a:ext cx="354330" cy="321945"/>
+                          </a:xfrm>
+                          <a:prstGeom prst="rect">
+                            <a:avLst/>
+                          </a:prstGeom>
+                          <a:noFill/>
+                          <a:ln>
+                            <a:noFill/>
+                          </a:ln>
+                        </pic:spPr>
+                      </pic:pic>
+                    </a:graphicData>
+                  </a:graphic>
+                </wp:inline>
+              </w:drawing>
+            </w:r>
+          </w:p>
+        </w:tc>
+        <w:tc>
+          <w:tcPr>
+            <w:tcW w:w="1793" w:type="dxa"/>
+            <w:tcBorders>
+              <w:top w:val="single" w:sz="8" w:space="0" w:color="000000"/>
+              <w:left w:val="nil"/>
+              <w:bottom w:val="single" w:sz="8" w:space="0" w:color="000000"/>
+              <w:right w:val="single" w:sz="8" w:space="0" w:color="000000"/>
+            </w:tcBorders>
+            <w:shd w:val="clear" w:color="auto" w:fill="CCFFFF"/>
+            <w:tcMar>
+              <w:top w:w="30" w:type="dxa"/>
+              <w:left w:w="30" w:type="dxa"/>
+              <w:bottom w:w="30" w:type="dxa"/>
+              <w:right w:w="30" w:type="dxa"/>
+            </w:tcMar>
+            <w:vAlign w:val="center"/>
+          </w:tcPr>
+          <w:p>
+            <w:pPr>
+              <w:spacing w:before="0" w:after="0"/>
+              <w:jc w:val="left"/>
+              <w:rPr>
+                <w:rFonts w:ascii="Arial" w:hAnsi="Arial" w:cs="Arial"/>
+                <w:sz w:val="18"/>
+                <w:szCs w:val="18"/>
+              </w:rPr>
+            </w:pPr>
+            <w:r>
+              <w:rPr>
+                <w:rFonts w:ascii="Arial" w:hAnsi="Arial" w:cs="Arial" w:eastAsia="Arial"/>
+                <w:b/>
+                <w:bCs/>
+                <w:sz w:val="17"/>
+                <w:szCs w:val="17"/>
+                <w:lang w:val="en-GB"/>
+              </w:rPr>
+              <w:t xml:space="preserve">Exposure to High Noise</w:t>
+            </w:r>
+          </w:p>
+        </w:tc>
+        <w:tc>
+          <w:tcPr>
+            <w:tcW w:w="700" w:type="dxa"/>
+            <w:tcBorders>
+              <w:top w:val="single" w:sz="8" w:space="0" w:color="000000"/>
+              <w:left w:val="single" w:sz="8" w:space="0" w:color="000000"/>
+              <w:bottom w:val="single" w:sz="8" w:space="0" w:color="000000"/>
+              <w:right w:val="nil"/>
+            </w:tcBorders>
+            <w:shd w:val="clear" w:color="auto" w:fill="CCFFFF"/>
+            <w:tcMar>
+              <w:top w:w="30" w:type="dxa"/>
+              <w:left w:w="30" w:type="dxa"/>
+              <w:bottom w:w="30" w:type="dxa"/>
+              <w:right w:w="0" w:type="dxa"/>
+            </w:tcMar>
+            <w:vAlign w:val="center"/>
+          </w:tcPr>
+          <w:p>
+            <w:pPr>
+              <w:spacing w:before="0" w:after="0"/>
+              <w:jc w:val="center"/>
+              <w:rPr>
+                <w:rFonts w:ascii="Arial" w:hAnsi="Arial" w:cs="Arial"/>
+                <w:sz w:val="18"/>
+                <w:szCs w:val="18"/>
+              </w:rPr>
+            </w:pPr>
+            <w:r>
+              <w:drawing xmlns:w="http://schemas.openxmlformats.org/wordprocessingml/2006/main" xmlns:wpc="http://schemas.microsoft.com/office/word/2010/wordprocessingCanvas" xmlns:cx="http://schemas.microsoft.com/office/drawing/2014/chartex" xmlns:cx1="http://schemas.microsoft.com/office/drawing/2015/9/8/chartex" xmlns:cx2="http://schemas.microsoft.com/office/drawing/2015/10/21/chartex" xmlns:cx3="http://schemas.microsoft.com/office/drawing/2016/5/9/chartex" xmlns:cx4="http://schemas.microsoft.com/office/drawing/2016/5/10/chartex" xmlns:cx5="http://schemas.microsoft.com/office/drawing/2016/5/11/chartex" xmlns:cx6="http://schemas.microsoft.com/office/drawing/2016/5/12/chartex" xmlns:cx7="http://schemas.microsoft.com/office/drawing/2016/5/13/chartex" xmlns:cx8="http://schemas.microsoft.com/office/drawing/2016/5/14/chartex" xmlns:mc="http://schemas.openxmlformats.org/markup-compatibility/2006" xmlns:aink="http://schemas.microsoft.com/office/drawing/2016/ink" xmlns:am3d="http://schemas.microsoft.com/office/drawing/2017/model3d" xmlns:o="urn:schemas-microsoft-com:office:office" xmlns:oel="http://schemas.microsoft.com/office/2019/extlst" xmlns:r="http://schemas.openxmlformats.org/officeDocument/2006/relationships" xmlns:m="http://schemas.openxmlformats.org/officeDocument/2006/math" xmlns:v="urn:schemas-microsoft-com:vml" xmlns:wp14="http://schemas.microsoft.com/office/word/2010/wordprocessingDrawing" xmlns:wp="http://schemas.openxmlformats.org/drawingml/2006/wordprocessingDrawing" xmlns:w10="urn:schemas-microsoft-com:office:word" xmlns:w14="http://schemas.microsoft.com/office/word/2010/wordml" xmlns:w15="http://schemas.microsoft.com/office/word/2012/wordml" xmlns:w16cex="http://schemas.microsoft.com/office/word/2018/wordml/cex" xmlns:w16cid="http://schemas.microsoft.com/office/word/2016/wordml/cid" xmlns:w16="http://schemas.microsoft.com/office/word/2018/wordml" xmlns:w16sdtdh="http://schemas.microsoft.com/office/word/2020/wordml/sdtdatahash" xmlns:w16se="http://schemas.microsoft.com/office/word/2015/wordml/symex" xmlns:wpg="http://schemas.microsoft.com/office/word/2010/wordprocessingGroup" xmlns:wpi="http://schemas.microsoft.com/office/word/2010/wordprocessingInk" xmlns:wne="http://schemas.microsoft.com/office/word/2006/wordml" xmlns:wps="http://schemas.microsoft.com/office/word/2010/wordprocessingShape">
+                <wp:inline distT="0" distB="0" distL="0" distR="0" wp14:anchorId="49A60C2B" wp14:editId="022D9D80">
+                  <wp:extent cx="334645" cy="334645"/>
+                  <wp:effectExtent l="0" t="0" r="0" b="0"/>
+                  <wp:docPr id="419339321" name="Picture 19" descr="weather"/>
+                  <wp:cNvGraphicFramePr>
+                    <a:graphicFrameLocks xmlns:a="http://schemas.openxmlformats.org/drawingml/2006/main" noChangeAspect="1"/>
+                  </wp:cNvGraphicFramePr>
+                  <a:graphic xmlns:a="http://schemas.openxmlformats.org/drawingml/2006/main">
+                    <a:graphicData uri="http://schemas.openxmlformats.org/drawingml/2006/picture">
+                      <pic:pic xmlns:pic="http://schemas.openxmlformats.org/drawingml/2006/picture">
+                        <pic:nvPicPr>
+                          <pic:cNvPr id="0" name="Picture 19" descr="weather"/>
+                          <pic:cNvPicPr>
+                            <a:picLocks noChangeAspect="1" noChangeArrowheads="1"/>
+                          </pic:cNvPicPr>
+                        </pic:nvPicPr>
+                        <pic:blipFill>
+                          <a:blip r:embed="rId34">
+                            <a:extLst>
+                              <a:ext uri="{28A0092B-C50C-407E-A947-70E740481C1C}">
+                                <a14:useLocalDpi xmlns:a14="http://schemas.microsoft.com/office/drawing/2010/main" val="0"/>
+                              </a:ext>
+                            </a:extLst>
+                          </a:blip>
+                          <a:srcRect/>
+                          <a:stretch>
+                            <a:fillRect/>
+                          </a:stretch>
+                        </pic:blipFill>
+                        <pic:spPr bwMode="auto">
+                          <a:xfrm>
+                            <a:off x="0" y="0"/>
+                            <a:ext cx="334645" cy="334645"/>
+                          </a:xfrm>
+                          <a:prstGeom prst="rect">
+                            <a:avLst/>
+                          </a:prstGeom>
+                          <a:noFill/>
+                          <a:ln>
+                            <a:noFill/>
+                          </a:ln>
+                        </pic:spPr>
+                      </pic:pic>
+                    </a:graphicData>
+                  </a:graphic>
+                </wp:inline>
+              </w:drawing>
+            </w:r>
+          </w:p>
+        </w:tc>
+        <w:tc>
+          <w:tcPr>
+            <w:tcW w:w="1793" w:type="dxa"/>
+            <w:tcBorders>
+              <w:top w:val="single" w:sz="8" w:space="0" w:color="000000"/>
+              <w:left w:val="nil"/>
+              <w:bottom w:val="single" w:sz="8" w:space="0" w:color="000000"/>
+              <w:right w:val="single" w:sz="8" w:space="0" w:color="000000"/>
+            </w:tcBorders>
+            <w:shd w:val="clear" w:color="auto" w:fill="CCFFFF"/>
+            <w:tcMar>
+              <w:top w:w="30" w:type="dxa"/>
+              <w:left w:w="30" w:type="dxa"/>
+              <w:bottom w:w="30" w:type="dxa"/>
+              <w:right w:w="30" w:type="dxa"/>
+            </w:tcMar>
+            <w:vAlign w:val="center"/>
+          </w:tcPr>
+          <w:p>
+            <w:pPr>
+              <w:spacing w:before="0" w:after="0"/>
+              <w:jc w:val="left"/>
+              <w:rPr>
+                <w:rFonts w:ascii="Arial" w:hAnsi="Arial" w:cs="Arial"/>
+                <w:sz w:val="18"/>
+                <w:szCs w:val="18"/>
+              </w:rPr>
+            </w:pPr>
+            <w:r>
+              <w:rPr>
+                <w:rFonts w:ascii="Arial" w:hAnsi="Arial" w:cs="Arial" w:eastAsia="Arial"/>
+                <w:b/>
+                <w:bCs/>
+                <w:sz w:val="17"/>
+                <w:szCs w:val="17"/>
+                <w:lang w:val="en-GB"/>
+              </w:rPr>
+              <w:t xml:space="preserve">Adverse Weather</w:t>
             </w:r>
           </w:p>
         </w:tc>
@@ -29963,53 +32874,1796 @@
         </w:rPr>
       </w:pPr>
     </w:p>
+    <w:tbl>
+      <w:tblPr>
+        <w:tblW w:w="14959" w:type="dxa"/>
+        <w:tblInd w:w="0" w:type="dxa"/>
+        <w:tblLayout w:type="fixed"/>
+        <w:tblCellMar>
+          <w:left w:w="40" w:type="dxa"/>
+          <w:right w:w="40" w:type="dxa"/>
+        </w:tblCellMar>
+        <w:tblLook w:val="0000"/>
+      </w:tblPr>
+      <w:tblGrid>
+        <w:gridCol w:w="900"/>
+        <w:gridCol w:w="1800"/>
+        <w:gridCol w:w="2452"/>
+        <w:gridCol w:w="2452"/>
+        <w:gridCol w:w="2452"/>
+        <w:gridCol w:w="2452"/>
+        <w:gridCol w:w="2451"/>
+      </w:tblGrid>
+      <w:tr>
+        <w:trPr>
+          <w:cantSplit/>
+          <w:trHeight w:val="420" w:hRule="atLeast"/>
+        </w:trPr>
+        <w:tc>
+          <w:tcPr>
+            <w:tcW w:w="2700" w:type="dxa"/>
+            <w:gridSpan w:val="2"/>
+            <w:vMerge w:val="restart"/>
+            <w:tcBorders>
+              <w:top w:val="single" w:sz="4" w:space="0" w:color="000000"/>
+              <w:left w:val="single" w:sz="4" w:space="0" w:color="000000"/>
+              <w:bottom w:val="single" w:sz="4" w:space="0" w:color="000000"/>
+              <w:right w:val="single" w:sz="4" w:space="0" w:color="000000"/>
+            </w:tcBorders>
+            <w:shd w:val="clear" w:color="auto" w:fill="F2F2F2"/>
+            <w:tcMar>
+              <w:top w:w="30" w:type="dxa"/>
+              <w:left w:w="40" w:type="dxa"/>
+              <w:bottom w:w="30" w:type="dxa"/>
+              <w:right w:w="40" w:type="dxa"/>
+            </w:tcMar>
+            <w:vAlign w:val="center"/>
+          </w:tcPr>
+          <w:p>
+            <w:pPr>
+              <w:pageBreakBefore/>
+              <w:spacing w:before="0" w:after="0"/>
+              <w:jc w:val="center"/>
+              <w:rPr>
+                <w:rFonts w:ascii="Arial" w:hAnsi="Arial" w:cs="Arial"/>
+                <w:sz w:val="18"/>
+                <w:szCs w:val="18"/>
+              </w:rPr>
+            </w:pPr>
+            <w:r>
+              <w:rPr>
+                <w:rFonts w:ascii="Arial" w:hAnsi="Arial" w:cs="Arial" w:eastAsia="Arial"/>
+                <w:b/>
+                <w:bCs/>
+                <w:sz w:val="22"/>
+                <w:szCs w:val="22"/>
+                <w:lang w:val="en-GB"/>
+              </w:rPr>
+              <w:t xml:space="preserve">RAM</w:t>
+            </w:r>
+          </w:p>
+        </w:tc>
+        <w:tc>
+          <w:tcPr>
+            <w:tcW w:w="12259" w:type="dxa"/>
+            <w:gridSpan w:val="5"/>
+            <w:tcBorders>
+              <w:top w:val="single" w:sz="4" w:space="0" w:color="000000"/>
+              <w:left w:val="single" w:sz="4" w:space="0" w:color="000000"/>
+              <w:bottom w:val="single" w:sz="4" w:space="0" w:color="000000"/>
+              <w:right w:val="single" w:sz="4" w:space="0" w:color="000000"/>
+            </w:tcBorders>
+            <w:shd w:val="clear" w:color="auto" w:fill="F2F2F2"/>
+            <w:tcMar>
+              <w:top w:w="30" w:type="dxa"/>
+              <w:left w:w="40" w:type="dxa"/>
+              <w:bottom w:w="30" w:type="dxa"/>
+              <w:right w:w="40" w:type="dxa"/>
+            </w:tcMar>
+            <w:vAlign w:val="center"/>
+          </w:tcPr>
+          <w:p>
+            <w:pPr>
+              <w:spacing w:before="0" w:after="0"/>
+              <w:jc w:val="center"/>
+              <w:rPr>
+                <w:rFonts w:ascii="Arial" w:hAnsi="Arial" w:cs="Arial"/>
+                <w:sz w:val="18"/>
+                <w:szCs w:val="18"/>
+              </w:rPr>
+            </w:pPr>
+            <w:r>
+              <w:rPr>
+                <w:rFonts w:ascii="Arial" w:hAnsi="Arial" w:cs="Arial" w:eastAsia="Arial"/>
+                <w:b/>
+                <w:bCs/>
+                <w:sz w:val="20"/>
+                <w:szCs w:val="20"/>
+                <w:lang w:val="en-GB"/>
+              </w:rPr>
+              <w:t xml:space="preserve">LIKELIHOOD</w:t>
+            </w:r>
+          </w:p>
+        </w:tc>
+      </w:tr>
+      <w:tr>
+        <w:trPr>
+          <w:cantSplit/>
+          <w:trHeight w:val="560" w:hRule="atLeast"/>
+        </w:trPr>
+        <w:tc>
+          <w:tcPr>
+            <w:tcW w:w="2700" w:type="dxa"/>
+            <w:gridSpan w:val="2"/>
+            <w:vMerge/>
+            <w:tcBorders>
+              <w:top w:val="single" w:sz="4" w:space="0" w:color="000000"/>
+              <w:left w:val="single" w:sz="4" w:space="0" w:color="000000"/>
+              <w:bottom w:val="single" w:sz="4" w:space="0" w:color="000000"/>
+              <w:right w:val="single" w:sz="4" w:space="0" w:color="000000"/>
+            </w:tcBorders>
+            <w:shd w:val="clear" w:color="auto" w:fill="F2F2F2"/>
+            <w:tcMar>
+              <w:top w:w="30" w:type="dxa"/>
+              <w:left w:w="40" w:type="dxa"/>
+              <w:bottom w:w="30" w:type="dxa"/>
+              <w:right w:w="40" w:type="dxa"/>
+            </w:tcMar>
+            <w:vAlign w:val="top"/>
+          </w:tcPr>
+          <w:p>
+            <w:pPr>
+              <w:spacing w:before="0" w:after="0"/>
+              <w:jc w:val="left"/>
+              <w:rPr>
+                <w:rFonts w:ascii="Arial" w:hAnsi="Arial" w:cs="Arial"/>
+                <w:sz w:val="18"/>
+                <w:szCs w:val="18"/>
+              </w:rPr>
+            </w:pPr>
+          </w:p>
+        </w:tc>
+        <w:tc>
+          <w:tcPr>
+            <w:tcW w:w="2452" w:type="dxa"/>
+            <w:tcBorders>
+              <w:top w:val="single" w:sz="4" w:space="0" w:color="000000"/>
+              <w:left w:val="single" w:sz="4" w:space="0" w:color="000000"/>
+              <w:bottom w:val="single" w:sz="4" w:space="0" w:color="000000"/>
+              <w:right w:val="single" w:sz="4" w:space="0" w:color="000000"/>
+            </w:tcBorders>
+            <w:shd w:val="clear" w:color="auto" w:fill="F2F2F2"/>
+            <w:tcMar>
+              <w:top w:w="30" w:type="dxa"/>
+              <w:left w:w="40" w:type="dxa"/>
+              <w:bottom w:w="30" w:type="dxa"/>
+              <w:right w:w="40" w:type="dxa"/>
+            </w:tcMar>
+            <w:vAlign w:val="center"/>
+          </w:tcPr>
+          <w:p>
+            <w:pPr>
+              <w:spacing w:before="0" w:after="0"/>
+              <w:jc w:val="center"/>
+              <w:rPr>
+                <w:rFonts w:ascii="Arial" w:hAnsi="Arial" w:cs="Arial"/>
+                <w:sz w:val="18"/>
+                <w:szCs w:val="18"/>
+              </w:rPr>
+            </w:pPr>
+            <w:r>
+              <w:rPr>
+                <w:rFonts w:ascii="Arial" w:hAnsi="Arial" w:cs="Arial" w:eastAsia="Arial"/>
+                <w:b/>
+                <w:bCs/>
+                <w:sz w:val="18"/>
+                <w:szCs w:val="18"/>
+                <w:lang w:val="en-GB"/>
+              </w:rPr>
+              <w:t xml:space="preserve">A: Extremely Unlikely</w:t>
+            </w:r>
+          </w:p>
+        </w:tc>
+        <w:tc>
+          <w:tcPr>
+            <w:tcW w:w="2452" w:type="dxa"/>
+            <w:tcBorders>
+              <w:top w:val="single" w:sz="4" w:space="0" w:color="000000"/>
+              <w:left w:val="single" w:sz="4" w:space="0" w:color="000000"/>
+              <w:bottom w:val="single" w:sz="4" w:space="0" w:color="000000"/>
+              <w:right w:val="single" w:sz="4" w:space="0" w:color="000000"/>
+            </w:tcBorders>
+            <w:shd w:val="clear" w:color="auto" w:fill="F2F2F2"/>
+            <w:tcMar>
+              <w:top w:w="30" w:type="dxa"/>
+              <w:left w:w="40" w:type="dxa"/>
+              <w:bottom w:w="30" w:type="dxa"/>
+              <w:right w:w="40" w:type="dxa"/>
+            </w:tcMar>
+            <w:vAlign w:val="center"/>
+          </w:tcPr>
+          <w:p>
+            <w:pPr>
+              <w:spacing w:before="0" w:after="0"/>
+              <w:jc w:val="center"/>
+              <w:rPr>
+                <w:rFonts w:ascii="Arial" w:hAnsi="Arial" w:cs="Arial"/>
+                <w:sz w:val="18"/>
+                <w:szCs w:val="18"/>
+              </w:rPr>
+            </w:pPr>
+            <w:r>
+              <w:rPr>
+                <w:rFonts w:ascii="Arial" w:hAnsi="Arial" w:cs="Arial" w:eastAsia="Arial"/>
+                <w:b/>
+                <w:bCs/>
+                <w:sz w:val="18"/>
+                <w:szCs w:val="18"/>
+                <w:lang w:val="en-GB"/>
+              </w:rPr>
+              <w:t xml:space="preserve">B: Very Unlikely</w:t>
+            </w:r>
+          </w:p>
+        </w:tc>
+        <w:tc>
+          <w:tcPr>
+            <w:tcW w:w="2452" w:type="dxa"/>
+            <w:tcBorders>
+              <w:top w:val="single" w:sz="4" w:space="0" w:color="000000"/>
+              <w:left w:val="single" w:sz="4" w:space="0" w:color="000000"/>
+              <w:bottom w:val="single" w:sz="4" w:space="0" w:color="000000"/>
+              <w:right w:val="single" w:sz="4" w:space="0" w:color="000000"/>
+            </w:tcBorders>
+            <w:shd w:val="clear" w:color="auto" w:fill="F2F2F2"/>
+            <w:tcMar>
+              <w:top w:w="30" w:type="dxa"/>
+              <w:left w:w="40" w:type="dxa"/>
+              <w:bottom w:w="30" w:type="dxa"/>
+              <w:right w:w="40" w:type="dxa"/>
+            </w:tcMar>
+            <w:vAlign w:val="center"/>
+          </w:tcPr>
+          <w:p>
+            <w:pPr>
+              <w:spacing w:before="0" w:after="0"/>
+              <w:jc w:val="center"/>
+              <w:rPr>
+                <w:rFonts w:ascii="Arial" w:hAnsi="Arial" w:cs="Arial"/>
+                <w:sz w:val="18"/>
+                <w:szCs w:val="18"/>
+              </w:rPr>
+            </w:pPr>
+            <w:r>
+              <w:rPr>
+                <w:rFonts w:ascii="Arial" w:hAnsi="Arial" w:cs="Arial" w:eastAsia="Arial"/>
+                <w:b/>
+                <w:bCs/>
+                <w:sz w:val="18"/>
+                <w:szCs w:val="18"/>
+                <w:lang w:val="en-GB"/>
+              </w:rPr>
+              <w:t xml:space="preserve">C: Unlikely</w:t>
+            </w:r>
+          </w:p>
+        </w:tc>
+        <w:tc>
+          <w:tcPr>
+            <w:tcW w:w="2452" w:type="dxa"/>
+            <w:tcBorders>
+              <w:top w:val="single" w:sz="4" w:space="0" w:color="000000"/>
+              <w:left w:val="single" w:sz="4" w:space="0" w:color="000000"/>
+              <w:bottom w:val="single" w:sz="4" w:space="0" w:color="000000"/>
+              <w:right w:val="single" w:sz="4" w:space="0" w:color="000000"/>
+            </w:tcBorders>
+            <w:shd w:val="clear" w:color="auto" w:fill="F2F2F2"/>
+            <w:tcMar>
+              <w:top w:w="30" w:type="dxa"/>
+              <w:left w:w="40" w:type="dxa"/>
+              <w:bottom w:w="30" w:type="dxa"/>
+              <w:right w:w="40" w:type="dxa"/>
+            </w:tcMar>
+            <w:vAlign w:val="center"/>
+          </w:tcPr>
+          <w:p>
+            <w:pPr>
+              <w:spacing w:before="0" w:after="0"/>
+              <w:jc w:val="center"/>
+              <w:rPr>
+                <w:rFonts w:ascii="Arial" w:hAnsi="Arial" w:cs="Arial"/>
+                <w:sz w:val="18"/>
+                <w:szCs w:val="18"/>
+              </w:rPr>
+            </w:pPr>
+            <w:r>
+              <w:rPr>
+                <w:rFonts w:ascii="Arial" w:hAnsi="Arial" w:cs="Arial" w:eastAsia="Arial"/>
+                <w:b/>
+                <w:bCs/>
+                <w:sz w:val="18"/>
+                <w:szCs w:val="18"/>
+                <w:lang w:val="en-GB"/>
+              </w:rPr>
+              <w:t xml:space="preserve">D: Somewhat likely</w:t>
+            </w:r>
+          </w:p>
+        </w:tc>
+        <w:tc>
+          <w:tcPr>
+            <w:tcW w:w="2451" w:type="dxa"/>
+            <w:tcBorders>
+              <w:top w:val="single" w:sz="4" w:space="0" w:color="000000"/>
+              <w:left w:val="single" w:sz="4" w:space="0" w:color="000000"/>
+              <w:bottom w:val="single" w:sz="4" w:space="0" w:color="000000"/>
+              <w:right w:val="single" w:sz="4" w:space="0" w:color="000000"/>
+            </w:tcBorders>
+            <w:shd w:val="clear" w:color="auto" w:fill="F2F2F2"/>
+            <w:tcMar>
+              <w:top w:w="30" w:type="dxa"/>
+              <w:left w:w="40" w:type="dxa"/>
+              <w:bottom w:w="30" w:type="dxa"/>
+              <w:right w:w="40" w:type="dxa"/>
+            </w:tcMar>
+            <w:vAlign w:val="center"/>
+          </w:tcPr>
+          <w:p>
+            <w:pPr>
+              <w:spacing w:before="0" w:after="0"/>
+              <w:jc w:val="center"/>
+              <w:rPr>
+                <w:rFonts w:ascii="Arial" w:hAnsi="Arial" w:cs="Arial"/>
+                <w:sz w:val="18"/>
+                <w:szCs w:val="18"/>
+              </w:rPr>
+            </w:pPr>
+            <w:r>
+              <w:rPr>
+                <w:rFonts w:ascii="Arial" w:hAnsi="Arial" w:cs="Arial" w:eastAsia="Arial"/>
+                <w:b/>
+                <w:bCs/>
+                <w:sz w:val="18"/>
+                <w:szCs w:val="18"/>
+                <w:lang w:val="en-GB"/>
+              </w:rPr>
+              <w:t xml:space="preserve">E: Likely</w:t>
+            </w:r>
+          </w:p>
+        </w:tc>
+      </w:tr>
+      <w:tr>
+        <w:trPr>
+          <w:cantSplit/>
+          <w:trHeight w:val="560" w:hRule="atLeast"/>
+        </w:trPr>
+        <w:tc>
+          <w:tcPr>
+            <w:tcW w:w="900" w:type="dxa"/>
+            <w:vMerge w:val="restart"/>
+            <w:tcBorders>
+              <w:top w:val="single" w:sz="4" w:space="0" w:color="000000"/>
+              <w:left w:val="single" w:sz="4" w:space="0" w:color="000000"/>
+              <w:bottom w:val="single" w:sz="4" w:space="0" w:color="000000"/>
+              <w:right w:val="single" w:sz="4" w:space="0" w:color="000000"/>
+            </w:tcBorders>
+            <w:shd w:val="clear" w:color="auto" w:fill="F2F2F2"/>
+            <w:tcMar>
+              <w:top w:w="30" w:type="dxa"/>
+              <w:left w:w="40" w:type="dxa"/>
+              <w:bottom w:w="30" w:type="dxa"/>
+              <w:right w:w="40" w:type="dxa"/>
+            </w:tcMar>
+            <w:textDirection w:val="btLr"/>
+            <w:vAlign w:val="center"/>
+          </w:tcPr>
+          <w:p>
+            <w:pPr>
+              <w:spacing w:before="0" w:after="0"/>
+              <w:jc w:val="center"/>
+              <w:rPr>
+                <w:rFonts w:ascii="Arial" w:hAnsi="Arial" w:cs="Arial"/>
+                <w:sz w:val="18"/>
+                <w:szCs w:val="18"/>
+              </w:rPr>
+            </w:pPr>
+            <w:r>
+              <w:rPr>
+                <w:rFonts w:ascii="Arial" w:hAnsi="Arial" w:cs="Arial" w:eastAsia="Arial"/>
+                <w:b/>
+                <w:bCs/>
+                <w:sz w:val="16"/>
+                <w:szCs w:val="16"/>
+                <w:lang w:val="en-GB"/>
+              </w:rPr>
+              <w:t xml:space="preserve">CONSEQUENCES</w:t>
+            </w:r>
+          </w:p>
+        </w:tc>
+        <w:tc>
+          <w:tcPr>
+            <w:tcW w:w="1800" w:type="dxa"/>
+            <w:tcBorders>
+              <w:top w:val="single" w:sz="4" w:space="0" w:color="000000"/>
+              <w:left w:val="single" w:sz="4" w:space="0" w:color="000000"/>
+              <w:bottom w:val="single" w:sz="4" w:space="0" w:color="000000"/>
+              <w:right w:val="single" w:sz="4" w:space="0" w:color="000000"/>
+            </w:tcBorders>
+            <w:shd w:val="clear" w:color="auto" w:fill="F2F2F2"/>
+            <w:tcMar>
+              <w:top w:w="30" w:type="dxa"/>
+              <w:left w:w="40" w:type="dxa"/>
+              <w:bottom w:w="30" w:type="dxa"/>
+              <w:right w:w="40" w:type="dxa"/>
+            </w:tcMar>
+            <w:vAlign w:val="center"/>
+          </w:tcPr>
+          <w:p>
+            <w:pPr>
+              <w:spacing w:before="0" w:after="0"/>
+              <w:jc w:val="left"/>
+              <w:rPr>
+                <w:rFonts w:ascii="Arial" w:hAnsi="Arial" w:cs="Arial"/>
+                <w:sz w:val="18"/>
+                <w:szCs w:val="18"/>
+              </w:rPr>
+            </w:pPr>
+            <w:r>
+              <w:rPr>
+                <w:rFonts w:ascii="Arial" w:hAnsi="Arial" w:cs="Arial" w:eastAsia="Arial"/>
+                <w:b/>
+                <w:bCs/>
+                <w:sz w:val="18"/>
+                <w:szCs w:val="18"/>
+                <w:lang w:val="en-GB"/>
+              </w:rPr>
+              <w:t xml:space="preserve">5 – Major</w:t>
+            </w:r>
+          </w:p>
+        </w:tc>
+        <w:tc>
+          <w:tcPr>
+            <w:tcW w:w="2452" w:type="dxa"/>
+            <w:tcBorders>
+              <w:top w:val="single" w:sz="4" w:space="0" w:color="000000"/>
+              <w:left w:val="single" w:sz="4" w:space="0" w:color="000000"/>
+              <w:bottom w:val="single" w:sz="4" w:space="0" w:color="000000"/>
+              <w:right w:val="single" w:sz="4" w:space="0" w:color="000000"/>
+            </w:tcBorders>
+            <w:shd w:val="clear" w:color="auto" w:fill="FFFF00"/>
+            <w:tcMar>
+              <w:top w:w="30" w:type="dxa"/>
+              <w:left w:w="40" w:type="dxa"/>
+              <w:bottom w:w="30" w:type="dxa"/>
+              <w:right w:w="40" w:type="dxa"/>
+            </w:tcMar>
+            <w:vAlign w:val="center"/>
+          </w:tcPr>
+          <w:p>
+            <w:pPr>
+              <w:spacing w:before="0" w:after="0"/>
+              <w:jc w:val="center"/>
+              <w:rPr>
+                <w:rFonts w:ascii="Arial" w:hAnsi="Arial" w:cs="Arial"/>
+                <w:sz w:val="18"/>
+                <w:szCs w:val="18"/>
+              </w:rPr>
+            </w:pPr>
+            <w:r>
+              <w:rPr>
+                <w:rFonts w:ascii="Arial" w:hAnsi="Arial" w:cs="Arial" w:eastAsia="Arial"/>
+                <w:b/>
+                <w:bCs/>
+                <w:sz w:val="18"/>
+                <w:szCs w:val="18"/>
+                <w:lang w:val="en-GB"/>
+              </w:rPr>
+              <w:t xml:space="preserve">MED</w:t>
+            </w:r>
+          </w:p>
+        </w:tc>
+        <w:tc>
+          <w:tcPr>
+            <w:tcW w:w="2452" w:type="dxa"/>
+            <w:tcBorders>
+              <w:top w:val="single" w:sz="4" w:space="0" w:color="000000"/>
+              <w:left w:val="single" w:sz="4" w:space="0" w:color="000000"/>
+              <w:bottom w:val="single" w:sz="4" w:space="0" w:color="000000"/>
+              <w:right w:val="single" w:sz="4" w:space="0" w:color="000000"/>
+            </w:tcBorders>
+            <w:shd w:val="clear" w:color="auto" w:fill="FFFF00"/>
+            <w:tcMar>
+              <w:top w:w="30" w:type="dxa"/>
+              <w:left w:w="40" w:type="dxa"/>
+              <w:bottom w:w="30" w:type="dxa"/>
+              <w:right w:w="40" w:type="dxa"/>
+            </w:tcMar>
+            <w:vAlign w:val="center"/>
+          </w:tcPr>
+          <w:p>
+            <w:pPr>
+              <w:spacing w:before="0" w:after="0"/>
+              <w:jc w:val="center"/>
+              <w:rPr>
+                <w:rFonts w:ascii="Arial" w:hAnsi="Arial" w:cs="Arial"/>
+                <w:sz w:val="18"/>
+                <w:szCs w:val="18"/>
+              </w:rPr>
+            </w:pPr>
+            <w:r>
+              <w:rPr>
+                <w:rFonts w:ascii="Arial" w:hAnsi="Arial" w:cs="Arial" w:eastAsia="Arial"/>
+                <w:b/>
+                <w:bCs/>
+                <w:sz w:val="18"/>
+                <w:szCs w:val="18"/>
+                <w:lang w:val="en-GB"/>
+              </w:rPr>
+              <w:t xml:space="preserve">MED</w:t>
+            </w:r>
+          </w:p>
+        </w:tc>
+        <w:tc>
+          <w:tcPr>
+            <w:tcW w:w="2452" w:type="dxa"/>
+            <w:tcBorders>
+              <w:top w:val="single" w:sz="4" w:space="0" w:color="000000"/>
+              <w:left w:val="single" w:sz="4" w:space="0" w:color="000000"/>
+              <w:bottom w:val="single" w:sz="4" w:space="0" w:color="000000"/>
+              <w:right w:val="single" w:sz="4" w:space="0" w:color="000000"/>
+            </w:tcBorders>
+            <w:shd w:val="clear" w:color="auto" w:fill="FF0000"/>
+            <w:tcMar>
+              <w:top w:w="30" w:type="dxa"/>
+              <w:left w:w="40" w:type="dxa"/>
+              <w:bottom w:w="30" w:type="dxa"/>
+              <w:right w:w="40" w:type="dxa"/>
+            </w:tcMar>
+            <w:vAlign w:val="center"/>
+          </w:tcPr>
+          <w:p>
+            <w:pPr>
+              <w:spacing w:before="0" w:after="0"/>
+              <w:jc w:val="center"/>
+              <w:rPr>
+                <w:rFonts w:ascii="Arial" w:hAnsi="Arial" w:cs="Arial"/>
+                <w:sz w:val="18"/>
+                <w:szCs w:val="18"/>
+              </w:rPr>
+            </w:pPr>
+            <w:r>
+              <w:rPr>
+                <w:rFonts w:ascii="Arial" w:hAnsi="Arial" w:cs="Arial" w:eastAsia="Arial"/>
+                <w:b/>
+                <w:bCs/>
+                <w:sz w:val="18"/>
+                <w:szCs w:val="18"/>
+                <w:lang w:val="en-GB"/>
+              </w:rPr>
+              <w:t xml:space="preserve">HIGH</w:t>
+            </w:r>
+          </w:p>
+        </w:tc>
+        <w:tc>
+          <w:tcPr>
+            <w:tcW w:w="2452" w:type="dxa"/>
+            <w:tcBorders>
+              <w:top w:val="single" w:sz="4" w:space="0" w:color="000000"/>
+              <w:left w:val="single" w:sz="4" w:space="0" w:color="000000"/>
+              <w:bottom w:val="single" w:sz="4" w:space="0" w:color="000000"/>
+              <w:right w:val="single" w:sz="4" w:space="0" w:color="000000"/>
+            </w:tcBorders>
+            <w:shd w:val="clear" w:color="auto" w:fill="FF0000"/>
+            <w:tcMar>
+              <w:top w:w="30" w:type="dxa"/>
+              <w:left w:w="40" w:type="dxa"/>
+              <w:bottom w:w="30" w:type="dxa"/>
+              <w:right w:w="40" w:type="dxa"/>
+            </w:tcMar>
+            <w:vAlign w:val="center"/>
+          </w:tcPr>
+          <w:p>
+            <w:pPr>
+              <w:spacing w:before="0" w:after="0"/>
+              <w:jc w:val="center"/>
+              <w:rPr>
+                <w:rFonts w:ascii="Arial" w:hAnsi="Arial" w:cs="Arial"/>
+                <w:sz w:val="18"/>
+                <w:szCs w:val="18"/>
+              </w:rPr>
+            </w:pPr>
+            <w:r>
+              <w:rPr>
+                <w:rFonts w:ascii="Arial" w:hAnsi="Arial" w:cs="Arial" w:eastAsia="Arial"/>
+                <w:b/>
+                <w:bCs/>
+                <w:sz w:val="18"/>
+                <w:szCs w:val="18"/>
+                <w:lang w:val="en-GB"/>
+              </w:rPr>
+              <w:t xml:space="preserve">HIGH</w:t>
+            </w:r>
+          </w:p>
+        </w:tc>
+        <w:tc>
+          <w:tcPr>
+            <w:tcW w:w="2451" w:type="dxa"/>
+            <w:tcBorders>
+              <w:top w:val="single" w:sz="4" w:space="0" w:color="000000"/>
+              <w:left w:val="single" w:sz="4" w:space="0" w:color="000000"/>
+              <w:bottom w:val="single" w:sz="4" w:space="0" w:color="000000"/>
+              <w:right w:val="single" w:sz="4" w:space="0" w:color="000000"/>
+            </w:tcBorders>
+            <w:shd w:val="clear" w:color="auto" w:fill="FF0000"/>
+            <w:tcMar>
+              <w:top w:w="30" w:type="dxa"/>
+              <w:left w:w="40" w:type="dxa"/>
+              <w:bottom w:w="30" w:type="dxa"/>
+              <w:right w:w="40" w:type="dxa"/>
+            </w:tcMar>
+            <w:vAlign w:val="center"/>
+          </w:tcPr>
+          <w:p>
+            <w:pPr>
+              <w:spacing w:before="0" w:after="0"/>
+              <w:jc w:val="center"/>
+              <w:rPr>
+                <w:rFonts w:ascii="Arial" w:hAnsi="Arial" w:cs="Arial"/>
+                <w:sz w:val="18"/>
+                <w:szCs w:val="18"/>
+              </w:rPr>
+            </w:pPr>
+            <w:r>
+              <w:rPr>
+                <w:rFonts w:ascii="Arial" w:hAnsi="Arial" w:cs="Arial" w:eastAsia="Arial"/>
+                <w:b/>
+                <w:bCs/>
+                <w:sz w:val="18"/>
+                <w:szCs w:val="18"/>
+                <w:lang w:val="en-GB"/>
+              </w:rPr>
+              <w:t xml:space="preserve">HIGH</w:t>
+            </w:r>
+          </w:p>
+        </w:tc>
+      </w:tr>
+      <w:tr>
+        <w:trPr>
+          <w:cantSplit/>
+          <w:trHeight w:val="560" w:hRule="atLeast"/>
+        </w:trPr>
+        <w:tc>
+          <w:tcPr>
+            <w:tcW w:w="900" w:type="dxa"/>
+            <w:vMerge/>
+            <w:tcBorders>
+              <w:top w:val="single" w:sz="4" w:space="0" w:color="000000"/>
+              <w:left w:val="single" w:sz="4" w:space="0" w:color="000000"/>
+              <w:bottom w:val="single" w:sz="4" w:space="0" w:color="000000"/>
+              <w:right w:val="single" w:sz="4" w:space="0" w:color="000000"/>
+            </w:tcBorders>
+            <w:shd w:val="clear" w:color="auto" w:fill="F2F2F2"/>
+            <w:tcMar>
+              <w:top w:w="30" w:type="dxa"/>
+              <w:left w:w="40" w:type="dxa"/>
+              <w:bottom w:w="30" w:type="dxa"/>
+              <w:right w:w="40" w:type="dxa"/>
+            </w:tcMar>
+            <w:vAlign w:val="top"/>
+          </w:tcPr>
+          <w:p>
+            <w:pPr>
+              <w:spacing w:before="0" w:after="0"/>
+              <w:jc w:val="left"/>
+              <w:rPr>
+                <w:rFonts w:ascii="Arial" w:hAnsi="Arial" w:cs="Arial"/>
+                <w:sz w:val="18"/>
+                <w:szCs w:val="18"/>
+              </w:rPr>
+            </w:pPr>
+          </w:p>
+        </w:tc>
+        <w:tc>
+          <w:tcPr>
+            <w:tcW w:w="1800" w:type="dxa"/>
+            <w:tcBorders>
+              <w:top w:val="single" w:sz="4" w:space="0" w:color="000000"/>
+              <w:left w:val="single" w:sz="4" w:space="0" w:color="000000"/>
+              <w:bottom w:val="single" w:sz="4" w:space="0" w:color="000000"/>
+              <w:right w:val="single" w:sz="4" w:space="0" w:color="000000"/>
+            </w:tcBorders>
+            <w:shd w:val="clear" w:color="auto" w:fill="F2F2F2"/>
+            <w:tcMar>
+              <w:top w:w="30" w:type="dxa"/>
+              <w:left w:w="40" w:type="dxa"/>
+              <w:bottom w:w="30" w:type="dxa"/>
+              <w:right w:w="40" w:type="dxa"/>
+            </w:tcMar>
+            <w:vAlign w:val="center"/>
+          </w:tcPr>
+          <w:p>
+            <w:pPr>
+              <w:spacing w:before="0" w:after="0"/>
+              <w:jc w:val="left"/>
+              <w:rPr>
+                <w:rFonts w:ascii="Arial" w:hAnsi="Arial" w:cs="Arial"/>
+                <w:sz w:val="18"/>
+                <w:szCs w:val="18"/>
+              </w:rPr>
+            </w:pPr>
+            <w:r>
+              <w:rPr>
+                <w:rFonts w:ascii="Arial" w:hAnsi="Arial" w:cs="Arial" w:eastAsia="Arial"/>
+                <w:b/>
+                <w:bCs/>
+                <w:sz w:val="18"/>
+                <w:szCs w:val="18"/>
+                <w:lang w:val="en-GB"/>
+              </w:rPr>
+              <w:t xml:space="preserve">4 – Serious</w:t>
+            </w:r>
+          </w:p>
+        </w:tc>
+        <w:tc>
+          <w:tcPr>
+            <w:tcW w:w="2452" w:type="dxa"/>
+            <w:tcBorders>
+              <w:top w:val="single" w:sz="4" w:space="0" w:color="000000"/>
+              <w:left w:val="single" w:sz="4" w:space="0" w:color="000000"/>
+              <w:bottom w:val="single" w:sz="4" w:space="0" w:color="000000"/>
+              <w:right w:val="single" w:sz="4" w:space="0" w:color="000000"/>
+            </w:tcBorders>
+            <w:shd w:val="clear" w:color="auto" w:fill="00B050"/>
+            <w:tcMar>
+              <w:top w:w="30" w:type="dxa"/>
+              <w:left w:w="40" w:type="dxa"/>
+              <w:bottom w:w="30" w:type="dxa"/>
+              <w:right w:w="40" w:type="dxa"/>
+            </w:tcMar>
+            <w:vAlign w:val="center"/>
+          </w:tcPr>
+          <w:p>
+            <w:pPr>
+              <w:spacing w:before="0" w:after="0"/>
+              <w:jc w:val="center"/>
+              <w:rPr>
+                <w:rFonts w:ascii="Arial" w:hAnsi="Arial" w:cs="Arial"/>
+                <w:sz w:val="18"/>
+                <w:szCs w:val="18"/>
+              </w:rPr>
+            </w:pPr>
+            <w:r>
+              <w:rPr>
+                <w:rFonts w:ascii="Arial" w:hAnsi="Arial" w:cs="Arial" w:eastAsia="Arial"/>
+                <w:b/>
+                <w:bCs/>
+                <w:sz w:val="18"/>
+                <w:szCs w:val="18"/>
+                <w:lang w:val="en-GB"/>
+              </w:rPr>
+              <w:t xml:space="preserve">LOW</w:t>
+            </w:r>
+          </w:p>
+        </w:tc>
+        <w:tc>
+          <w:tcPr>
+            <w:tcW w:w="2452" w:type="dxa"/>
+            <w:tcBorders>
+              <w:top w:val="single" w:sz="4" w:space="0" w:color="000000"/>
+              <w:left w:val="single" w:sz="4" w:space="0" w:color="000000"/>
+              <w:bottom w:val="single" w:sz="4" w:space="0" w:color="000000"/>
+              <w:right w:val="single" w:sz="4" w:space="0" w:color="000000"/>
+            </w:tcBorders>
+            <w:shd w:val="clear" w:color="auto" w:fill="FFFF00"/>
+            <w:tcMar>
+              <w:top w:w="30" w:type="dxa"/>
+              <w:left w:w="40" w:type="dxa"/>
+              <w:bottom w:w="30" w:type="dxa"/>
+              <w:right w:w="40" w:type="dxa"/>
+            </w:tcMar>
+            <w:vAlign w:val="center"/>
+          </w:tcPr>
+          <w:p>
+            <w:pPr>
+              <w:spacing w:before="0" w:after="0"/>
+              <w:jc w:val="center"/>
+              <w:rPr>
+                <w:rFonts w:ascii="Arial" w:hAnsi="Arial" w:cs="Arial"/>
+                <w:sz w:val="18"/>
+                <w:szCs w:val="18"/>
+              </w:rPr>
+            </w:pPr>
+            <w:r>
+              <w:rPr>
+                <w:rFonts w:ascii="Arial" w:hAnsi="Arial" w:cs="Arial" w:eastAsia="Arial"/>
+                <w:b/>
+                <w:bCs/>
+                <w:sz w:val="18"/>
+                <w:szCs w:val="18"/>
+                <w:lang w:val="en-GB"/>
+              </w:rPr>
+              <w:t xml:space="preserve">MED</w:t>
+            </w:r>
+          </w:p>
+        </w:tc>
+        <w:tc>
+          <w:tcPr>
+            <w:tcW w:w="2452" w:type="dxa"/>
+            <w:tcBorders>
+              <w:top w:val="single" w:sz="4" w:space="0" w:color="000000"/>
+              <w:left w:val="single" w:sz="4" w:space="0" w:color="000000"/>
+              <w:bottom w:val="single" w:sz="4" w:space="0" w:color="000000"/>
+              <w:right w:val="single" w:sz="4" w:space="0" w:color="000000"/>
+            </w:tcBorders>
+            <w:shd w:val="clear" w:color="auto" w:fill="FFFF00"/>
+            <w:tcMar>
+              <w:top w:w="30" w:type="dxa"/>
+              <w:left w:w="40" w:type="dxa"/>
+              <w:bottom w:w="30" w:type="dxa"/>
+              <w:right w:w="40" w:type="dxa"/>
+            </w:tcMar>
+            <w:vAlign w:val="center"/>
+          </w:tcPr>
+          <w:p>
+            <w:pPr>
+              <w:spacing w:before="0" w:after="0"/>
+              <w:jc w:val="center"/>
+              <w:rPr>
+                <w:rFonts w:ascii="Arial" w:hAnsi="Arial" w:cs="Arial"/>
+                <w:sz w:val="18"/>
+                <w:szCs w:val="18"/>
+              </w:rPr>
+            </w:pPr>
+            <w:r>
+              <w:rPr>
+                <w:rFonts w:ascii="Arial" w:hAnsi="Arial" w:cs="Arial" w:eastAsia="Arial"/>
+                <w:b/>
+                <w:bCs/>
+                <w:sz w:val="18"/>
+                <w:szCs w:val="18"/>
+                <w:lang w:val="en-GB"/>
+              </w:rPr>
+              <w:t xml:space="preserve">MED</w:t>
+            </w:r>
+          </w:p>
+        </w:tc>
+        <w:tc>
+          <w:tcPr>
+            <w:tcW w:w="2452" w:type="dxa"/>
+            <w:tcBorders>
+              <w:top w:val="single" w:sz="4" w:space="0" w:color="000000"/>
+              <w:left w:val="single" w:sz="4" w:space="0" w:color="000000"/>
+              <w:bottom w:val="single" w:sz="4" w:space="0" w:color="000000"/>
+              <w:right w:val="single" w:sz="4" w:space="0" w:color="000000"/>
+            </w:tcBorders>
+            <w:shd w:val="clear" w:color="auto" w:fill="FF0000"/>
+            <w:tcMar>
+              <w:top w:w="30" w:type="dxa"/>
+              <w:left w:w="40" w:type="dxa"/>
+              <w:bottom w:w="30" w:type="dxa"/>
+              <w:right w:w="40" w:type="dxa"/>
+            </w:tcMar>
+            <w:vAlign w:val="center"/>
+          </w:tcPr>
+          <w:p>
+            <w:pPr>
+              <w:spacing w:before="0" w:after="0"/>
+              <w:jc w:val="center"/>
+              <w:rPr>
+                <w:rFonts w:ascii="Arial" w:hAnsi="Arial" w:cs="Arial"/>
+                <w:sz w:val="18"/>
+                <w:szCs w:val="18"/>
+              </w:rPr>
+            </w:pPr>
+            <w:r>
+              <w:rPr>
+                <w:rFonts w:ascii="Arial" w:hAnsi="Arial" w:cs="Arial" w:eastAsia="Arial"/>
+                <w:b/>
+                <w:bCs/>
+                <w:sz w:val="18"/>
+                <w:szCs w:val="18"/>
+                <w:lang w:val="en-GB"/>
+              </w:rPr>
+              <w:t xml:space="preserve">HIGH</w:t>
+            </w:r>
+          </w:p>
+        </w:tc>
+        <w:tc>
+          <w:tcPr>
+            <w:tcW w:w="2451" w:type="dxa"/>
+            <w:tcBorders>
+              <w:top w:val="single" w:sz="4" w:space="0" w:color="000000"/>
+              <w:left w:val="single" w:sz="4" w:space="0" w:color="000000"/>
+              <w:bottom w:val="single" w:sz="4" w:space="0" w:color="000000"/>
+              <w:right w:val="single" w:sz="4" w:space="0" w:color="000000"/>
+            </w:tcBorders>
+            <w:shd w:val="clear" w:color="auto" w:fill="FF0000"/>
+            <w:tcMar>
+              <w:top w:w="30" w:type="dxa"/>
+              <w:left w:w="40" w:type="dxa"/>
+              <w:bottom w:w="30" w:type="dxa"/>
+              <w:right w:w="40" w:type="dxa"/>
+            </w:tcMar>
+            <w:vAlign w:val="center"/>
+          </w:tcPr>
+          <w:p>
+            <w:pPr>
+              <w:spacing w:before="0" w:after="0"/>
+              <w:jc w:val="center"/>
+              <w:rPr>
+                <w:rFonts w:ascii="Arial" w:hAnsi="Arial" w:cs="Arial"/>
+                <w:sz w:val="18"/>
+                <w:szCs w:val="18"/>
+              </w:rPr>
+            </w:pPr>
+            <w:r>
+              <w:rPr>
+                <w:rFonts w:ascii="Arial" w:hAnsi="Arial" w:cs="Arial" w:eastAsia="Arial"/>
+                <w:b/>
+                <w:bCs/>
+                <w:sz w:val="18"/>
+                <w:szCs w:val="18"/>
+                <w:lang w:val="en-GB"/>
+              </w:rPr>
+              <w:t xml:space="preserve">HIGH</w:t>
+            </w:r>
+          </w:p>
+        </w:tc>
+      </w:tr>
+      <w:tr>
+        <w:trPr>
+          <w:cantSplit/>
+          <w:trHeight w:val="560" w:hRule="atLeast"/>
+        </w:trPr>
+        <w:tc>
+          <w:tcPr>
+            <w:tcW w:w="900" w:type="dxa"/>
+            <w:vMerge/>
+            <w:tcBorders>
+              <w:top w:val="single" w:sz="4" w:space="0" w:color="000000"/>
+              <w:left w:val="single" w:sz="4" w:space="0" w:color="000000"/>
+              <w:bottom w:val="single" w:sz="4" w:space="0" w:color="000000"/>
+              <w:right w:val="single" w:sz="4" w:space="0" w:color="000000"/>
+            </w:tcBorders>
+            <w:shd w:val="clear" w:color="auto" w:fill="F2F2F2"/>
+            <w:tcMar>
+              <w:top w:w="30" w:type="dxa"/>
+              <w:left w:w="40" w:type="dxa"/>
+              <w:bottom w:w="30" w:type="dxa"/>
+              <w:right w:w="40" w:type="dxa"/>
+            </w:tcMar>
+            <w:vAlign w:val="top"/>
+          </w:tcPr>
+          <w:p>
+            <w:pPr>
+              <w:spacing w:before="0" w:after="0"/>
+              <w:jc w:val="left"/>
+              <w:rPr>
+                <w:rFonts w:ascii="Arial" w:hAnsi="Arial" w:cs="Arial"/>
+                <w:sz w:val="18"/>
+                <w:szCs w:val="18"/>
+              </w:rPr>
+            </w:pPr>
+          </w:p>
+        </w:tc>
+        <w:tc>
+          <w:tcPr>
+            <w:tcW w:w="1800" w:type="dxa"/>
+            <w:tcBorders>
+              <w:top w:val="single" w:sz="4" w:space="0" w:color="000000"/>
+              <w:left w:val="single" w:sz="4" w:space="0" w:color="000000"/>
+              <w:bottom w:val="single" w:sz="4" w:space="0" w:color="000000"/>
+              <w:right w:val="single" w:sz="4" w:space="0" w:color="000000"/>
+            </w:tcBorders>
+            <w:shd w:val="clear" w:color="auto" w:fill="F2F2F2"/>
+            <w:tcMar>
+              <w:top w:w="30" w:type="dxa"/>
+              <w:left w:w="40" w:type="dxa"/>
+              <w:bottom w:w="30" w:type="dxa"/>
+              <w:right w:w="40" w:type="dxa"/>
+            </w:tcMar>
+            <w:vAlign w:val="center"/>
+          </w:tcPr>
+          <w:p>
+            <w:pPr>
+              <w:spacing w:before="0" w:after="0"/>
+              <w:jc w:val="left"/>
+              <w:rPr>
+                <w:rFonts w:ascii="Arial" w:hAnsi="Arial" w:cs="Arial"/>
+                <w:sz w:val="18"/>
+                <w:szCs w:val="18"/>
+              </w:rPr>
+            </w:pPr>
+            <w:r>
+              <w:rPr>
+                <w:rFonts w:ascii="Arial" w:hAnsi="Arial" w:cs="Arial" w:eastAsia="Arial"/>
+                <w:b/>
+                <w:bCs/>
+                <w:sz w:val="18"/>
+                <w:szCs w:val="18"/>
+                <w:lang w:val="en-GB"/>
+              </w:rPr>
+              <w:t xml:space="preserve">3 – Moderate</w:t>
+            </w:r>
+          </w:p>
+        </w:tc>
+        <w:tc>
+          <w:tcPr>
+            <w:tcW w:w="2452" w:type="dxa"/>
+            <w:tcBorders>
+              <w:top w:val="single" w:sz="4" w:space="0" w:color="000000"/>
+              <w:left w:val="single" w:sz="4" w:space="0" w:color="000000"/>
+              <w:bottom w:val="single" w:sz="4" w:space="0" w:color="000000"/>
+              <w:right w:val="single" w:sz="4" w:space="0" w:color="000000"/>
+            </w:tcBorders>
+            <w:shd w:val="clear" w:color="auto" w:fill="00B050"/>
+            <w:tcMar>
+              <w:top w:w="30" w:type="dxa"/>
+              <w:left w:w="40" w:type="dxa"/>
+              <w:bottom w:w="30" w:type="dxa"/>
+              <w:right w:w="40" w:type="dxa"/>
+            </w:tcMar>
+            <w:vAlign w:val="center"/>
+          </w:tcPr>
+          <w:p>
+            <w:pPr>
+              <w:spacing w:before="0" w:after="0"/>
+              <w:jc w:val="center"/>
+              <w:rPr>
+                <w:rFonts w:ascii="Arial" w:hAnsi="Arial" w:cs="Arial"/>
+                <w:sz w:val="18"/>
+                <w:szCs w:val="18"/>
+              </w:rPr>
+            </w:pPr>
+            <w:r>
+              <w:rPr>
+                <w:rFonts w:ascii="Arial" w:hAnsi="Arial" w:cs="Arial" w:eastAsia="Arial"/>
+                <w:b/>
+                <w:bCs/>
+                <w:sz w:val="18"/>
+                <w:szCs w:val="18"/>
+                <w:lang w:val="en-GB"/>
+              </w:rPr>
+              <w:t xml:space="preserve">LOW</w:t>
+            </w:r>
+          </w:p>
+        </w:tc>
+        <w:tc>
+          <w:tcPr>
+            <w:tcW w:w="2452" w:type="dxa"/>
+            <w:tcBorders>
+              <w:top w:val="single" w:sz="4" w:space="0" w:color="000000"/>
+              <w:left w:val="single" w:sz="4" w:space="0" w:color="000000"/>
+              <w:bottom w:val="single" w:sz="4" w:space="0" w:color="000000"/>
+              <w:right w:val="single" w:sz="4" w:space="0" w:color="000000"/>
+            </w:tcBorders>
+            <w:shd w:val="clear" w:color="auto" w:fill="00B050"/>
+            <w:tcMar>
+              <w:top w:w="30" w:type="dxa"/>
+              <w:left w:w="40" w:type="dxa"/>
+              <w:bottom w:w="30" w:type="dxa"/>
+              <w:right w:w="40" w:type="dxa"/>
+            </w:tcMar>
+            <w:vAlign w:val="center"/>
+          </w:tcPr>
+          <w:p>
+            <w:pPr>
+              <w:spacing w:before="0" w:after="0"/>
+              <w:jc w:val="center"/>
+              <w:rPr>
+                <w:rFonts w:ascii="Arial" w:hAnsi="Arial" w:cs="Arial"/>
+                <w:sz w:val="18"/>
+                <w:szCs w:val="18"/>
+              </w:rPr>
+            </w:pPr>
+            <w:r>
+              <w:rPr>
+                <w:rFonts w:ascii="Arial" w:hAnsi="Arial" w:cs="Arial" w:eastAsia="Arial"/>
+                <w:b/>
+                <w:bCs/>
+                <w:sz w:val="18"/>
+                <w:szCs w:val="18"/>
+                <w:lang w:val="en-GB"/>
+              </w:rPr>
+              <w:t xml:space="preserve">LOW</w:t>
+            </w:r>
+          </w:p>
+        </w:tc>
+        <w:tc>
+          <w:tcPr>
+            <w:tcW w:w="2452" w:type="dxa"/>
+            <w:tcBorders>
+              <w:top w:val="single" w:sz="4" w:space="0" w:color="000000"/>
+              <w:left w:val="single" w:sz="4" w:space="0" w:color="000000"/>
+              <w:bottom w:val="single" w:sz="4" w:space="0" w:color="000000"/>
+              <w:right w:val="single" w:sz="4" w:space="0" w:color="000000"/>
+            </w:tcBorders>
+            <w:shd w:val="clear" w:color="auto" w:fill="FFFF00"/>
+            <w:tcMar>
+              <w:top w:w="30" w:type="dxa"/>
+              <w:left w:w="40" w:type="dxa"/>
+              <w:bottom w:w="30" w:type="dxa"/>
+              <w:right w:w="40" w:type="dxa"/>
+            </w:tcMar>
+            <w:vAlign w:val="center"/>
+          </w:tcPr>
+          <w:p>
+            <w:pPr>
+              <w:spacing w:before="0" w:after="0"/>
+              <w:jc w:val="center"/>
+              <w:rPr>
+                <w:rFonts w:ascii="Arial" w:hAnsi="Arial" w:cs="Arial"/>
+                <w:sz w:val="18"/>
+                <w:szCs w:val="18"/>
+              </w:rPr>
+            </w:pPr>
+            <w:r>
+              <w:rPr>
+                <w:rFonts w:ascii="Arial" w:hAnsi="Arial" w:cs="Arial" w:eastAsia="Arial"/>
+                <w:b/>
+                <w:bCs/>
+                <w:sz w:val="18"/>
+                <w:szCs w:val="18"/>
+                <w:lang w:val="en-GB"/>
+              </w:rPr>
+              <w:t xml:space="preserve">MED</w:t>
+            </w:r>
+          </w:p>
+        </w:tc>
+        <w:tc>
+          <w:tcPr>
+            <w:tcW w:w="2452" w:type="dxa"/>
+            <w:tcBorders>
+              <w:top w:val="single" w:sz="4" w:space="0" w:color="000000"/>
+              <w:left w:val="single" w:sz="4" w:space="0" w:color="000000"/>
+              <w:bottom w:val="single" w:sz="4" w:space="0" w:color="000000"/>
+              <w:right w:val="single" w:sz="4" w:space="0" w:color="000000"/>
+            </w:tcBorders>
+            <w:shd w:val="clear" w:color="auto" w:fill="FFFF00"/>
+            <w:tcMar>
+              <w:top w:w="30" w:type="dxa"/>
+              <w:left w:w="40" w:type="dxa"/>
+              <w:bottom w:w="30" w:type="dxa"/>
+              <w:right w:w="40" w:type="dxa"/>
+            </w:tcMar>
+            <w:vAlign w:val="center"/>
+          </w:tcPr>
+          <w:p>
+            <w:pPr>
+              <w:spacing w:before="0" w:after="0"/>
+              <w:jc w:val="center"/>
+              <w:rPr>
+                <w:rFonts w:ascii="Arial" w:hAnsi="Arial" w:cs="Arial"/>
+                <w:sz w:val="18"/>
+                <w:szCs w:val="18"/>
+              </w:rPr>
+            </w:pPr>
+            <w:r>
+              <w:rPr>
+                <w:rFonts w:ascii="Arial" w:hAnsi="Arial" w:cs="Arial" w:eastAsia="Arial"/>
+                <w:b/>
+                <w:bCs/>
+                <w:sz w:val="18"/>
+                <w:szCs w:val="18"/>
+                <w:lang w:val="en-GB"/>
+              </w:rPr>
+              <w:t xml:space="preserve">MED</w:t>
+            </w:r>
+          </w:p>
+        </w:tc>
+        <w:tc>
+          <w:tcPr>
+            <w:tcW w:w="2451" w:type="dxa"/>
+            <w:tcBorders>
+              <w:top w:val="single" w:sz="4" w:space="0" w:color="000000"/>
+              <w:left w:val="single" w:sz="4" w:space="0" w:color="000000"/>
+              <w:bottom w:val="single" w:sz="4" w:space="0" w:color="000000"/>
+              <w:right w:val="single" w:sz="4" w:space="0" w:color="000000"/>
+            </w:tcBorders>
+            <w:shd w:val="clear" w:color="auto" w:fill="FF0000"/>
+            <w:tcMar>
+              <w:top w:w="30" w:type="dxa"/>
+              <w:left w:w="40" w:type="dxa"/>
+              <w:bottom w:w="30" w:type="dxa"/>
+              <w:right w:w="40" w:type="dxa"/>
+            </w:tcMar>
+            <w:vAlign w:val="center"/>
+          </w:tcPr>
+          <w:p>
+            <w:pPr>
+              <w:spacing w:before="0" w:after="0"/>
+              <w:jc w:val="center"/>
+              <w:rPr>
+                <w:rFonts w:ascii="Arial" w:hAnsi="Arial" w:cs="Arial"/>
+                <w:sz w:val="18"/>
+                <w:szCs w:val="18"/>
+              </w:rPr>
+            </w:pPr>
+            <w:r>
+              <w:rPr>
+                <w:rFonts w:ascii="Arial" w:hAnsi="Arial" w:cs="Arial" w:eastAsia="Arial"/>
+                <w:b/>
+                <w:bCs/>
+                <w:sz w:val="18"/>
+                <w:szCs w:val="18"/>
+                <w:lang w:val="en-GB"/>
+              </w:rPr>
+              <w:t xml:space="preserve">HIGH</w:t>
+            </w:r>
+          </w:p>
+        </w:tc>
+      </w:tr>
+      <w:tr>
+        <w:trPr>
+          <w:cantSplit/>
+          <w:trHeight w:val="560" w:hRule="atLeast"/>
+        </w:trPr>
+        <w:tc>
+          <w:tcPr>
+            <w:tcW w:w="900" w:type="dxa"/>
+            <w:vMerge/>
+            <w:tcBorders>
+              <w:top w:val="single" w:sz="4" w:space="0" w:color="000000"/>
+              <w:left w:val="single" w:sz="4" w:space="0" w:color="000000"/>
+              <w:bottom w:val="single" w:sz="4" w:space="0" w:color="000000"/>
+              <w:right w:val="single" w:sz="4" w:space="0" w:color="000000"/>
+            </w:tcBorders>
+            <w:shd w:val="clear" w:color="auto" w:fill="F2F2F2"/>
+            <w:tcMar>
+              <w:top w:w="30" w:type="dxa"/>
+              <w:left w:w="40" w:type="dxa"/>
+              <w:bottom w:w="30" w:type="dxa"/>
+              <w:right w:w="40" w:type="dxa"/>
+            </w:tcMar>
+            <w:vAlign w:val="top"/>
+          </w:tcPr>
+          <w:p>
+            <w:pPr>
+              <w:spacing w:before="0" w:after="0"/>
+              <w:jc w:val="left"/>
+              <w:rPr>
+                <w:rFonts w:ascii="Arial" w:hAnsi="Arial" w:cs="Arial"/>
+                <w:sz w:val="18"/>
+                <w:szCs w:val="18"/>
+              </w:rPr>
+            </w:pPr>
+          </w:p>
+        </w:tc>
+        <w:tc>
+          <w:tcPr>
+            <w:tcW w:w="1800" w:type="dxa"/>
+            <w:tcBorders>
+              <w:top w:val="single" w:sz="4" w:space="0" w:color="000000"/>
+              <w:left w:val="single" w:sz="4" w:space="0" w:color="000000"/>
+              <w:bottom w:val="single" w:sz="4" w:space="0" w:color="000000"/>
+              <w:right w:val="single" w:sz="4" w:space="0" w:color="000000"/>
+            </w:tcBorders>
+            <w:shd w:val="clear" w:color="auto" w:fill="F2F2F2"/>
+            <w:tcMar>
+              <w:top w:w="30" w:type="dxa"/>
+              <w:left w:w="40" w:type="dxa"/>
+              <w:bottom w:w="30" w:type="dxa"/>
+              <w:right w:w="40" w:type="dxa"/>
+            </w:tcMar>
+            <w:vAlign w:val="center"/>
+          </w:tcPr>
+          <w:p>
+            <w:pPr>
+              <w:spacing w:before="0" w:after="0"/>
+              <w:jc w:val="left"/>
+              <w:rPr>
+                <w:rFonts w:ascii="Arial" w:hAnsi="Arial" w:cs="Arial"/>
+                <w:sz w:val="18"/>
+                <w:szCs w:val="18"/>
+              </w:rPr>
+            </w:pPr>
+            <w:r>
+              <w:rPr>
+                <w:rFonts w:ascii="Arial" w:hAnsi="Arial" w:cs="Arial" w:eastAsia="Arial"/>
+                <w:b/>
+                <w:bCs/>
+                <w:sz w:val="18"/>
+                <w:szCs w:val="18"/>
+                <w:lang w:val="en-GB"/>
+              </w:rPr>
+              <w:t xml:space="preserve">2 – Minor</w:t>
+            </w:r>
+          </w:p>
+        </w:tc>
+        <w:tc>
+          <w:tcPr>
+            <w:tcW w:w="2452" w:type="dxa"/>
+            <w:tcBorders>
+              <w:top w:val="single" w:sz="4" w:space="0" w:color="000000"/>
+              <w:left w:val="single" w:sz="4" w:space="0" w:color="000000"/>
+              <w:bottom w:val="single" w:sz="4" w:space="0" w:color="000000"/>
+              <w:right w:val="single" w:sz="4" w:space="0" w:color="000000"/>
+            </w:tcBorders>
+            <w:shd w:val="clear" w:color="auto" w:fill="FFFFFF"/>
+            <w:tcMar>
+              <w:top w:w="30" w:type="dxa"/>
+              <w:left w:w="40" w:type="dxa"/>
+              <w:bottom w:w="30" w:type="dxa"/>
+              <w:right w:w="40" w:type="dxa"/>
+            </w:tcMar>
+            <w:vAlign w:val="center"/>
+          </w:tcPr>
+          <w:p>
+            <w:pPr>
+              <w:spacing w:before="0" w:after="0"/>
+              <w:jc w:val="center"/>
+              <w:rPr>
+                <w:rFonts w:ascii="Arial" w:hAnsi="Arial" w:cs="Arial"/>
+                <w:sz w:val="18"/>
+                <w:szCs w:val="18"/>
+              </w:rPr>
+            </w:pPr>
+            <w:r>
+              <w:rPr>
+                <w:rFonts w:ascii="Arial" w:hAnsi="Arial" w:cs="Arial" w:eastAsia="Arial"/>
+                <w:b/>
+                <w:bCs/>
+                <w:sz w:val="18"/>
+                <w:szCs w:val="18"/>
+                <w:lang w:val="en-GB"/>
+              </w:rPr>
+              <w:t xml:space="preserve">NO ACTION</w:t>
+            </w:r>
+          </w:p>
+        </w:tc>
+        <w:tc>
+          <w:tcPr>
+            <w:tcW w:w="2452" w:type="dxa"/>
+            <w:tcBorders>
+              <w:top w:val="single" w:sz="4" w:space="0" w:color="000000"/>
+              <w:left w:val="single" w:sz="4" w:space="0" w:color="000000"/>
+              <w:bottom w:val="single" w:sz="4" w:space="0" w:color="000000"/>
+              <w:right w:val="single" w:sz="4" w:space="0" w:color="000000"/>
+            </w:tcBorders>
+            <w:shd w:val="clear" w:color="auto" w:fill="00B050"/>
+            <w:tcMar>
+              <w:top w:w="30" w:type="dxa"/>
+              <w:left w:w="40" w:type="dxa"/>
+              <w:bottom w:w="30" w:type="dxa"/>
+              <w:right w:w="40" w:type="dxa"/>
+            </w:tcMar>
+            <w:vAlign w:val="center"/>
+          </w:tcPr>
+          <w:p>
+            <w:pPr>
+              <w:spacing w:before="0" w:after="0"/>
+              <w:jc w:val="center"/>
+              <w:rPr>
+                <w:rFonts w:ascii="Arial" w:hAnsi="Arial" w:cs="Arial"/>
+                <w:sz w:val="18"/>
+                <w:szCs w:val="18"/>
+              </w:rPr>
+            </w:pPr>
+            <w:r>
+              <w:rPr>
+                <w:rFonts w:ascii="Arial" w:hAnsi="Arial" w:cs="Arial" w:eastAsia="Arial"/>
+                <w:b/>
+                <w:bCs/>
+                <w:sz w:val="18"/>
+                <w:szCs w:val="18"/>
+                <w:lang w:val="en-GB"/>
+              </w:rPr>
+              <w:t xml:space="preserve">LOW</w:t>
+            </w:r>
+          </w:p>
+        </w:tc>
+        <w:tc>
+          <w:tcPr>
+            <w:tcW w:w="2452" w:type="dxa"/>
+            <w:tcBorders>
+              <w:top w:val="single" w:sz="4" w:space="0" w:color="000000"/>
+              <w:left w:val="single" w:sz="4" w:space="0" w:color="000000"/>
+              <w:bottom w:val="single" w:sz="4" w:space="0" w:color="000000"/>
+              <w:right w:val="single" w:sz="4" w:space="0" w:color="000000"/>
+            </w:tcBorders>
+            <w:shd w:val="clear" w:color="auto" w:fill="00B050"/>
+            <w:tcMar>
+              <w:top w:w="30" w:type="dxa"/>
+              <w:left w:w="40" w:type="dxa"/>
+              <w:bottom w:w="30" w:type="dxa"/>
+              <w:right w:w="40" w:type="dxa"/>
+            </w:tcMar>
+            <w:vAlign w:val="center"/>
+          </w:tcPr>
+          <w:p>
+            <w:pPr>
+              <w:spacing w:before="0" w:after="0"/>
+              <w:jc w:val="center"/>
+              <w:rPr>
+                <w:rFonts w:ascii="Arial" w:hAnsi="Arial" w:cs="Arial"/>
+                <w:sz w:val="18"/>
+                <w:szCs w:val="18"/>
+              </w:rPr>
+            </w:pPr>
+            <w:r>
+              <w:rPr>
+                <w:rFonts w:ascii="Arial" w:hAnsi="Arial" w:cs="Arial" w:eastAsia="Arial"/>
+                <w:b/>
+                <w:bCs/>
+                <w:sz w:val="18"/>
+                <w:szCs w:val="18"/>
+                <w:lang w:val="en-GB"/>
+              </w:rPr>
+              <w:t xml:space="preserve">LOW</w:t>
+            </w:r>
+          </w:p>
+        </w:tc>
+        <w:tc>
+          <w:tcPr>
+            <w:tcW w:w="2452" w:type="dxa"/>
+            <w:tcBorders>
+              <w:top w:val="single" w:sz="4" w:space="0" w:color="000000"/>
+              <w:left w:val="single" w:sz="4" w:space="0" w:color="000000"/>
+              <w:bottom w:val="single" w:sz="4" w:space="0" w:color="000000"/>
+              <w:right w:val="single" w:sz="4" w:space="0" w:color="000000"/>
+            </w:tcBorders>
+            <w:shd w:val="clear" w:color="auto" w:fill="FFFF00"/>
+            <w:tcMar>
+              <w:top w:w="30" w:type="dxa"/>
+              <w:left w:w="40" w:type="dxa"/>
+              <w:bottom w:w="30" w:type="dxa"/>
+              <w:right w:w="40" w:type="dxa"/>
+            </w:tcMar>
+            <w:vAlign w:val="center"/>
+          </w:tcPr>
+          <w:p>
+            <w:pPr>
+              <w:spacing w:before="0" w:after="0"/>
+              <w:jc w:val="center"/>
+              <w:rPr>
+                <w:rFonts w:ascii="Arial" w:hAnsi="Arial" w:cs="Arial"/>
+                <w:sz w:val="18"/>
+                <w:szCs w:val="18"/>
+              </w:rPr>
+            </w:pPr>
+            <w:r>
+              <w:rPr>
+                <w:rFonts w:ascii="Arial" w:hAnsi="Arial" w:cs="Arial" w:eastAsia="Arial"/>
+                <w:b/>
+                <w:bCs/>
+                <w:sz w:val="18"/>
+                <w:szCs w:val="18"/>
+                <w:lang w:val="en-GB"/>
+              </w:rPr>
+              <w:t xml:space="preserve">MED</w:t>
+            </w:r>
+          </w:p>
+        </w:tc>
+        <w:tc>
+          <w:tcPr>
+            <w:tcW w:w="2451" w:type="dxa"/>
+            <w:tcBorders>
+              <w:top w:val="single" w:sz="4" w:space="0" w:color="000000"/>
+              <w:left w:val="single" w:sz="4" w:space="0" w:color="000000"/>
+              <w:bottom w:val="single" w:sz="4" w:space="0" w:color="000000"/>
+              <w:right w:val="single" w:sz="4" w:space="0" w:color="000000"/>
+            </w:tcBorders>
+            <w:shd w:val="clear" w:color="auto" w:fill="FFFF00"/>
+            <w:tcMar>
+              <w:top w:w="30" w:type="dxa"/>
+              <w:left w:w="40" w:type="dxa"/>
+              <w:bottom w:w="30" w:type="dxa"/>
+              <w:right w:w="40" w:type="dxa"/>
+            </w:tcMar>
+            <w:vAlign w:val="center"/>
+          </w:tcPr>
+          <w:p>
+            <w:pPr>
+              <w:spacing w:before="0" w:after="0"/>
+              <w:jc w:val="center"/>
+              <w:rPr>
+                <w:rFonts w:ascii="Arial" w:hAnsi="Arial" w:cs="Arial"/>
+                <w:sz w:val="18"/>
+                <w:szCs w:val="18"/>
+              </w:rPr>
+            </w:pPr>
+            <w:r>
+              <w:rPr>
+                <w:rFonts w:ascii="Arial" w:hAnsi="Arial" w:cs="Arial" w:eastAsia="Arial"/>
+                <w:b/>
+                <w:bCs/>
+                <w:sz w:val="18"/>
+                <w:szCs w:val="18"/>
+                <w:lang w:val="en-GB"/>
+              </w:rPr>
+              <w:t xml:space="preserve">MED</w:t>
+            </w:r>
+          </w:p>
+        </w:tc>
+      </w:tr>
+      <w:tr>
+        <w:trPr>
+          <w:cantSplit/>
+          <w:trHeight w:val="560" w:hRule="atLeast"/>
+        </w:trPr>
+        <w:tc>
+          <w:tcPr>
+            <w:tcW w:w="900" w:type="dxa"/>
+            <w:vMerge/>
+            <w:tcBorders>
+              <w:top w:val="single" w:sz="4" w:space="0" w:color="000000"/>
+              <w:left w:val="single" w:sz="4" w:space="0" w:color="000000"/>
+              <w:bottom w:val="single" w:sz="4" w:space="0" w:color="000000"/>
+              <w:right w:val="single" w:sz="4" w:space="0" w:color="000000"/>
+            </w:tcBorders>
+            <w:shd w:val="clear" w:color="auto" w:fill="F2F2F2"/>
+            <w:tcMar>
+              <w:top w:w="30" w:type="dxa"/>
+              <w:left w:w="40" w:type="dxa"/>
+              <w:bottom w:w="30" w:type="dxa"/>
+              <w:right w:w="40" w:type="dxa"/>
+            </w:tcMar>
+            <w:vAlign w:val="top"/>
+          </w:tcPr>
+          <w:p>
+            <w:pPr>
+              <w:spacing w:before="0" w:after="0"/>
+              <w:jc w:val="left"/>
+              <w:rPr>
+                <w:rFonts w:ascii="Arial" w:hAnsi="Arial" w:cs="Arial"/>
+                <w:sz w:val="18"/>
+                <w:szCs w:val="18"/>
+              </w:rPr>
+            </w:pPr>
+          </w:p>
+        </w:tc>
+        <w:tc>
+          <w:tcPr>
+            <w:tcW w:w="1800" w:type="dxa"/>
+            <w:tcBorders>
+              <w:top w:val="single" w:sz="4" w:space="0" w:color="000000"/>
+              <w:left w:val="single" w:sz="4" w:space="0" w:color="000000"/>
+              <w:bottom w:val="single" w:sz="4" w:space="0" w:color="000000"/>
+              <w:right w:val="single" w:sz="4" w:space="0" w:color="000000"/>
+            </w:tcBorders>
+            <w:shd w:val="clear" w:color="auto" w:fill="F2F2F2"/>
+            <w:tcMar>
+              <w:top w:w="30" w:type="dxa"/>
+              <w:left w:w="40" w:type="dxa"/>
+              <w:bottom w:w="30" w:type="dxa"/>
+              <w:right w:w="40" w:type="dxa"/>
+            </w:tcMar>
+            <w:vAlign w:val="center"/>
+          </w:tcPr>
+          <w:p>
+            <w:pPr>
+              <w:spacing w:before="0" w:after="0"/>
+              <w:jc w:val="left"/>
+              <w:rPr>
+                <w:rFonts w:ascii="Arial" w:hAnsi="Arial" w:cs="Arial"/>
+                <w:sz w:val="18"/>
+                <w:szCs w:val="18"/>
+              </w:rPr>
+            </w:pPr>
+            <w:r>
+              <w:rPr>
+                <w:rFonts w:ascii="Arial" w:hAnsi="Arial" w:cs="Arial" w:eastAsia="Arial"/>
+                <w:b/>
+                <w:bCs/>
+                <w:sz w:val="18"/>
+                <w:szCs w:val="18"/>
+                <w:lang w:val="en-GB"/>
+              </w:rPr>
+              <w:t xml:space="preserve">1 – Slight</w:t>
+            </w:r>
+          </w:p>
+        </w:tc>
+        <w:tc>
+          <w:tcPr>
+            <w:tcW w:w="2452" w:type="dxa"/>
+            <w:tcBorders>
+              <w:top w:val="single" w:sz="4" w:space="0" w:color="000000"/>
+              <w:left w:val="single" w:sz="4" w:space="0" w:color="000000"/>
+              <w:bottom w:val="single" w:sz="4" w:space="0" w:color="000000"/>
+              <w:right w:val="single" w:sz="4" w:space="0" w:color="000000"/>
+            </w:tcBorders>
+            <w:shd w:val="clear" w:color="auto" w:fill="FFFFFF"/>
+            <w:tcMar>
+              <w:top w:w="30" w:type="dxa"/>
+              <w:left w:w="40" w:type="dxa"/>
+              <w:bottom w:w="30" w:type="dxa"/>
+              <w:right w:w="40" w:type="dxa"/>
+            </w:tcMar>
+            <w:vAlign w:val="center"/>
+          </w:tcPr>
+          <w:p>
+            <w:pPr>
+              <w:spacing w:before="0" w:after="0"/>
+              <w:jc w:val="center"/>
+              <w:rPr>
+                <w:rFonts w:ascii="Arial" w:hAnsi="Arial" w:cs="Arial"/>
+                <w:sz w:val="18"/>
+                <w:szCs w:val="18"/>
+              </w:rPr>
+            </w:pPr>
+            <w:r>
+              <w:rPr>
+                <w:rFonts w:ascii="Arial" w:hAnsi="Arial" w:cs="Arial" w:eastAsia="Arial"/>
+                <w:b/>
+                <w:bCs/>
+                <w:sz w:val="18"/>
+                <w:szCs w:val="18"/>
+                <w:lang w:val="en-GB"/>
+              </w:rPr>
+              <w:t xml:space="preserve">NO ACTION</w:t>
+            </w:r>
+          </w:p>
+        </w:tc>
+        <w:tc>
+          <w:tcPr>
+            <w:tcW w:w="2452" w:type="dxa"/>
+            <w:tcBorders>
+              <w:top w:val="single" w:sz="4" w:space="0" w:color="000000"/>
+              <w:left w:val="single" w:sz="4" w:space="0" w:color="000000"/>
+              <w:bottom w:val="single" w:sz="4" w:space="0" w:color="000000"/>
+              <w:right w:val="single" w:sz="4" w:space="0" w:color="000000"/>
+            </w:tcBorders>
+            <w:shd w:val="clear" w:color="auto" w:fill="FFFFFF"/>
+            <w:tcMar>
+              <w:top w:w="30" w:type="dxa"/>
+              <w:left w:w="40" w:type="dxa"/>
+              <w:bottom w:w="30" w:type="dxa"/>
+              <w:right w:w="40" w:type="dxa"/>
+            </w:tcMar>
+            <w:vAlign w:val="center"/>
+          </w:tcPr>
+          <w:p>
+            <w:pPr>
+              <w:spacing w:before="0" w:after="0"/>
+              <w:jc w:val="center"/>
+              <w:rPr>
+                <w:rFonts w:ascii="Arial" w:hAnsi="Arial" w:cs="Arial"/>
+                <w:sz w:val="18"/>
+                <w:szCs w:val="18"/>
+              </w:rPr>
+            </w:pPr>
+            <w:r>
+              <w:rPr>
+                <w:rFonts w:ascii="Arial" w:hAnsi="Arial" w:cs="Arial" w:eastAsia="Arial"/>
+                <w:b/>
+                <w:bCs/>
+                <w:sz w:val="18"/>
+                <w:szCs w:val="18"/>
+                <w:lang w:val="en-GB"/>
+              </w:rPr>
+              <w:t xml:space="preserve">NO ACTION</w:t>
+            </w:r>
+          </w:p>
+        </w:tc>
+        <w:tc>
+          <w:tcPr>
+            <w:tcW w:w="2452" w:type="dxa"/>
+            <w:tcBorders>
+              <w:top w:val="single" w:sz="4" w:space="0" w:color="000000"/>
+              <w:left w:val="single" w:sz="4" w:space="0" w:color="000000"/>
+              <w:bottom w:val="single" w:sz="4" w:space="0" w:color="000000"/>
+              <w:right w:val="single" w:sz="4" w:space="0" w:color="000000"/>
+            </w:tcBorders>
+            <w:shd w:val="clear" w:color="auto" w:fill="00B050"/>
+            <w:tcMar>
+              <w:top w:w="30" w:type="dxa"/>
+              <w:left w:w="40" w:type="dxa"/>
+              <w:bottom w:w="30" w:type="dxa"/>
+              <w:right w:w="40" w:type="dxa"/>
+            </w:tcMar>
+            <w:vAlign w:val="center"/>
+          </w:tcPr>
+          <w:p>
+            <w:pPr>
+              <w:spacing w:before="0" w:after="0"/>
+              <w:jc w:val="center"/>
+              <w:rPr>
+                <w:rFonts w:ascii="Arial" w:hAnsi="Arial" w:cs="Arial"/>
+                <w:sz w:val="18"/>
+                <w:szCs w:val="18"/>
+              </w:rPr>
+            </w:pPr>
+            <w:r>
+              <w:rPr>
+                <w:rFonts w:ascii="Arial" w:hAnsi="Arial" w:cs="Arial" w:eastAsia="Arial"/>
+                <w:b/>
+                <w:bCs/>
+                <w:sz w:val="18"/>
+                <w:szCs w:val="18"/>
+                <w:lang w:val="en-GB"/>
+              </w:rPr>
+              <w:t xml:space="preserve">LOW</w:t>
+            </w:r>
+          </w:p>
+        </w:tc>
+        <w:tc>
+          <w:tcPr>
+            <w:tcW w:w="2452" w:type="dxa"/>
+            <w:tcBorders>
+              <w:top w:val="single" w:sz="4" w:space="0" w:color="000000"/>
+              <w:left w:val="single" w:sz="4" w:space="0" w:color="000000"/>
+              <w:bottom w:val="single" w:sz="4" w:space="0" w:color="000000"/>
+              <w:right w:val="single" w:sz="4" w:space="0" w:color="000000"/>
+            </w:tcBorders>
+            <w:shd w:val="clear" w:color="auto" w:fill="00B050"/>
+            <w:tcMar>
+              <w:top w:w="30" w:type="dxa"/>
+              <w:left w:w="40" w:type="dxa"/>
+              <w:bottom w:w="30" w:type="dxa"/>
+              <w:right w:w="40" w:type="dxa"/>
+            </w:tcMar>
+            <w:vAlign w:val="center"/>
+          </w:tcPr>
+          <w:p>
+            <w:pPr>
+              <w:spacing w:before="0" w:after="0"/>
+              <w:jc w:val="center"/>
+              <w:rPr>
+                <w:rFonts w:ascii="Arial" w:hAnsi="Arial" w:cs="Arial"/>
+                <w:sz w:val="18"/>
+                <w:szCs w:val="18"/>
+              </w:rPr>
+            </w:pPr>
+            <w:r>
+              <w:rPr>
+                <w:rFonts w:ascii="Arial" w:hAnsi="Arial" w:cs="Arial" w:eastAsia="Arial"/>
+                <w:b/>
+                <w:bCs/>
+                <w:sz w:val="18"/>
+                <w:szCs w:val="18"/>
+                <w:lang w:val="en-GB"/>
+              </w:rPr>
+              <w:t xml:space="preserve">LOW</w:t>
+            </w:r>
+          </w:p>
+        </w:tc>
+        <w:tc>
+          <w:tcPr>
+            <w:tcW w:w="2451" w:type="dxa"/>
+            <w:tcBorders>
+              <w:top w:val="single" w:sz="4" w:space="0" w:color="000000"/>
+              <w:left w:val="single" w:sz="4" w:space="0" w:color="000000"/>
+              <w:bottom w:val="single" w:sz="4" w:space="0" w:color="000000"/>
+              <w:right w:val="single" w:sz="4" w:space="0" w:color="000000"/>
+            </w:tcBorders>
+            <w:shd w:val="clear" w:color="auto" w:fill="FFFF00"/>
+            <w:tcMar>
+              <w:top w:w="30" w:type="dxa"/>
+              <w:left w:w="40" w:type="dxa"/>
+              <w:bottom w:w="30" w:type="dxa"/>
+              <w:right w:w="40" w:type="dxa"/>
+            </w:tcMar>
+            <w:vAlign w:val="center"/>
+          </w:tcPr>
+          <w:p>
+            <w:pPr>
+              <w:spacing w:before="0" w:after="0"/>
+              <w:jc w:val="center"/>
+              <w:rPr>
+                <w:rFonts w:ascii="Arial" w:hAnsi="Arial" w:cs="Arial"/>
+                <w:sz w:val="18"/>
+                <w:szCs w:val="18"/>
+              </w:rPr>
+            </w:pPr>
+            <w:r>
+              <w:rPr>
+                <w:rFonts w:ascii="Arial" w:hAnsi="Arial" w:cs="Arial" w:eastAsia="Arial"/>
+                <w:b/>
+                <w:bCs/>
+                <w:sz w:val="18"/>
+                <w:szCs w:val="18"/>
+                <w:lang w:val="en-GB"/>
+              </w:rPr>
+              <w:t xml:space="preserve">MED</w:t>
+            </w:r>
+          </w:p>
+        </w:tc>
+      </w:tr>
+    </w:tbl>
     <w:p>
       <w:pPr>
-        <w:pageBreakBefore/>
-        <w:spacing w:before="0" w:after="120"/>
-        <w:jc w:val="center"/>
+        <w:spacing w:before="0" w:after="0" w:line="240" w:lineRule="exact"/>
         <w:rPr>
-          <w:rFonts w:ascii="Arial" w:hAnsi="Arial" w:cs="Arial"/>
-          <w:sz w:val="18"/>
-          <w:szCs w:val="18"/>
+          <w:sz w:val="4"/>
         </w:rPr>
       </w:pPr>
-      <w:r>
-        <w:drawing>
-          <wp:inline xmlns:wp="http://schemas.openxmlformats.org/drawingml/2006/wordprocessingDrawing" distT="0" distB="0" distL="0" distR="0">
-            <wp:extent cx="8600000" cy="2621047"/>
-            <wp:docPr id="5002" name="Risk Assessment Matrix" descr="Risk assessment matrix (likelihood versus consequences)"/>
-            <wp:cNvGraphicFramePr>
-              <a:graphicFrameLocks xmlns:a="http://schemas.openxmlformats.org/drawingml/2006/main" noChangeAspect="1"/>
-            </wp:cNvGraphicFramePr>
-            <a:graphic xmlns:a="http://schemas.openxmlformats.org/drawingml/2006/main">
-              <a:graphicData uri="http://schemas.openxmlformats.org/drawingml/2006/picture">
-                <pic:pic xmlns:pic="http://schemas.openxmlformats.org/drawingml/2006/picture">
-                  <pic:nvPicPr>
-                    <pic:cNvPr id="5002" name="Risk Assessment Matrix"/>
-                    <pic:cNvPicPr/>
-                  </pic:nvPicPr>
-                  <pic:blipFill>
-                    <a:blip xmlns:r="http://schemas.openxmlformats.org/officeDocument/2006/relationships" r:embed="rId36"/>
-                    <a:stretch>
-                      <a:fillRect/>
-                    </a:stretch>
-                  </pic:blipFill>
-                  <pic:spPr>
-                    <a:xfrm>
-                      <a:off x="0" y="0"/>
-                      <a:ext cx="8600000" cy="2621047"/>
-                    </a:xfrm>
-                    <a:prstGeom prst="rect">
-                      <a:avLst/>
-                    </a:prstGeom>
-                  </pic:spPr>
-                </pic:pic>
-              </a:graphicData>
-            </a:graphic>
-          </wp:inline>
-        </w:drawing>
-      </w:r>
     </w:p>
     <w:tbl>
       <w:tblPr>

</xml_diff>